<commit_message>
Document current e-whammy reset simulation
</commit_message>
<xml_diff>
--- a/e_whammy/spice/ewhammy_final_simulation_summary.docx
+++ b/e_whammy/spice/ewhammy_final_simulation_summary.docx
@@ -5,31 +5,26 @@
     <w:p>
       <w:pPr>
         <w:pStyle w:val="Title"/>
-        <w:jc w:val="center"/>
       </w:pPr>
       <w:r>
-        <w:rPr>
-          <w:b/>
-          <w:sz w:val="36"/>
-        </w:rPr>
-        <w:t>eWhammy Center Stability: Final Simulation Summary</w:t>
+        <w:t>eWhammy Center Stability: Current Final Simulation Summary</w:t>
       </w:r>
     </w:p>
     <w:p>
       <w:pPr>
         <w:pStyle w:val="Subtitle"/>
-        <w:jc w:val="center"/>
       </w:pPr>
+      <w:r>
+        <w:t xml:space="preserve">Current design as of May 17, 2026. The earlier differentiator/integrator report has been preserved as </w:t>
+      </w:r>
       <w:r>
         <w:rPr>
           <w:i/>
         </w:rPr>
-        <w:t>A narrative summary of the problem, the design journey, and the final simulated solution</w:t>
+        <w:t>ewhammy_diff_integrator_historical_simulation_summary.docx</w:t>
       </w:r>
-    </w:p>
-    <w:p>
       <w:r>
-        <w:t>This document is written for readers who may not already know the eWhammy project, spring hysteresis, or the analog techniques used in the center-stability circuitry. The goal is not only to record the final result, but also to explain why earlier ideas were explored, what each one taught us, and why the final topology emerged as the best compromise.</w:t>
+        <w:t xml:space="preserve"> for historical context.</w:t>
       </w:r>
     </w:p>
     <w:p>
@@ -37,22 +32,17 @@
         <w:pStyle w:val="Heading1"/>
       </w:pPr>
       <w:r>
-        <w:t>1. The Problem We Are Solving</w:t>
+        <w:t>Executive Summary</w:t>
       </w:r>
     </w:p>
     <w:p>
       <w:r>
-        <w:t>The eWhammy is an analog control-voltage system that tracks the motion of a spring-loaded arm. In a perfect world, when the player lets go of the arm, the control voltage would return to exactly the same center value every time. In the real world, the spring mechanism can return slightly differently depending on whether the arm was last bent upward or downward. That small return-to-center error is called hysteresis.</w:t>
+        <w:t>The current best design is no longer the older differentiator-plus-integrator cleanup topology. That document remains useful history, but the present simulation has converged on a windowed servo architecture with three key changes: a narrow musical window, a moving threshold center derived from a low-pass filtered version of OUT, and a startup reset that forces HOLD low while the circuit acquires center.</w:t>
       </w:r>
     </w:p>
     <w:p>
       <w:r>
-        <w:t>Why does hysteresis matter? Because the eWhammy is later interpreted as pitch control. A small voltage error at center becomes an audible pitch error. The challenge is to remove that lingering center error without making the arm feel sticky, without suppressing normal vibrato, and without adding awkward startup behavior or long-term drift.</w:t>
-      </w:r>
-    </w:p>
-    <w:p>
-      <w:r>
-        <w:t>In short, the problem is not merely to lock the center. The problem is to keep the center stable while preserving musical motion.</w:t>
+        <w:t>The important result is that the window can stay narrow, about +/-94 mV at OUT, while still catching both upward and downward releases. That avoids the earlier temptation to widen the fixed window to roughly +/-192 mV, which worked electrically but was too broad musically.</w:t>
       </w:r>
     </w:p>
     <w:p>
@@ -60,364 +50,2433 @@
         <w:pStyle w:val="Heading1"/>
       </w:pPr>
       <w:r>
-        <w:t>2. Key Terms</w:t>
+        <w:t>Historical Context</w:t>
       </w:r>
     </w:p>
     <w:p>
-      <w:pPr>
-        <w:pStyle w:val="ListBullet"/>
-      </w:pPr>
       <w:r>
-        <w:rPr>
-          <w:b/>
-        </w:rPr>
-        <w:t xml:space="preserve">Center stability: </w:t>
-      </w:r>
-      <w:r>
-        <w:t>The ability of the output to return to the intended neutral value, here centered on VREF, after a bend or release.</w:t>
+        <w:t>The renamed historical document records the previous line of investigation: deadband behavior, high-pass bypasses, always-on correction, and finally a differentiator/integrator signal path with conditional bleed. The present design keeps the servo/HOLD idea and solves the release asymmetry with a moving window center instead of a wider fixed window.</w:t>
       </w:r>
     </w:p>
+    <w:tbl>
+      <w:tblPr>
+        <w:tblStyle w:val="TableGrid"/>
+        <w:tblW w:type="auto" w:w="0"/>
+        <w:jc w:val="center"/>
+        <w:tblLook w:firstColumn="1" w:firstRow="1" w:lastColumn="0" w:lastRow="0" w:noHBand="0" w:noVBand="1" w:val="04A0"/>
+      </w:tblPr>
+      <w:tblGrid>
+        <w:gridCol w:w="4896"/>
+        <w:gridCol w:w="4896"/>
+      </w:tblGrid>
+      <w:tr>
+        <w:tc>
+          <w:tcPr>
+            <w:tcW w:type="dxa" w:w="4032"/>
+            <w:vAlign w:val="center"/>
+            <w:shd w:fill="E8EEF5"/>
+          </w:tcPr>
+          <w:p>
+            <w:pPr>
+              <w:spacing w:after="0"/>
+            </w:pPr>
+            <w:r/>
+            <w:r>
+              <w:rPr>
+                <w:b/>
+              </w:rPr>
+              <w:t>Document</w:t>
+            </w:r>
+          </w:p>
+        </w:tc>
+        <w:tc>
+          <w:tcPr>
+            <w:tcW w:type="dxa" w:w="5616"/>
+            <w:vAlign w:val="center"/>
+            <w:shd w:fill="E8EEF5"/>
+          </w:tcPr>
+          <w:p>
+            <w:pPr>
+              <w:spacing w:after="0"/>
+            </w:pPr>
+            <w:r/>
+            <w:r>
+              <w:rPr>
+                <w:b/>
+              </w:rPr>
+              <w:t>Role</w:t>
+            </w:r>
+          </w:p>
+        </w:tc>
+      </w:tr>
+      <w:tr>
+        <w:tc>
+          <w:tcPr>
+            <w:tcW w:type="dxa" w:w="4032"/>
+            <w:vAlign w:val="center"/>
+          </w:tcPr>
+          <w:p>
+            <w:pPr>
+              <w:spacing w:after="0"/>
+            </w:pPr>
+            <w:r/>
+            <w:r>
+              <w:rPr>
+                <w:b w:val="0"/>
+              </w:rPr>
+              <w:t>ewhammy_diff_integrator_historical_simulation_summary.docx</w:t>
+            </w:r>
+          </w:p>
+        </w:tc>
+        <w:tc>
+          <w:tcPr>
+            <w:tcW w:type="dxa" w:w="5616"/>
+            <w:vAlign w:val="center"/>
+          </w:tcPr>
+          <w:p>
+            <w:pPr>
+              <w:spacing w:after="0"/>
+            </w:pPr>
+            <w:r/>
+            <w:r>
+              <w:rPr>
+                <w:b w:val="0"/>
+              </w:rPr>
+              <w:t>Historical summary of the differentiator/integrator exploration and why it was attractive.</w:t>
+            </w:r>
+          </w:p>
+        </w:tc>
+      </w:tr>
+      <w:tr>
+        <w:tc>
+          <w:tcPr>
+            <w:tcW w:type="dxa" w:w="4032"/>
+            <w:vAlign w:val="center"/>
+          </w:tcPr>
+          <w:p>
+            <w:pPr>
+              <w:spacing w:after="0"/>
+            </w:pPr>
+            <w:r/>
+            <w:r>
+              <w:rPr>
+                <w:b w:val="0"/>
+              </w:rPr>
+              <w:t>ewhammy_final_simulation_summary.docx</w:t>
+            </w:r>
+          </w:p>
+        </w:tc>
+        <w:tc>
+          <w:tcPr>
+            <w:tcW w:type="dxa" w:w="5616"/>
+            <w:vAlign w:val="center"/>
+          </w:tcPr>
+          <w:p>
+            <w:pPr>
+              <w:spacing w:after="0"/>
+            </w:pPr>
+            <w:r/>
+            <w:r>
+              <w:rPr>
+                <w:b w:val="0"/>
+              </w:rPr>
+              <w:t>Current final summary for the moving-window servo design.</w:t>
+            </w:r>
+          </w:p>
+        </w:tc>
+      </w:tr>
+    </w:tbl>
     <w:p>
       <w:pPr>
-        <w:pStyle w:val="ListBullet"/>
+        <w:spacing w:after="40"/>
       </w:pPr>
-      <w:r>
-        <w:rPr>
-          <w:b/>
-        </w:rPr>
-        <w:t xml:space="preserve">Spring hysteresis: </w:t>
-      </w:r>
-      <w:r>
-        <w:t>The tendency of the spring mechanism to return to a slightly different resting position depending on the direction of the previous bend.</w:t>
-      </w:r>
-    </w:p>
-    <w:p>
-      <w:pPr>
-        <w:pStyle w:val="ListBullet"/>
-      </w:pPr>
-      <w:r>
-        <w:rPr>
-          <w:b/>
-        </w:rPr>
-        <w:t xml:space="preserve">Deadband: </w:t>
-      </w:r>
-      <w:r>
-        <w:t>A small voltage window around center where the circuit forces or holds the output at the center value to suppress jitter or drift.</w:t>
-      </w:r>
-    </w:p>
-    <w:p>
-      <w:pPr>
-        <w:pStyle w:val="ListBullet"/>
-      </w:pPr>
-      <w:r>
-        <w:rPr>
-          <w:b/>
-        </w:rPr>
-        <w:t xml:space="preserve">High-pass bypass: </w:t>
-      </w:r>
-      <w:r>
-        <w:t>An added path that lets faster motion, such as vibrato, pass through even while slower center-correction circuitry remains active.</w:t>
-      </w:r>
-    </w:p>
-    <w:p>
-      <w:pPr>
-        <w:pStyle w:val="ListBullet"/>
-      </w:pPr>
-      <w:r>
-        <w:rPr>
-          <w:b/>
-        </w:rPr>
-        <w:t xml:space="preserve">Differentiator: </w:t>
-      </w:r>
-      <w:r>
-        <w:t>A stage that responds primarily to change. It turns motion into a signal proportional to rate of change.</w:t>
-      </w:r>
-    </w:p>
-    <w:p>
-      <w:pPr>
-        <w:pStyle w:val="ListBullet"/>
-      </w:pPr>
-      <w:r>
-        <w:rPr>
-          <w:b/>
-        </w:rPr>
-        <w:t xml:space="preserve">Integrator: </w:t>
-      </w:r>
-      <w:r>
-        <w:t>A stage that accumulates the incoming signal over time. In this design it reconstructs position from the differentiated motion signal.</w:t>
-      </w:r>
-    </w:p>
-    <w:p>
-      <w:pPr>
-        <w:pStyle w:val="ListBullet"/>
-      </w:pPr>
-      <w:r>
-        <w:rPr>
-          <w:b/>
-        </w:rPr>
-        <w:t xml:space="preserve">Conditional reset or bleed: </w:t>
-      </w:r>
-      <w:r>
-        <w:t>A reset path that is only enabled when the output is sufficiently close to center. It cleans up residual error without interfering with normal bends.</w:t>
-      </w:r>
     </w:p>
     <w:p>
       <w:pPr>
         <w:pStyle w:val="Heading1"/>
       </w:pPr>
       <w:r>
-        <w:t>3. Design Requirements</w:t>
+        <w:t>Problem That Drove The Latest Revision</w:t>
       </w:r>
     </w:p>
     <w:p>
       <w:r>
-        <w:t>The desired behavior became clearer as the simulations progressed. The final solution needed to satisfy all of the following at the same time:</w:t>
+        <w:t>The raw Hall sensor model is symmetric in gesture size, but it includes spring-steel hysteresis at release. The natural center is 2.1750 V in the raw sensor domain. After an upward release the model returns to 2.1825 V; after a downward release it returns to 2.1675 V. That is only 15 mV of separation at the sensor, but the signal path gain makes it about 150 mV at OUT.</w:t>
       </w:r>
     </w:p>
     <w:p>
-      <w:pPr>
-        <w:pStyle w:val="ListBullet"/>
-      </w:pPr>
       <w:r>
-        <w:t>Return to center cleanly after large bends.</w:t>
+        <w:t>A fixed +/-100 mV window therefore misses the downward release in the realistic sequence, especially because the upward release has not completely settled before the downward bend begins. Widening the fixed window catches it, but that makes the reset region too musically large.</w:t>
       </w:r>
     </w:p>
+    <w:tbl>
+      <w:tblPr>
+        <w:tblStyle w:val="TableGrid"/>
+        <w:tblW w:type="auto" w:w="0"/>
+        <w:jc w:val="center"/>
+        <w:tblLook w:firstColumn="1" w:firstRow="1" w:lastColumn="0" w:lastRow="0" w:noHBand="0" w:noVBand="1" w:val="04A0"/>
+      </w:tblPr>
+      <w:tblGrid>
+        <w:gridCol w:w="3264"/>
+        <w:gridCol w:w="3264"/>
+        <w:gridCol w:w="3264"/>
+      </w:tblGrid>
+      <w:tr>
+        <w:tc>
+          <w:tcPr>
+            <w:tcW w:type="dxa" w:w="3312"/>
+            <w:vAlign w:val="center"/>
+            <w:shd w:fill="E8EEF5"/>
+          </w:tcPr>
+          <w:p>
+            <w:pPr>
+              <w:spacing w:after="0"/>
+            </w:pPr>
+            <w:r/>
+            <w:r>
+              <w:rPr>
+                <w:b/>
+              </w:rPr>
+              <w:t>Raw sensor condition</w:t>
+            </w:r>
+          </w:p>
+        </w:tc>
+        <w:tc>
+          <w:tcPr>
+            <w:tcW w:type="dxa" w:w="2016"/>
+            <w:vAlign w:val="center"/>
+            <w:shd w:fill="E8EEF5"/>
+          </w:tcPr>
+          <w:p>
+            <w:pPr>
+              <w:spacing w:after="0"/>
+            </w:pPr>
+            <w:r/>
+            <w:r>
+              <w:rPr>
+                <w:b/>
+              </w:rPr>
+              <w:t>Sensor voltage</w:t>
+            </w:r>
+          </w:p>
+        </w:tc>
+        <w:tc>
+          <w:tcPr>
+            <w:tcW w:type="dxa" w:w="4320"/>
+            <w:vAlign w:val="center"/>
+            <w:shd w:fill="E8EEF5"/>
+          </w:tcPr>
+          <w:p>
+            <w:pPr>
+              <w:spacing w:after="0"/>
+            </w:pPr>
+            <w:r/>
+            <w:r>
+              <w:rPr>
+                <w:b/>
+              </w:rPr>
+              <w:t>Effect at OUT</w:t>
+            </w:r>
+          </w:p>
+        </w:tc>
+      </w:tr>
+      <w:tr>
+        <w:tc>
+          <w:tcPr>
+            <w:tcW w:type="dxa" w:w="3312"/>
+            <w:vAlign w:val="center"/>
+          </w:tcPr>
+          <w:p>
+            <w:pPr>
+              <w:spacing w:after="0"/>
+            </w:pPr>
+            <w:r/>
+            <w:r>
+              <w:rPr>
+                <w:b w:val="0"/>
+              </w:rPr>
+              <w:t>Natural center</w:t>
+            </w:r>
+          </w:p>
+        </w:tc>
+        <w:tc>
+          <w:tcPr>
+            <w:tcW w:type="dxa" w:w="2016"/>
+            <w:vAlign w:val="center"/>
+          </w:tcPr>
+          <w:p>
+            <w:pPr>
+              <w:spacing w:after="0"/>
+            </w:pPr>
+            <w:r/>
+            <w:r>
+              <w:rPr>
+                <w:b w:val="0"/>
+              </w:rPr>
+              <w:t>2.1750 V</w:t>
+            </w:r>
+          </w:p>
+        </w:tc>
+        <w:tc>
+          <w:tcPr>
+            <w:tcW w:type="dxa" w:w="4320"/>
+            <w:vAlign w:val="center"/>
+          </w:tcPr>
+          <w:p>
+            <w:pPr>
+              <w:spacing w:after="0"/>
+            </w:pPr>
+            <w:r/>
+            <w:r>
+              <w:rPr>
+                <w:b w:val="0"/>
+              </w:rPr>
+              <w:t>Nominal 2.5 V center after servo correction</w:t>
+            </w:r>
+          </w:p>
+        </w:tc>
+      </w:tr>
+      <w:tr>
+        <w:tc>
+          <w:tcPr>
+            <w:tcW w:type="dxa" w:w="3312"/>
+            <w:vAlign w:val="center"/>
+          </w:tcPr>
+          <w:p>
+            <w:pPr>
+              <w:spacing w:after="0"/>
+            </w:pPr>
+            <w:r/>
+            <w:r>
+              <w:rPr>
+                <w:b w:val="0"/>
+              </w:rPr>
+              <w:t>After upward release</w:t>
+            </w:r>
+          </w:p>
+        </w:tc>
+        <w:tc>
+          <w:tcPr>
+            <w:tcW w:type="dxa" w:w="2016"/>
+            <w:vAlign w:val="center"/>
+          </w:tcPr>
+          <w:p>
+            <w:pPr>
+              <w:spacing w:after="0"/>
+            </w:pPr>
+            <w:r/>
+            <w:r>
+              <w:rPr>
+                <w:b w:val="0"/>
+              </w:rPr>
+              <w:t>2.1825 V</w:t>
+            </w:r>
+          </w:p>
+        </w:tc>
+        <w:tc>
+          <w:tcPr>
+            <w:tcW w:type="dxa" w:w="4320"/>
+            <w:vAlign w:val="center"/>
+          </w:tcPr>
+          <w:p>
+            <w:pPr>
+              <w:spacing w:after="0"/>
+            </w:pPr>
+            <w:r/>
+            <w:r>
+              <w:rPr>
+                <w:b w:val="0"/>
+              </w:rPr>
+              <w:t>+7.5 mV sensor bias, about +75 mV at OUT</w:t>
+            </w:r>
+          </w:p>
+        </w:tc>
+      </w:tr>
+      <w:tr>
+        <w:tc>
+          <w:tcPr>
+            <w:tcW w:type="dxa" w:w="3312"/>
+            <w:vAlign w:val="center"/>
+          </w:tcPr>
+          <w:p>
+            <w:pPr>
+              <w:spacing w:after="0"/>
+            </w:pPr>
+            <w:r/>
+            <w:r>
+              <w:rPr>
+                <w:b w:val="0"/>
+              </w:rPr>
+              <w:t>After downward release</w:t>
+            </w:r>
+          </w:p>
+        </w:tc>
+        <w:tc>
+          <w:tcPr>
+            <w:tcW w:type="dxa" w:w="2016"/>
+            <w:vAlign w:val="center"/>
+          </w:tcPr>
+          <w:p>
+            <w:pPr>
+              <w:spacing w:after="0"/>
+            </w:pPr>
+            <w:r/>
+            <w:r>
+              <w:rPr>
+                <w:b w:val="0"/>
+              </w:rPr>
+              <w:t>2.1675 V</w:t>
+            </w:r>
+          </w:p>
+        </w:tc>
+        <w:tc>
+          <w:tcPr>
+            <w:tcW w:type="dxa" w:w="4320"/>
+            <w:vAlign w:val="center"/>
+          </w:tcPr>
+          <w:p>
+            <w:pPr>
+              <w:spacing w:after="0"/>
+            </w:pPr>
+            <w:r/>
+            <w:r>
+              <w:rPr>
+                <w:b w:val="0"/>
+              </w:rPr>
+              <w:t>-7.5 mV sensor bias, about -75 mV at OUT</w:t>
+            </w:r>
+          </w:p>
+        </w:tc>
+      </w:tr>
+      <w:tr>
+        <w:tc>
+          <w:tcPr>
+            <w:tcW w:type="dxa" w:w="3312"/>
+            <w:vAlign w:val="center"/>
+          </w:tcPr>
+          <w:p>
+            <w:pPr>
+              <w:spacing w:after="0"/>
+            </w:pPr>
+            <w:r/>
+            <w:r>
+              <w:rPr>
+                <w:b w:val="0"/>
+              </w:rPr>
+              <w:t>Up/down release separation</w:t>
+            </w:r>
+          </w:p>
+        </w:tc>
+        <w:tc>
+          <w:tcPr>
+            <w:tcW w:type="dxa" w:w="2016"/>
+            <w:vAlign w:val="center"/>
+          </w:tcPr>
+          <w:p>
+            <w:pPr>
+              <w:spacing w:after="0"/>
+            </w:pPr>
+            <w:r/>
+            <w:r>
+              <w:rPr>
+                <w:b w:val="0"/>
+              </w:rPr>
+              <w:t>15 mV</w:t>
+            </w:r>
+          </w:p>
+        </w:tc>
+        <w:tc>
+          <w:tcPr>
+            <w:tcW w:type="dxa" w:w="4320"/>
+            <w:vAlign w:val="center"/>
+          </w:tcPr>
+          <w:p>
+            <w:pPr>
+              <w:spacing w:after="0"/>
+            </w:pPr>
+            <w:r/>
+            <w:r>
+              <w:rPr>
+                <w:b w:val="0"/>
+              </w:rPr>
+              <w:t>About 150 mV at OUT</w:t>
+            </w:r>
+          </w:p>
+        </w:tc>
+      </w:tr>
+    </w:tbl>
     <w:p>
       <w:pPr>
-        <w:pStyle w:val="ListBullet"/>
+        <w:spacing w:after="40"/>
       </w:pPr>
-      <w:r>
-        <w:t>Correct the lingering center error caused by spring hysteresis.</w:t>
-      </w:r>
-    </w:p>
-    <w:p>
-      <w:pPr>
-        <w:pStyle w:val="ListBullet"/>
-      </w:pPr>
-      <w:r>
-        <w:t>Preserve normal vibrato rather than flattening it.</w:t>
-      </w:r>
-    </w:p>
-    <w:p>
-      <w:pPr>
-        <w:pStyle w:val="ListBullet"/>
-      </w:pPr>
-      <w:r>
-        <w:t>Avoid a sticky or artificial feel near center.</w:t>
-      </w:r>
-    </w:p>
-    <w:p>
-      <w:pPr>
-        <w:pStyle w:val="ListBullet"/>
-      </w:pPr>
-      <w:r>
-        <w:t>Avoid startup problems where the correction loop begins in the wrong state.</w:t>
-      </w:r>
-    </w:p>
-    <w:p>
-      <w:pPr>
-        <w:pStyle w:val="ListBullet"/>
-      </w:pPr>
-      <w:r>
-        <w:t>Avoid long-term integrator drift.</w:t>
-      </w:r>
-    </w:p>
-    <w:p>
-      <w:pPr>
-        <w:pStyle w:val="ListBullet"/>
-      </w:pPr>
-      <w:r>
-        <w:t>Remain simple enough to be practical in hardware.</w:t>
-      </w:r>
-    </w:p>
-    <w:p>
-      <w:pPr/>
-      <w:r>
-        <w:t>A practical mechanical measurement on the present mechanism also helped anchor the final design choices. Five return-to-center trials were taken by approaching center from above (“bend up”) and from below (“bend down”). The average bend-up reading was 2.5854 V and the average bend-down reading was 2.4678 V, giving an average separation of 117.6 mV, or 2.35% of the full 5 V control range.</w:t>
-      </w:r>
-    </w:p>
-    <w:p>
-      <w:pPr/>
-      <w:r>
-        <w:t>This result is important because it shows that the optimized mechanism now operates within a much narrower and more repeatable hysteresis band than a naive worst-case assumption would suggest. In practical terms, it means the final ±100 mV center window remains a reasonable choice: it is comfortably larger than the observed average half-width of about ±58.8 mV, while still being narrow enough to behave as a true near-center reset window rather than a broad motion-control region.</w:t>
-      </w:r>
     </w:p>
     <w:p>
       <w:pPr>
         <w:pStyle w:val="Heading1"/>
       </w:pPr>
       <w:r>
-        <w:t>4. The Simulation Input Model</w:t>
+        <w:t>Current Architecture</w:t>
       </w:r>
     </w:p>
     <w:p>
       <w:r>
-        <w:t>All of the key simulations used a simplified behavioral source representing the raw Hall sensor output in the pre-gain domain. It is important to emphasize that this is not the final 5 V output domain. It is the smaller raw sensor domain before later amplification.</w:t>
+        <w:t>The current circuit keeps a normal servo correction path, but uses HOLD to decide when the servo is allowed to track. HOLD is asserted outside the accepted center region and released inside it. The startup circuit deliberately forces HOLD low at power-up so the servo can acquire the correct center instead of being frozen in the wrong state.</w:t>
       </w:r>
     </w:p>
     <w:p>
       <w:r>
-        <w:t>The model used the following assumptions:</w:t>
+        <w:t>The center-window discriminator now uses a moving center. WH and WL are still separated by a narrow fixed width, but their midpoint follows a low-pass filtered version of OUT. Slow positive and negative return offsets are therefore tracked by the discriminator, while the actual reset window remains narrow enough to avoid fighting intentional one-semitone holds.</w:t>
       </w:r>
     </w:p>
+    <w:tbl>
+      <w:tblPr>
+        <w:tblStyle w:val="TableGrid"/>
+        <w:tblW w:type="auto" w:w="0"/>
+        <w:jc w:val="center"/>
+        <w:tblLook w:firstColumn="1" w:firstRow="1" w:lastColumn="0" w:lastRow="0" w:noHBand="0" w:noVBand="1" w:val="04A0"/>
+      </w:tblPr>
+      <w:tblGrid>
+        <w:gridCol w:w="3264"/>
+        <w:gridCol w:w="3264"/>
+        <w:gridCol w:w="3264"/>
+      </w:tblGrid>
+      <w:tr>
+        <w:tc>
+          <w:tcPr>
+            <w:tcW w:type="dxa" w:w="2232"/>
+            <w:vAlign w:val="center"/>
+            <w:shd w:fill="E8EEF5"/>
+          </w:tcPr>
+          <w:p>
+            <w:pPr>
+              <w:spacing w:after="0"/>
+            </w:pPr>
+            <w:r/>
+            <w:r>
+              <w:rPr>
+                <w:b/>
+              </w:rPr>
+              <w:t>Block</w:t>
+            </w:r>
+          </w:p>
+        </w:tc>
+        <w:tc>
+          <w:tcPr>
+            <w:tcW w:type="dxa" w:w="2808"/>
+            <w:vAlign w:val="center"/>
+            <w:shd w:fill="E8EEF5"/>
+          </w:tcPr>
+          <w:p>
+            <w:pPr>
+              <w:spacing w:after="0"/>
+            </w:pPr>
+            <w:r/>
+            <w:r>
+              <w:rPr>
+                <w:b/>
+              </w:rPr>
+              <w:t>Current value / behavior</w:t>
+            </w:r>
+          </w:p>
+        </w:tc>
+        <w:tc>
+          <w:tcPr>
+            <w:tcW w:type="dxa" w:w="4608"/>
+            <w:vAlign w:val="center"/>
+            <w:shd w:fill="E8EEF5"/>
+          </w:tcPr>
+          <w:p>
+            <w:pPr>
+              <w:spacing w:after="0"/>
+            </w:pPr>
+            <w:r/>
+            <w:r>
+              <w:rPr>
+                <w:b/>
+              </w:rPr>
+              <w:t>Purpose</w:t>
+            </w:r>
+          </w:p>
+        </w:tc>
+      </w:tr>
+      <w:tr>
+        <w:tc>
+          <w:tcPr>
+            <w:tcW w:type="dxa" w:w="2232"/>
+            <w:vAlign w:val="center"/>
+          </w:tcPr>
+          <w:p>
+            <w:pPr>
+              <w:spacing w:after="0"/>
+            </w:pPr>
+            <w:r/>
+            <w:r>
+              <w:rPr>
+                <w:b w:val="0"/>
+              </w:rPr>
+              <w:t>Servo input weighting</w:t>
+            </w:r>
+          </w:p>
+        </w:tc>
+        <w:tc>
+          <w:tcPr>
+            <w:tcW w:type="dxa" w:w="2808"/>
+            <w:vAlign w:val="center"/>
+          </w:tcPr>
+          <w:p>
+            <w:pPr>
+              <w:spacing w:after="0"/>
+            </w:pPr>
+            <w:r/>
+            <w:r>
+              <w:rPr>
+                <w:b w:val="0"/>
+              </w:rPr>
+              <w:t>R1 = 47k, R2 = 47k</w:t>
+            </w:r>
+          </w:p>
+        </w:tc>
+        <w:tc>
+          <w:tcPr>
+            <w:tcW w:type="dxa" w:w="4608"/>
+            <w:vAlign w:val="center"/>
+          </w:tcPr>
+          <w:p>
+            <w:pPr>
+              <w:spacing w:after="0"/>
+            </w:pPr>
+            <w:r/>
+            <w:r>
+              <w:rPr>
+                <w:b w:val="0"/>
+              </w:rPr>
+              <w:t>Combines SENSOR and OFFS into the servo-controlled signal path.</w:t>
+            </w:r>
+          </w:p>
+        </w:tc>
+      </w:tr>
+      <w:tr>
+        <w:tc>
+          <w:tcPr>
+            <w:tcW w:type="dxa" w:w="2232"/>
+            <w:vAlign w:val="center"/>
+          </w:tcPr>
+          <w:p>
+            <w:pPr>
+              <w:spacing w:after="0"/>
+            </w:pPr>
+            <w:r/>
+            <w:r>
+              <w:rPr>
+                <w:b w:val="0"/>
+              </w:rPr>
+              <w:t>Output gain/reference network</w:t>
+            </w:r>
+          </w:p>
+        </w:tc>
+        <w:tc>
+          <w:tcPr>
+            <w:tcW w:type="dxa" w:w="2808"/>
+            <w:vAlign w:val="center"/>
+          </w:tcPr>
+          <w:p>
+            <w:pPr>
+              <w:spacing w:after="0"/>
+            </w:pPr>
+            <w:r/>
+            <w:r>
+              <w:rPr>
+                <w:b w:val="0"/>
+              </w:rPr>
+              <w:t>R3 = 190k, R4 = 10k</w:t>
+            </w:r>
+          </w:p>
+        </w:tc>
+        <w:tc>
+          <w:tcPr>
+            <w:tcW w:type="dxa" w:w="4608"/>
+            <w:vAlign w:val="center"/>
+          </w:tcPr>
+          <w:p>
+            <w:pPr>
+              <w:spacing w:after="0"/>
+            </w:pPr>
+            <w:r/>
+            <w:r>
+              <w:rPr>
+                <w:b w:val="0"/>
+              </w:rPr>
+              <w:t>Implements the high gain around VREF used by the OUT stage.</w:t>
+            </w:r>
+          </w:p>
+        </w:tc>
+      </w:tr>
+      <w:tr>
+        <w:tc>
+          <w:tcPr>
+            <w:tcW w:type="dxa" w:w="2232"/>
+            <w:vAlign w:val="center"/>
+          </w:tcPr>
+          <w:p>
+            <w:pPr>
+              <w:spacing w:after="0"/>
+            </w:pPr>
+            <w:r/>
+            <w:r>
+              <w:rPr>
+                <w:b w:val="0"/>
+              </w:rPr>
+              <w:t>Integrator</w:t>
+            </w:r>
+          </w:p>
+        </w:tc>
+        <w:tc>
+          <w:tcPr>
+            <w:tcW w:type="dxa" w:w="2808"/>
+            <w:vAlign w:val="center"/>
+          </w:tcPr>
+          <w:p>
+            <w:pPr>
+              <w:spacing w:after="0"/>
+            </w:pPr>
+            <w:r/>
+            <w:r>
+              <w:rPr>
+                <w:b w:val="0"/>
+              </w:rPr>
+              <w:t>R9 = 100k, C1 = 10uF</w:t>
+            </w:r>
+          </w:p>
+        </w:tc>
+        <w:tc>
+          <w:tcPr>
+            <w:tcW w:type="dxa" w:w="4608"/>
+            <w:vAlign w:val="center"/>
+          </w:tcPr>
+          <w:p>
+            <w:pPr>
+              <w:spacing w:after="0"/>
+            </w:pPr>
+            <w:r/>
+            <w:r>
+              <w:rPr>
+                <w:b w:val="0"/>
+              </w:rPr>
+              <w:t>Stores the servo correction OFFS. The leak path was removed for the current simulation.</w:t>
+            </w:r>
+          </w:p>
+        </w:tc>
+      </w:tr>
+      <w:tr>
+        <w:tc>
+          <w:tcPr>
+            <w:tcW w:type="dxa" w:w="2232"/>
+            <w:vAlign w:val="center"/>
+          </w:tcPr>
+          <w:p>
+            <w:pPr>
+              <w:spacing w:after="0"/>
+            </w:pPr>
+            <w:r/>
+            <w:r>
+              <w:rPr>
+                <w:b w:val="0"/>
+              </w:rPr>
+              <w:t>Window base divider</w:t>
+            </w:r>
+          </w:p>
+        </w:tc>
+        <w:tc>
+          <w:tcPr>
+            <w:tcW w:type="dxa" w:w="2808"/>
+            <w:vAlign w:val="center"/>
+          </w:tcPr>
+          <w:p>
+            <w:pPr>
+              <w:spacing w:after="0"/>
+            </w:pPr>
+            <w:r/>
+            <w:r>
+              <w:rPr>
+                <w:b w:val="0"/>
+              </w:rPr>
+              <w:t>R5 = 120k, R7 = 10k, R8 = 120k</w:t>
+            </w:r>
+          </w:p>
+        </w:tc>
+        <w:tc>
+          <w:tcPr>
+            <w:tcW w:type="dxa" w:w="4608"/>
+            <w:vAlign w:val="center"/>
+          </w:tcPr>
+          <w:p>
+            <w:pPr>
+              <w:spacing w:after="0"/>
+            </w:pPr>
+            <w:r/>
+            <w:r>
+              <w:rPr>
+                <w:b w:val="0"/>
+              </w:rPr>
+              <w:t>Defines the narrow window width around the moving center.</w:t>
+            </w:r>
+          </w:p>
+        </w:tc>
+      </w:tr>
+      <w:tr>
+        <w:tc>
+          <w:tcPr>
+            <w:tcW w:type="dxa" w:w="2232"/>
+            <w:vAlign w:val="center"/>
+          </w:tcPr>
+          <w:p>
+            <w:pPr>
+              <w:spacing w:after="0"/>
+            </w:pPr>
+            <w:r/>
+            <w:r>
+              <w:rPr>
+                <w:b w:val="0"/>
+              </w:rPr>
+              <w:t>Moving-center injection</w:t>
+            </w:r>
+          </w:p>
+        </w:tc>
+        <w:tc>
+          <w:tcPr>
+            <w:tcW w:type="dxa" w:w="2808"/>
+            <w:vAlign w:val="center"/>
+          </w:tcPr>
+          <w:p>
+            <w:pPr>
+              <w:spacing w:after="0"/>
+            </w:pPr>
+            <w:r/>
+            <w:r>
+              <w:rPr>
+                <w:b w:val="0"/>
+              </w:rPr>
+              <w:t>R6 = 4.7k, R15 = 4.7k, R16 = 250k, C4 = 2.2uF</w:t>
+            </w:r>
+          </w:p>
+        </w:tc>
+        <w:tc>
+          <w:tcPr>
+            <w:tcW w:type="dxa" w:w="4608"/>
+            <w:vAlign w:val="center"/>
+          </w:tcPr>
+          <w:p>
+            <w:pPr>
+              <w:spacing w:after="0"/>
+            </w:pPr>
+            <w:r/>
+            <w:r>
+              <w:rPr>
+                <w:b w:val="0"/>
+              </w:rPr>
+              <w:t>Low-pass filters OUT and shifts WH/WL together without substantially changing window width.</w:t>
+            </w:r>
+          </w:p>
+        </w:tc>
+      </w:tr>
+      <w:tr>
+        <w:tc>
+          <w:tcPr>
+            <w:tcW w:type="dxa" w:w="2232"/>
+            <w:vAlign w:val="center"/>
+          </w:tcPr>
+          <w:p>
+            <w:pPr>
+              <w:spacing w:after="0"/>
+            </w:pPr>
+            <w:r/>
+            <w:r>
+              <w:rPr>
+                <w:b w:val="0"/>
+              </w:rPr>
+              <w:t>Startup reset</w:t>
+            </w:r>
+          </w:p>
+        </w:tc>
+        <w:tc>
+          <w:tcPr>
+            <w:tcW w:type="dxa" w:w="2808"/>
+            <w:vAlign w:val="center"/>
+          </w:tcPr>
+          <w:p>
+            <w:pPr>
+              <w:spacing w:after="0"/>
+            </w:pPr>
+            <w:r/>
+            <w:r>
+              <w:rPr>
+                <w:b w:val="0"/>
+              </w:rPr>
+              <w:t>U7 open-drain inverter, C2 = 2.2uF, R12 = 1M</w:t>
+            </w:r>
+          </w:p>
+        </w:tc>
+        <w:tc>
+          <w:tcPr>
+            <w:tcW w:type="dxa" w:w="4608"/>
+            <w:vAlign w:val="center"/>
+          </w:tcPr>
+          <w:p>
+            <w:pPr>
+              <w:spacing w:after="0"/>
+            </w:pPr>
+            <w:r/>
+            <w:r>
+              <w:rPr>
+                <w:b w:val="0"/>
+              </w:rPr>
+              <w:t>Forces HOLD low at startup for roughly 1.5 s, allowing initial acquisition.</w:t>
+            </w:r>
+          </w:p>
+        </w:tc>
+      </w:tr>
+      <w:tr>
+        <w:tc>
+          <w:tcPr>
+            <w:tcW w:type="dxa" w:w="2232"/>
+            <w:vAlign w:val="center"/>
+          </w:tcPr>
+          <w:p>
+            <w:pPr>
+              <w:spacing w:after="0"/>
+            </w:pPr>
+            <w:r/>
+            <w:r>
+              <w:rPr>
+                <w:b w:val="0"/>
+              </w:rPr>
+              <w:t>HOLD logic</w:t>
+            </w:r>
+          </w:p>
+        </w:tc>
+        <w:tc>
+          <w:tcPr>
+            <w:tcW w:type="dxa" w:w="2808"/>
+            <w:vAlign w:val="center"/>
+          </w:tcPr>
+          <w:p>
+            <w:pPr>
+              <w:spacing w:after="0"/>
+            </w:pPr>
+            <w:r/>
+            <w:r>
+              <w:rPr>
+                <w:b w:val="0"/>
+              </w:rPr>
+              <w:t>Open-drain inverter stages and ADG779 switch</w:t>
+            </w:r>
+          </w:p>
+        </w:tc>
+        <w:tc>
+          <w:tcPr>
+            <w:tcW w:type="dxa" w:w="4608"/>
+            <w:vAlign w:val="center"/>
+          </w:tcPr>
+          <w:p>
+            <w:pPr>
+              <w:spacing w:after="0"/>
+            </w:pPr>
+            <w:r/>
+            <w:r>
+              <w:rPr>
+                <w:b w:val="0"/>
+              </w:rPr>
+              <w:t>Holds or releases the servo path based on the window state. TOUCH is no longer needed.</w:t>
+            </w:r>
+          </w:p>
+        </w:tc>
+      </w:tr>
+    </w:tbl>
     <w:p>
       <w:pPr>
-        <w:pStyle w:val="ListBullet"/>
+        <w:spacing w:after="40"/>
       </w:pPr>
-      <w:r>
-        <w:t>Resting baseline at 2.175 V</w:t>
-      </w:r>
-    </w:p>
-    <w:p>
-      <w:pPr>
-        <w:pStyle w:val="ListBullet"/>
-      </w:pPr>
-      <w:r>
-        <w:t>Large upward bend reaching 2.425 V</w:t>
-      </w:r>
-    </w:p>
-    <w:p>
-      <w:pPr>
-        <w:pStyle w:val="ListBullet"/>
-      </w:pPr>
-      <w:r>
-        <w:t>Return not to 2.175 V, but to 2.1825 V, representing a +7.5 mV spring-hysteresis shift after release</w:t>
-      </w:r>
-    </w:p>
-    <w:p>
-      <w:pPr>
-        <w:pStyle w:val="ListBullet"/>
-      </w:pPr>
-      <w:r>
-        <w:t>A 5 Hz vibrato of ±10 mV applied for a limited time around the post-release center</w:t>
-      </w:r>
-    </w:p>
-    <w:p>
-      <w:pPr>
-        <w:pStyle w:val="ListBullet"/>
-      </w:pPr>
-      <w:r>
-        <w:t>An initial delay before the first bend so startup behavior could be observed separately from bend behavior</w:t>
-      </w:r>
-    </w:p>
-    <w:p>
-      <w:r>
-        <w:t>This input model was deliberately chosen to test four things at once: large-signal bend handling, return-to-center behavior, hysteresis cleanup, and vibrato preservation. That made it far more useful than a simple sine wave or a purely symmetric step test.</w:t>
-      </w:r>
     </w:p>
     <w:p>
       <w:pPr>
         <w:pStyle w:val="Heading1"/>
       </w:pPr>
       <w:r>
-        <w:t>5. The Design Journey</w:t>
+        <w:t>Why The Moving Window Is Different From A Wider Window</w:t>
       </w:r>
     </w:p>
     <w:p>
       <w:r>
-        <w:t>The final topology did not appear immediately. It emerged after several families of designs were explored and compared. Each one solved part of the problem and exposed the next missing piece.</w:t>
-      </w:r>
-    </w:p>
-    <w:p>
-      <w:pPr>
-        <w:pStyle w:val="Heading2"/>
-      </w:pPr>
-      <w:r>
-        <w:t>5.1 Early deadband center-locking</w:t>
+        <w:t>A fixed wide window solved the symptom by accepting a larger center error. With a 20k center resistor the fixed window was about +/-192 mV, or about +/-1.85 semitones. That caught the release, but risked fighting a player who intentionally holds near one semitone above or below center.</w:t>
       </w:r>
     </w:p>
     <w:p>
       <w:r>
-        <w:t>The earliest family of solutions relied on deadband behavior near center. The basic idea was straightforward: define a small window around the center value and force the output to snap to or remain at 2.5 V while the signal is inside that window. This gave strong center stability, but it also introduced a familiar tradeoff. If the deadband is wide enough to cover the real mechanical hysteresis, the center can feel sticky and unresponsive.</w:t>
+        <w:t>The moving-window version keeps the half-width near +/-94.2 mV, about +/-0.90 semitones. The midpoint moves slowly with OUT, so release offsets are captured without making the reset aperture permanently broad.</w:t>
+      </w:r>
+    </w:p>
+    <w:tbl>
+      <w:tblPr>
+        <w:tblStyle w:val="TableGrid"/>
+        <w:tblW w:type="auto" w:w="0"/>
+        <w:jc w:val="center"/>
+        <w:tblLook w:firstColumn="1" w:firstRow="1" w:lastColumn="0" w:lastRow="0" w:noHBand="0" w:noVBand="1" w:val="04A0"/>
+      </w:tblPr>
+      <w:tblGrid>
+        <w:gridCol w:w="2448"/>
+        <w:gridCol w:w="2448"/>
+        <w:gridCol w:w="2448"/>
+        <w:gridCol w:w="2448"/>
+      </w:tblGrid>
+      <w:tr>
+        <w:tc>
+          <w:tcPr>
+            <w:tcW w:type="dxa" w:w="2376"/>
+            <w:vAlign w:val="center"/>
+            <w:shd w:fill="E8EEF5"/>
+          </w:tcPr>
+          <w:p>
+            <w:pPr>
+              <w:spacing w:after="0"/>
+            </w:pPr>
+            <w:r/>
+            <w:r>
+              <w:rPr>
+                <w:b/>
+              </w:rPr>
+              <w:t>Window scheme</w:t>
+            </w:r>
+          </w:p>
+        </w:tc>
+        <w:tc>
+          <w:tcPr>
+            <w:tcW w:type="dxa" w:w="1872"/>
+            <w:vAlign w:val="center"/>
+            <w:shd w:fill="E8EEF5"/>
+          </w:tcPr>
+          <w:p>
+            <w:pPr>
+              <w:spacing w:after="0"/>
+            </w:pPr>
+            <w:r/>
+            <w:r>
+              <w:rPr>
+                <w:b/>
+              </w:rPr>
+              <w:t>Half-width at OUT</w:t>
+            </w:r>
+          </w:p>
+        </w:tc>
+        <w:tc>
+          <w:tcPr>
+            <w:tcW w:type="dxa" w:w="1800"/>
+            <w:vAlign w:val="center"/>
+            <w:shd w:fill="E8EEF5"/>
+          </w:tcPr>
+          <w:p>
+            <w:pPr>
+              <w:spacing w:after="0"/>
+            </w:pPr>
+            <w:r/>
+            <w:r>
+              <w:rPr>
+                <w:b/>
+              </w:rPr>
+              <w:t>Approx. semitones</w:t>
+            </w:r>
+          </w:p>
+        </w:tc>
+        <w:tc>
+          <w:tcPr>
+            <w:tcW w:type="dxa" w:w="3600"/>
+            <w:vAlign w:val="center"/>
+            <w:shd w:fill="E8EEF5"/>
+          </w:tcPr>
+          <w:p>
+            <w:pPr>
+              <w:spacing w:after="0"/>
+            </w:pPr>
+            <w:r/>
+            <w:r>
+              <w:rPr>
+                <w:b/>
+              </w:rPr>
+              <w:t>Result</w:t>
+            </w:r>
+          </w:p>
+        </w:tc>
+      </w:tr>
+      <w:tr>
+        <w:tc>
+          <w:tcPr>
+            <w:tcW w:type="dxa" w:w="2376"/>
+            <w:vAlign w:val="center"/>
+          </w:tcPr>
+          <w:p>
+            <w:pPr>
+              <w:spacing w:after="0"/>
+            </w:pPr>
+            <w:r/>
+            <w:r>
+              <w:rPr>
+                <w:b w:val="0"/>
+              </w:rPr>
+              <w:t>Fixed narrow window</w:t>
+            </w:r>
+          </w:p>
+        </w:tc>
+        <w:tc>
+          <w:tcPr>
+            <w:tcW w:type="dxa" w:w="1872"/>
+            <w:vAlign w:val="center"/>
+          </w:tcPr>
+          <w:p>
+            <w:pPr>
+              <w:spacing w:after="0"/>
+            </w:pPr>
+            <w:r/>
+            <w:r>
+              <w:rPr>
+                <w:b w:val="0"/>
+              </w:rPr>
+              <w:t>+/-100 mV class</w:t>
+            </w:r>
+          </w:p>
+        </w:tc>
+        <w:tc>
+          <w:tcPr>
+            <w:tcW w:type="dxa" w:w="1800"/>
+            <w:vAlign w:val="center"/>
+          </w:tcPr>
+          <w:p>
+            <w:pPr>
+              <w:spacing w:after="0"/>
+            </w:pPr>
+            <w:r/>
+            <w:r>
+              <w:rPr>
+                <w:b w:val="0"/>
+              </w:rPr>
+              <w:t>About +/-0.96</w:t>
+            </w:r>
+          </w:p>
+        </w:tc>
+        <w:tc>
+          <w:tcPr>
+            <w:tcW w:type="dxa" w:w="3600"/>
+            <w:vAlign w:val="center"/>
+          </w:tcPr>
+          <w:p>
+            <w:pPr>
+              <w:spacing w:after="0"/>
+            </w:pPr>
+            <w:r/>
+            <w:r>
+              <w:rPr>
+                <w:b w:val="0"/>
+              </w:rPr>
+              <w:t>Musically right, but missed the downward release.</w:t>
+            </w:r>
+          </w:p>
+        </w:tc>
+      </w:tr>
+      <w:tr>
+        <w:tc>
+          <w:tcPr>
+            <w:tcW w:type="dxa" w:w="2376"/>
+            <w:vAlign w:val="center"/>
+          </w:tcPr>
+          <w:p>
+            <w:pPr>
+              <w:spacing w:after="0"/>
+            </w:pPr>
+            <w:r/>
+            <w:r>
+              <w:rPr>
+                <w:b w:val="0"/>
+              </w:rPr>
+              <w:t>Fixed wide window</w:t>
+            </w:r>
+          </w:p>
+        </w:tc>
+        <w:tc>
+          <w:tcPr>
+            <w:tcW w:type="dxa" w:w="1872"/>
+            <w:vAlign w:val="center"/>
+          </w:tcPr>
+          <w:p>
+            <w:pPr>
+              <w:spacing w:after="0"/>
+            </w:pPr>
+            <w:r/>
+            <w:r>
+              <w:rPr>
+                <w:b w:val="0"/>
+              </w:rPr>
+              <w:t>+/-192.3 mV</w:t>
+            </w:r>
+          </w:p>
+        </w:tc>
+        <w:tc>
+          <w:tcPr>
+            <w:tcW w:type="dxa" w:w="1800"/>
+            <w:vAlign w:val="center"/>
+          </w:tcPr>
+          <w:p>
+            <w:pPr>
+              <w:spacing w:after="0"/>
+            </w:pPr>
+            <w:r/>
+            <w:r>
+              <w:rPr>
+                <w:b w:val="0"/>
+              </w:rPr>
+              <w:t>About +/-1.85</w:t>
+            </w:r>
+          </w:p>
+        </w:tc>
+        <w:tc>
+          <w:tcPr>
+            <w:tcW w:type="dxa" w:w="3600"/>
+            <w:vAlign w:val="center"/>
+          </w:tcPr>
+          <w:p>
+            <w:pPr>
+              <w:spacing w:after="0"/>
+            </w:pPr>
+            <w:r/>
+            <w:r>
+              <w:rPr>
+                <w:b w:val="0"/>
+              </w:rPr>
+              <w:t>Caught the release, but too wide for the desired feel.</w:t>
+            </w:r>
+          </w:p>
+        </w:tc>
+      </w:tr>
+      <w:tr>
+        <w:tc>
+          <w:tcPr>
+            <w:tcW w:type="dxa" w:w="2376"/>
+            <w:vAlign w:val="center"/>
+          </w:tcPr>
+          <w:p>
+            <w:pPr>
+              <w:spacing w:after="0"/>
+            </w:pPr>
+            <w:r/>
+            <w:r>
+              <w:rPr>
+                <w:b w:val="0"/>
+              </w:rPr>
+              <w:t>Current moving window</w:t>
+            </w:r>
+          </w:p>
+        </w:tc>
+        <w:tc>
+          <w:tcPr>
+            <w:tcW w:type="dxa" w:w="1872"/>
+            <w:vAlign w:val="center"/>
+          </w:tcPr>
+          <w:p>
+            <w:pPr>
+              <w:spacing w:after="0"/>
+            </w:pPr>
+            <w:r/>
+            <w:r>
+              <w:rPr>
+                <w:b w:val="0"/>
+              </w:rPr>
+              <w:t>+/-94.2 mV</w:t>
+            </w:r>
+          </w:p>
+        </w:tc>
+        <w:tc>
+          <w:tcPr>
+            <w:tcW w:type="dxa" w:w="1800"/>
+            <w:vAlign w:val="center"/>
+          </w:tcPr>
+          <w:p>
+            <w:pPr>
+              <w:spacing w:after="0"/>
+            </w:pPr>
+            <w:r/>
+            <w:r>
+              <w:rPr>
+                <w:b w:val="0"/>
+              </w:rPr>
+              <w:t>About +/-0.90</w:t>
+            </w:r>
+          </w:p>
+        </w:tc>
+        <w:tc>
+          <w:tcPr>
+            <w:tcW w:type="dxa" w:w="3600"/>
+            <w:vAlign w:val="center"/>
+          </w:tcPr>
+          <w:p>
+            <w:pPr>
+              <w:spacing w:after="0"/>
+            </w:pPr>
+            <w:r/>
+            <w:r>
+              <w:rPr>
+                <w:b w:val="0"/>
+              </w:rPr>
+              <w:t>Catches release while keeping the reset aperture narrow.</w:t>
+            </w:r>
+          </w:p>
+        </w:tc>
+      </w:tr>
+    </w:tbl>
+    <w:p>
+      <w:pPr>
+        <w:spacing w:after="40"/>
+      </w:pPr>
+    </w:p>
+    <w:p>
+      <w:pPr>
+        <w:pStyle w:val="Heading1"/>
+      </w:pPr>
+      <w:r>
+        <w:t>Latest Simulation Evidence</w:t>
       </w:r>
     </w:p>
     <w:p>
       <w:r>
-        <w:t>This work evolved into the July 17, 2025 design described in “The E-Whammy: Center Stability Take Two.” That version used two offset half-wave precision rectifiers whose summed crossover naturally snapped the output to 2.5 V while avoiding the earlier jump that occurred when entering the deadband. It was elegant, and it taught an important lesson: center stability can be achieved very cleanly in principle, but explicit deadband behavior still tends to shape the feel at center. That article became a key milestone because it showed a more refined version of the deadband idea, not merely a rough first attempt.</w:t>
+        <w:t>The latest CSV used here is plot10.csv. It includes WH, WL, HOLD, and OUT for the current design with startup reset and no TOUCH signal. The threshold half-width remains essentially constant: min 94.225 mV, max 94.230 mV, mean 94.226 mV. The threshold center moves from about 2.138 V to 2.857 V over the full test, which is the intended behavior.</w:t>
       </w:r>
     </w:p>
+    <w:tbl>
+      <w:tblPr>
+        <w:tblStyle w:val="TableGrid"/>
+        <w:tblW w:type="auto" w:w="0"/>
+        <w:jc w:val="center"/>
+        <w:tblLook w:firstColumn="1" w:firstRow="1" w:lastColumn="0" w:lastRow="0" w:noHBand="0" w:noVBand="1" w:val="04A0"/>
+      </w:tblPr>
+      <w:tblGrid>
+        <w:gridCol w:w="1632"/>
+        <w:gridCol w:w="1632"/>
+        <w:gridCol w:w="1632"/>
+        <w:gridCol w:w="1632"/>
+        <w:gridCol w:w="1632"/>
+        <w:gridCol w:w="1632"/>
+      </w:tblGrid>
+      <w:tr>
+        <w:tc>
+          <w:tcPr>
+            <w:tcW w:type="dxa" w:w="3384"/>
+            <w:vAlign w:val="center"/>
+            <w:shd w:fill="E8EEF5"/>
+          </w:tcPr>
+          <w:p>
+            <w:pPr>
+              <w:spacing w:after="0"/>
+            </w:pPr>
+            <w:r/>
+            <w:r>
+              <w:rPr>
+                <w:b/>
+              </w:rPr>
+              <w:t>Event</w:t>
+            </w:r>
+          </w:p>
+        </w:tc>
+        <w:tc>
+          <w:tcPr>
+            <w:tcW w:type="dxa" w:w="1152"/>
+            <w:vAlign w:val="center"/>
+            <w:shd w:fill="E8EEF5"/>
+          </w:tcPr>
+          <w:p>
+            <w:pPr>
+              <w:spacing w:after="0"/>
+            </w:pPr>
+            <w:r/>
+            <w:r>
+              <w:rPr>
+                <w:b/>
+              </w:rPr>
+              <w:t>Time</w:t>
+            </w:r>
+          </w:p>
+        </w:tc>
+        <w:tc>
+          <w:tcPr>
+            <w:tcW w:type="dxa" w:w="1080"/>
+            <w:vAlign w:val="center"/>
+            <w:shd w:fill="E8EEF5"/>
+          </w:tcPr>
+          <w:p>
+            <w:pPr>
+              <w:spacing w:after="0"/>
+            </w:pPr>
+            <w:r/>
+            <w:r>
+              <w:rPr>
+                <w:b/>
+              </w:rPr>
+              <w:t>OUT</w:t>
+            </w:r>
+          </w:p>
+        </w:tc>
+        <w:tc>
+          <w:tcPr>
+            <w:tcW w:type="dxa" w:w="2232"/>
+            <w:vAlign w:val="center"/>
+            <w:shd w:fill="E8EEF5"/>
+          </w:tcPr>
+          <w:p>
+            <w:pPr>
+              <w:spacing w:after="0"/>
+            </w:pPr>
+            <w:r/>
+            <w:r>
+              <w:rPr>
+                <w:b/>
+              </w:rPr>
+              <w:t>Window</w:t>
+            </w:r>
+          </w:p>
+        </w:tc>
+        <w:tc>
+          <w:tcPr>
+            <w:tcW w:type="dxa" w:w="936"/>
+            <w:vAlign w:val="center"/>
+            <w:shd w:fill="E8EEF5"/>
+          </w:tcPr>
+          <w:p>
+            <w:pPr>
+              <w:spacing w:after="0"/>
+            </w:pPr>
+            <w:r/>
+            <w:r>
+              <w:rPr>
+                <w:b/>
+              </w:rPr>
+              <w:t>HOLD</w:t>
+            </w:r>
+          </w:p>
+        </w:tc>
+        <w:tc>
+          <w:tcPr>
+            <w:tcW w:type="dxa" w:w="1008"/>
+            <w:vAlign w:val="center"/>
+            <w:shd w:fill="E8EEF5"/>
+          </w:tcPr>
+          <w:p>
+            <w:pPr>
+              <w:spacing w:after="0"/>
+            </w:pPr>
+            <w:r/>
+            <w:r>
+              <w:rPr>
+                <w:b/>
+              </w:rPr>
+              <w:t>Result</w:t>
+            </w:r>
+          </w:p>
+        </w:tc>
+      </w:tr>
+      <w:tr>
+        <w:tc>
+          <w:tcPr>
+            <w:tcW w:type="dxa" w:w="3384"/>
+            <w:vAlign w:val="center"/>
+          </w:tcPr>
+          <w:p>
+            <w:pPr>
+              <w:spacing w:after="0"/>
+            </w:pPr>
+            <w:r/>
+            <w:r>
+              <w:rPr>
+                <w:b w:val="0"/>
+              </w:rPr>
+              <w:t>Startup reset, before acquisition</w:t>
+            </w:r>
+          </w:p>
+        </w:tc>
+        <w:tc>
+          <w:tcPr>
+            <w:tcW w:type="dxa" w:w="1152"/>
+            <w:vAlign w:val="center"/>
+          </w:tcPr>
+          <w:p>
+            <w:pPr>
+              <w:spacing w:after="0"/>
+            </w:pPr>
+            <w:r/>
+            <w:r>
+              <w:rPr>
+                <w:b w:val="0"/>
+              </w:rPr>
+              <w:t>0.4992 s</w:t>
+            </w:r>
+          </w:p>
+        </w:tc>
+        <w:tc>
+          <w:tcPr>
+            <w:tcW w:type="dxa" w:w="1080"/>
+            <w:vAlign w:val="center"/>
+          </w:tcPr>
+          <w:p>
+            <w:pPr>
+              <w:spacing w:after="0"/>
+            </w:pPr>
+            <w:r/>
+            <w:r>
+              <w:rPr>
+                <w:b w:val="0"/>
+              </w:rPr>
+              <w:t>1.9681 V</w:t>
+            </w:r>
+          </w:p>
+        </w:tc>
+        <w:tc>
+          <w:tcPr>
+            <w:tcW w:type="dxa" w:w="2232"/>
+            <w:vAlign w:val="center"/>
+          </w:tcPr>
+          <w:p>
+            <w:pPr>
+              <w:spacing w:after="0"/>
+            </w:pPr>
+            <w:r/>
+            <w:r>
+              <w:rPr>
+                <w:b w:val="0"/>
+              </w:rPr>
+              <w:t>2.4173 to 2.6058 V</w:t>
+            </w:r>
+          </w:p>
+        </w:tc>
+        <w:tc>
+          <w:tcPr>
+            <w:tcW w:type="dxa" w:w="936"/>
+            <w:vAlign w:val="center"/>
+          </w:tcPr>
+          <w:p>
+            <w:pPr>
+              <w:spacing w:after="0"/>
+            </w:pPr>
+            <w:r/>
+            <w:r>
+              <w:rPr>
+                <w:b w:val="0"/>
+              </w:rPr>
+              <w:t>0.00 V</w:t>
+            </w:r>
+          </w:p>
+        </w:tc>
+        <w:tc>
+          <w:tcPr>
+            <w:tcW w:type="dxa" w:w="1008"/>
+            <w:vAlign w:val="center"/>
+          </w:tcPr>
+          <w:p>
+            <w:pPr>
+              <w:spacing w:after="0"/>
+            </w:pPr>
+            <w:r/>
+            <w:r>
+              <w:rPr>
+                <w:b w:val="0"/>
+              </w:rPr>
+              <w:t>outside</w:t>
+            </w:r>
+          </w:p>
+        </w:tc>
+      </w:tr>
+      <w:tr>
+        <w:tc>
+          <w:tcPr>
+            <w:tcW w:type="dxa" w:w="3384"/>
+            <w:vAlign w:val="center"/>
+          </w:tcPr>
+          <w:p>
+            <w:pPr>
+              <w:spacing w:after="0"/>
+            </w:pPr>
+            <w:r/>
+            <w:r>
+              <w:rPr>
+                <w:b w:val="0"/>
+              </w:rPr>
+              <w:t>Startup settled</w:t>
+            </w:r>
+          </w:p>
+        </w:tc>
+        <w:tc>
+          <w:tcPr>
+            <w:tcW w:type="dxa" w:w="1152"/>
+            <w:vAlign w:val="center"/>
+          </w:tcPr>
+          <w:p>
+            <w:pPr>
+              <w:spacing w:after="0"/>
+            </w:pPr>
+            <w:r/>
+            <w:r>
+              <w:rPr>
+                <w:b w:val="0"/>
+              </w:rPr>
+              <w:t>1.5007 s</w:t>
+            </w:r>
+          </w:p>
+        </w:tc>
+        <w:tc>
+          <w:tcPr>
+            <w:tcW w:type="dxa" w:w="1080"/>
+            <w:vAlign w:val="center"/>
+          </w:tcPr>
+          <w:p>
+            <w:pPr>
+              <w:spacing w:after="0"/>
+            </w:pPr>
+            <w:r/>
+            <w:r>
+              <w:rPr>
+                <w:b w:val="0"/>
+              </w:rPr>
+              <w:t>2.4969 V</w:t>
+            </w:r>
+          </w:p>
+        </w:tc>
+        <w:tc>
+          <w:tcPr>
+            <w:tcW w:type="dxa" w:w="2232"/>
+            <w:vAlign w:val="center"/>
+          </w:tcPr>
+          <w:p>
+            <w:pPr>
+              <w:spacing w:after="0"/>
+            </w:pPr>
+            <w:r/>
+            <w:r>
+              <w:rPr>
+                <w:b w:val="0"/>
+              </w:rPr>
+              <w:t>2.4057 to 2.5942 V</w:t>
+            </w:r>
+          </w:p>
+        </w:tc>
+        <w:tc>
+          <w:tcPr>
+            <w:tcW w:type="dxa" w:w="936"/>
+            <w:vAlign w:val="center"/>
+          </w:tcPr>
+          <w:p>
+            <w:pPr>
+              <w:spacing w:after="0"/>
+            </w:pPr>
+            <w:r/>
+            <w:r>
+              <w:rPr>
+                <w:b w:val="0"/>
+              </w:rPr>
+              <w:t>0.00 V</w:t>
+            </w:r>
+          </w:p>
+        </w:tc>
+        <w:tc>
+          <w:tcPr>
+            <w:tcW w:type="dxa" w:w="1008"/>
+            <w:vAlign w:val="center"/>
+          </w:tcPr>
+          <w:p>
+            <w:pPr>
+              <w:spacing w:after="0"/>
+            </w:pPr>
+            <w:r/>
+            <w:r>
+              <w:rPr>
+                <w:b w:val="0"/>
+              </w:rPr>
+              <w:t>inside</w:t>
+            </w:r>
+          </w:p>
+        </w:tc>
+      </w:tr>
+      <w:tr>
+        <w:tc>
+          <w:tcPr>
+            <w:tcW w:type="dxa" w:w="3384"/>
+            <w:vAlign w:val="center"/>
+          </w:tcPr>
+          <w:p>
+            <w:pPr>
+              <w:spacing w:after="0"/>
+            </w:pPr>
+            <w:r/>
+            <w:r>
+              <w:rPr>
+                <w:b w:val="0"/>
+              </w:rPr>
+              <w:t>Large upward bend held</w:t>
+            </w:r>
+          </w:p>
+        </w:tc>
+        <w:tc>
+          <w:tcPr>
+            <w:tcW w:type="dxa" w:w="1152"/>
+            <w:vAlign w:val="center"/>
+          </w:tcPr>
+          <w:p>
+            <w:pPr>
+              <w:spacing w:after="0"/>
+            </w:pPr>
+            <w:r/>
+            <w:r>
+              <w:rPr>
+                <w:b w:val="0"/>
+              </w:rPr>
+              <w:t>2.2508 s</w:t>
+            </w:r>
+          </w:p>
+        </w:tc>
+        <w:tc>
+          <w:tcPr>
+            <w:tcW w:type="dxa" w:w="1080"/>
+            <w:vAlign w:val="center"/>
+          </w:tcPr>
+          <w:p>
+            <w:pPr>
+              <w:spacing w:after="0"/>
+            </w:pPr>
+            <w:r/>
+            <w:r>
+              <w:rPr>
+                <w:b w:val="0"/>
+              </w:rPr>
+              <w:t>4.9840 V</w:t>
+            </w:r>
+          </w:p>
+        </w:tc>
+        <w:tc>
+          <w:tcPr>
+            <w:tcW w:type="dxa" w:w="2232"/>
+            <w:vAlign w:val="center"/>
+          </w:tcPr>
+          <w:p>
+            <w:pPr>
+              <w:spacing w:after="0"/>
+            </w:pPr>
+            <w:r/>
+            <w:r>
+              <w:rPr>
+                <w:b w:val="0"/>
+              </w:rPr>
+              <w:t>2.5804 to 2.7689 V</w:t>
+            </w:r>
+          </w:p>
+        </w:tc>
+        <w:tc>
+          <w:tcPr>
+            <w:tcW w:type="dxa" w:w="936"/>
+            <w:vAlign w:val="center"/>
+          </w:tcPr>
+          <w:p>
+            <w:pPr>
+              <w:spacing w:after="0"/>
+            </w:pPr>
+            <w:r/>
+            <w:r>
+              <w:rPr>
+                <w:b w:val="0"/>
+              </w:rPr>
+              <w:t>5.00 V</w:t>
+            </w:r>
+          </w:p>
+        </w:tc>
+        <w:tc>
+          <w:tcPr>
+            <w:tcW w:type="dxa" w:w="1008"/>
+            <w:vAlign w:val="center"/>
+          </w:tcPr>
+          <w:p>
+            <w:pPr>
+              <w:spacing w:after="0"/>
+            </w:pPr>
+            <w:r/>
+            <w:r>
+              <w:rPr>
+                <w:b w:val="0"/>
+              </w:rPr>
+              <w:t>outside</w:t>
+            </w:r>
+          </w:p>
+        </w:tc>
+      </w:tr>
+      <w:tr>
+        <w:tc>
+          <w:tcPr>
+            <w:tcW w:type="dxa" w:w="3384"/>
+            <w:vAlign w:val="center"/>
+          </w:tcPr>
+          <w:p>
+            <w:pPr>
+              <w:spacing w:after="0"/>
+            </w:pPr>
+            <w:r/>
+            <w:r>
+              <w:rPr>
+                <w:b w:val="0"/>
+              </w:rPr>
+              <w:t>Upward release back near center</w:t>
+            </w:r>
+          </w:p>
+        </w:tc>
+        <w:tc>
+          <w:tcPr>
+            <w:tcW w:type="dxa" w:w="1152"/>
+            <w:vAlign w:val="center"/>
+          </w:tcPr>
+          <w:p>
+            <w:pPr>
+              <w:spacing w:after="0"/>
+            </w:pPr>
+            <w:r/>
+            <w:r>
+              <w:rPr>
+                <w:b w:val="0"/>
+              </w:rPr>
+              <w:t>3.2507 s</w:t>
+            </w:r>
+          </w:p>
+        </w:tc>
+        <w:tc>
+          <w:tcPr>
+            <w:tcW w:type="dxa" w:w="1080"/>
+            <w:vAlign w:val="center"/>
+          </w:tcPr>
+          <w:p>
+            <w:pPr>
+              <w:spacing w:after="0"/>
+            </w:pPr>
+            <w:r/>
+            <w:r>
+              <w:rPr>
+                <w:b w:val="0"/>
+              </w:rPr>
+              <w:t>2.4992 V</w:t>
+            </w:r>
+          </w:p>
+        </w:tc>
+        <w:tc>
+          <w:tcPr>
+            <w:tcW w:type="dxa" w:w="2232"/>
+            <w:vAlign w:val="center"/>
+          </w:tcPr>
+          <w:p>
+            <w:pPr>
+              <w:spacing w:after="0"/>
+            </w:pPr>
+            <w:r/>
+            <w:r>
+              <w:rPr>
+                <w:b w:val="0"/>
+              </w:rPr>
+              <w:t>2.5916 to 2.7800 V</w:t>
+            </w:r>
+          </w:p>
+        </w:tc>
+        <w:tc>
+          <w:tcPr>
+            <w:tcW w:type="dxa" w:w="936"/>
+            <w:vAlign w:val="center"/>
+          </w:tcPr>
+          <w:p>
+            <w:pPr>
+              <w:spacing w:after="0"/>
+            </w:pPr>
+            <w:r/>
+            <w:r>
+              <w:rPr>
+                <w:b w:val="0"/>
+              </w:rPr>
+              <w:t>5.00 V</w:t>
+            </w:r>
+          </w:p>
+        </w:tc>
+        <w:tc>
+          <w:tcPr>
+            <w:tcW w:type="dxa" w:w="1008"/>
+            <w:vAlign w:val="center"/>
+          </w:tcPr>
+          <w:p>
+            <w:pPr>
+              <w:spacing w:after="0"/>
+            </w:pPr>
+            <w:r/>
+            <w:r>
+              <w:rPr>
+                <w:b w:val="0"/>
+              </w:rPr>
+              <w:t>outside</w:t>
+            </w:r>
+          </w:p>
+        </w:tc>
+      </w:tr>
+      <w:tr>
+        <w:tc>
+          <w:tcPr>
+            <w:tcW w:type="dxa" w:w="3384"/>
+            <w:vAlign w:val="center"/>
+          </w:tcPr>
+          <w:p>
+            <w:pPr>
+              <w:spacing w:after="0"/>
+            </w:pPr>
+            <w:r/>
+            <w:r>
+              <w:rPr>
+                <w:b w:val="0"/>
+              </w:rPr>
+              <w:t>Downward bend held</w:t>
+            </w:r>
+          </w:p>
+        </w:tc>
+        <w:tc>
+          <w:tcPr>
+            <w:tcW w:type="dxa" w:w="1152"/>
+            <w:vAlign w:val="center"/>
+          </w:tcPr>
+          <w:p>
+            <w:pPr>
+              <w:spacing w:after="0"/>
+            </w:pPr>
+            <w:r/>
+            <w:r>
+              <w:rPr>
+                <w:b w:val="0"/>
+              </w:rPr>
+              <w:t>4.4996 s</w:t>
+            </w:r>
+          </w:p>
+        </w:tc>
+        <w:tc>
+          <w:tcPr>
+            <w:tcW w:type="dxa" w:w="1080"/>
+            <w:vAlign w:val="center"/>
+          </w:tcPr>
+          <w:p>
+            <w:pPr>
+              <w:spacing w:after="0"/>
+            </w:pPr>
+            <w:r/>
+            <w:r>
+              <w:rPr>
+                <w:b w:val="0"/>
+              </w:rPr>
+              <w:t>-0.0046 V</w:t>
+            </w:r>
+          </w:p>
+        </w:tc>
+        <w:tc>
+          <w:tcPr>
+            <w:tcW w:type="dxa" w:w="2232"/>
+            <w:vAlign w:val="center"/>
+          </w:tcPr>
+          <w:p>
+            <w:pPr>
+              <w:spacing w:after="0"/>
+            </w:pPr>
+            <w:r/>
+            <w:r>
+              <w:rPr>
+                <w:b w:val="0"/>
+              </w:rPr>
+              <w:t>2.0435 to 2.2319 V</w:t>
+            </w:r>
+          </w:p>
+        </w:tc>
+        <w:tc>
+          <w:tcPr>
+            <w:tcW w:type="dxa" w:w="936"/>
+            <w:vAlign w:val="center"/>
+          </w:tcPr>
+          <w:p>
+            <w:pPr>
+              <w:spacing w:after="0"/>
+            </w:pPr>
+            <w:r/>
+            <w:r>
+              <w:rPr>
+                <w:b w:val="0"/>
+              </w:rPr>
+              <w:t>5.00 V</w:t>
+            </w:r>
+          </w:p>
+        </w:tc>
+        <w:tc>
+          <w:tcPr>
+            <w:tcW w:type="dxa" w:w="1008"/>
+            <w:vAlign w:val="center"/>
+          </w:tcPr>
+          <w:p>
+            <w:pPr>
+              <w:spacing w:after="0"/>
+            </w:pPr>
+            <w:r/>
+            <w:r>
+              <w:rPr>
+                <w:b w:val="0"/>
+              </w:rPr>
+              <w:t>outside</w:t>
+            </w:r>
+          </w:p>
+        </w:tc>
+      </w:tr>
+      <w:tr>
+        <w:tc>
+          <w:tcPr>
+            <w:tcW w:type="dxa" w:w="3384"/>
+            <w:vAlign w:val="center"/>
+          </w:tcPr>
+          <w:p>
+            <w:pPr>
+              <w:spacing w:after="0"/>
+            </w:pPr>
+            <w:r/>
+            <w:r>
+              <w:rPr>
+                <w:b w:val="0"/>
+              </w:rPr>
+              <w:t>Downward release entering moving window</w:t>
+            </w:r>
+          </w:p>
+        </w:tc>
+        <w:tc>
+          <w:tcPr>
+            <w:tcW w:type="dxa" w:w="1152"/>
+            <w:vAlign w:val="center"/>
+          </w:tcPr>
+          <w:p>
+            <w:pPr>
+              <w:spacing w:after="0"/>
+            </w:pPr>
+            <w:r/>
+            <w:r>
+              <w:rPr>
+                <w:b w:val="0"/>
+              </w:rPr>
+              <w:t>4.7376 s</w:t>
+            </w:r>
+          </w:p>
+        </w:tc>
+        <w:tc>
+          <w:tcPr>
+            <w:tcW w:type="dxa" w:w="1080"/>
+            <w:vAlign w:val="center"/>
+          </w:tcPr>
+          <w:p>
+            <w:pPr>
+              <w:spacing w:after="0"/>
+            </w:pPr>
+            <w:r/>
+            <w:r>
+              <w:rPr>
+                <w:b w:val="0"/>
+              </w:rPr>
+              <w:t>2.1896 V</w:t>
+            </w:r>
+          </w:p>
+        </w:tc>
+        <w:tc>
+          <w:tcPr>
+            <w:tcW w:type="dxa" w:w="2232"/>
+            <w:vAlign w:val="center"/>
+          </w:tcPr>
+          <w:p>
+            <w:pPr>
+              <w:spacing w:after="0"/>
+            </w:pPr>
+            <w:r/>
+            <w:r>
+              <w:rPr>
+                <w:b w:val="0"/>
+              </w:rPr>
+              <w:t>2.1867 to 2.3752 V</w:t>
+            </w:r>
+          </w:p>
+        </w:tc>
+        <w:tc>
+          <w:tcPr>
+            <w:tcW w:type="dxa" w:w="936"/>
+            <w:vAlign w:val="center"/>
+          </w:tcPr>
+          <w:p>
+            <w:pPr>
+              <w:spacing w:after="0"/>
+            </w:pPr>
+            <w:r/>
+            <w:r>
+              <w:rPr>
+                <w:b w:val="0"/>
+              </w:rPr>
+              <w:t>5.00 V</w:t>
+            </w:r>
+          </w:p>
+        </w:tc>
+        <w:tc>
+          <w:tcPr>
+            <w:tcW w:type="dxa" w:w="1008"/>
+            <w:vAlign w:val="center"/>
+          </w:tcPr>
+          <w:p>
+            <w:pPr>
+              <w:spacing w:after="0"/>
+            </w:pPr>
+            <w:r/>
+            <w:r>
+              <w:rPr>
+                <w:b w:val="0"/>
+              </w:rPr>
+              <w:t>inside</w:t>
+            </w:r>
+          </w:p>
+        </w:tc>
+      </w:tr>
+      <w:tr>
+        <w:tc>
+          <w:tcPr>
+            <w:tcW w:type="dxa" w:w="3384"/>
+            <w:vAlign w:val="center"/>
+          </w:tcPr>
+          <w:p>
+            <w:pPr>
+              <w:spacing w:after="0"/>
+            </w:pPr>
+            <w:r/>
+            <w:r>
+              <w:rPr>
+                <w:b w:val="0"/>
+              </w:rPr>
+              <w:t>Downward release captured</w:t>
+            </w:r>
+          </w:p>
+        </w:tc>
+        <w:tc>
+          <w:tcPr>
+            <w:tcW w:type="dxa" w:w="1152"/>
+            <w:vAlign w:val="center"/>
+          </w:tcPr>
+          <w:p>
+            <w:pPr>
+              <w:spacing w:after="0"/>
+            </w:pPr>
+            <w:r/>
+            <w:r>
+              <w:rPr>
+                <w:b w:val="0"/>
+              </w:rPr>
+              <w:t>4.7500 s</w:t>
+            </w:r>
+          </w:p>
+        </w:tc>
+        <w:tc>
+          <w:tcPr>
+            <w:tcW w:type="dxa" w:w="1080"/>
+            <w:vAlign w:val="center"/>
+          </w:tcPr>
+          <w:p>
+            <w:pPr>
+              <w:spacing w:after="0"/>
+            </w:pPr>
+            <w:r/>
+            <w:r>
+              <w:rPr>
+                <w:b w:val="0"/>
+              </w:rPr>
+              <w:t>2.3302 V</w:t>
+            </w:r>
+          </w:p>
+        </w:tc>
+        <w:tc>
+          <w:tcPr>
+            <w:tcW w:type="dxa" w:w="2232"/>
+            <w:vAlign w:val="center"/>
+          </w:tcPr>
+          <w:p>
+            <w:pPr>
+              <w:spacing w:after="0"/>
+            </w:pPr>
+            <w:r/>
+            <w:r>
+              <w:rPr>
+                <w:b w:val="0"/>
+              </w:rPr>
+              <w:t>2.1999 to 2.3883 V</w:t>
+            </w:r>
+          </w:p>
+        </w:tc>
+        <w:tc>
+          <w:tcPr>
+            <w:tcW w:type="dxa" w:w="936"/>
+            <w:vAlign w:val="center"/>
+          </w:tcPr>
+          <w:p>
+            <w:pPr>
+              <w:spacing w:after="0"/>
+            </w:pPr>
+            <w:r/>
+            <w:r>
+              <w:rPr>
+                <w:b w:val="0"/>
+              </w:rPr>
+              <w:t>0.00 V</w:t>
+            </w:r>
+          </w:p>
+        </w:tc>
+        <w:tc>
+          <w:tcPr>
+            <w:tcW w:type="dxa" w:w="1008"/>
+            <w:vAlign w:val="center"/>
+          </w:tcPr>
+          <w:p>
+            <w:pPr>
+              <w:spacing w:after="0"/>
+            </w:pPr>
+            <w:r/>
+            <w:r>
+              <w:rPr>
+                <w:b w:val="0"/>
+              </w:rPr>
+              <w:t>inside</w:t>
+            </w:r>
+          </w:p>
+        </w:tc>
+      </w:tr>
+      <w:tr>
+        <w:tc>
+          <w:tcPr>
+            <w:tcW w:type="dxa" w:w="3384"/>
+            <w:vAlign w:val="center"/>
+          </w:tcPr>
+          <w:p>
+            <w:pPr>
+              <w:spacing w:after="0"/>
+            </w:pPr>
+            <w:r/>
+            <w:r>
+              <w:rPr>
+                <w:b w:val="0"/>
+              </w:rPr>
+              <w:t>Post-release center before vibrato</w:t>
+            </w:r>
+          </w:p>
+        </w:tc>
+        <w:tc>
+          <w:tcPr>
+            <w:tcW w:type="dxa" w:w="1152"/>
+            <w:vAlign w:val="center"/>
+          </w:tcPr>
+          <w:p>
+            <w:pPr>
+              <w:spacing w:after="0"/>
+            </w:pPr>
+            <w:r/>
+            <w:r>
+              <w:rPr>
+                <w:b w:val="0"/>
+              </w:rPr>
+              <w:t>5.3999 s</w:t>
+            </w:r>
+          </w:p>
+        </w:tc>
+        <w:tc>
+          <w:tcPr>
+            <w:tcW w:type="dxa" w:w="1080"/>
+            <w:vAlign w:val="center"/>
+          </w:tcPr>
+          <w:p>
+            <w:pPr>
+              <w:spacing w:after="0"/>
+            </w:pPr>
+            <w:r/>
+            <w:r>
+              <w:rPr>
+                <w:b w:val="0"/>
+              </w:rPr>
+              <w:t>2.4965 V</w:t>
+            </w:r>
+          </w:p>
+        </w:tc>
+        <w:tc>
+          <w:tcPr>
+            <w:tcW w:type="dxa" w:w="2232"/>
+            <w:vAlign w:val="center"/>
+          </w:tcPr>
+          <w:p>
+            <w:pPr>
+              <w:spacing w:after="0"/>
+            </w:pPr>
+            <w:r/>
+            <w:r>
+              <w:rPr>
+                <w:b w:val="0"/>
+              </w:rPr>
+              <w:t>2.4005 to 2.5889 V</w:t>
+            </w:r>
+          </w:p>
+        </w:tc>
+        <w:tc>
+          <w:tcPr>
+            <w:tcW w:type="dxa" w:w="936"/>
+            <w:vAlign w:val="center"/>
+          </w:tcPr>
+          <w:p>
+            <w:pPr>
+              <w:spacing w:after="0"/>
+            </w:pPr>
+            <w:r/>
+            <w:r>
+              <w:rPr>
+                <w:b w:val="0"/>
+              </w:rPr>
+              <w:t>0.01 V</w:t>
+            </w:r>
+          </w:p>
+        </w:tc>
+        <w:tc>
+          <w:tcPr>
+            <w:tcW w:type="dxa" w:w="1008"/>
+            <w:vAlign w:val="center"/>
+          </w:tcPr>
+          <w:p>
+            <w:pPr>
+              <w:spacing w:after="0"/>
+            </w:pPr>
+            <w:r/>
+            <w:r>
+              <w:rPr>
+                <w:b w:val="0"/>
+              </w:rPr>
+              <w:t>inside</w:t>
+            </w:r>
+          </w:p>
+        </w:tc>
+      </w:tr>
+      <w:tr>
+        <w:tc>
+          <w:tcPr>
+            <w:tcW w:type="dxa" w:w="3384"/>
+            <w:vAlign w:val="center"/>
+          </w:tcPr>
+          <w:p>
+            <w:pPr>
+              <w:spacing w:after="0"/>
+            </w:pPr>
+            <w:r/>
+            <w:r>
+              <w:rPr>
+                <w:b w:val="0"/>
+              </w:rPr>
+              <w:t>Vibrato interval sample</w:t>
+            </w:r>
+          </w:p>
+        </w:tc>
+        <w:tc>
+          <w:tcPr>
+            <w:tcW w:type="dxa" w:w="1152"/>
+            <w:vAlign w:val="center"/>
+          </w:tcPr>
+          <w:p>
+            <w:pPr>
+              <w:spacing w:after="0"/>
+            </w:pPr>
+            <w:r/>
+            <w:r>
+              <w:rPr>
+                <w:b w:val="0"/>
+              </w:rPr>
+              <w:t>6.0009 s</w:t>
+            </w:r>
+          </w:p>
+        </w:tc>
+        <w:tc>
+          <w:tcPr>
+            <w:tcW w:type="dxa" w:w="1080"/>
+            <w:vAlign w:val="center"/>
+          </w:tcPr>
+          <w:p>
+            <w:pPr>
+              <w:spacing w:after="0"/>
+            </w:pPr>
+            <w:r/>
+            <w:r>
+              <w:rPr>
+                <w:b w:val="0"/>
+              </w:rPr>
+              <w:t>2.4719 V</w:t>
+            </w:r>
+          </w:p>
+        </w:tc>
+        <w:tc>
+          <w:tcPr>
+            <w:tcW w:type="dxa" w:w="2232"/>
+            <w:vAlign w:val="center"/>
+          </w:tcPr>
+          <w:p>
+            <w:pPr>
+              <w:spacing w:after="0"/>
+            </w:pPr>
+            <w:r/>
+            <w:r>
+              <w:rPr>
+                <w:b w:val="0"/>
+              </w:rPr>
+              <w:t>2.3975 to 2.5860 V</w:t>
+            </w:r>
+          </w:p>
+        </w:tc>
+        <w:tc>
+          <w:tcPr>
+            <w:tcW w:type="dxa" w:w="936"/>
+            <w:vAlign w:val="center"/>
+          </w:tcPr>
+          <w:p>
+            <w:pPr>
+              <w:spacing w:after="0"/>
+            </w:pPr>
+            <w:r/>
+            <w:r>
+              <w:rPr>
+                <w:b w:val="0"/>
+              </w:rPr>
+              <w:t>0.00 V</w:t>
+            </w:r>
+          </w:p>
+        </w:tc>
+        <w:tc>
+          <w:tcPr>
+            <w:tcW w:type="dxa" w:w="1008"/>
+            <w:vAlign w:val="center"/>
+          </w:tcPr>
+          <w:p>
+            <w:pPr>
+              <w:spacing w:after="0"/>
+            </w:pPr>
+            <w:r/>
+            <w:r>
+              <w:rPr>
+                <w:b w:val="0"/>
+              </w:rPr>
+              <w:t>inside</w:t>
+            </w:r>
+          </w:p>
+        </w:tc>
+      </w:tr>
+    </w:tbl>
     <w:p>
       <w:pPr>
-        <w:pStyle w:val="Heading2"/>
+        <w:spacing w:after="40"/>
       </w:pPr>
-      <w:r>
-        <w:t>5.2 Production deadband plus high-pass bypass</w:t>
-      </w:r>
     </w:p>
     <w:p>
       <w:r>
-        <w:t>The next important milestone came much later, in the March 7, 2026 post “eWhammy: Last-Minute Refinements.” By then, practical production testing had revealed that the mass-produced spring plates exhibited more hysteresis than the earlier prototypes. Mechanical improvements such as a 3 mm fillet helped substantially, but some residual hysteresis remained. The workaround for that batch was a fixed deadband of ±2.5% plus a high-pass bypass so that small, faster wiggles could get through even while the center was still being stabilized by the deadband circuit.</w:t>
-      </w:r>
-    </w:p>
-    <w:p>
-      <w:r>
-        <w:t>This was a clever and practical production fix. It showed that a high-pass path could restore musical vibrato while a deadband handled the larger center problem. But it also made clear that the solution was now becoming layered and somewhat artificial. The deadband solved the center problem. The high-pass path then had to solve the musical feel problem created by the deadband. That was informative, but it suggested that an even cleaner architecture might exist.</w:t>
-      </w:r>
-    </w:p>
-    <w:p>
-      <w:pPr>
-        <w:pStyle w:val="Heading2"/>
-      </w:pPr>
-      <w:r>
-        <w:t>5.3 Always-on DC servo</w:t>
-      </w:r>
-    </w:p>
-    <w:p>
-      <w:r>
-        <w:t>The next major line of thought was a DC servo. Instead of snapping to center with a deadband, one could compare the output to VREF and slowly integrate the error until the center drift disappeared. In principle, this is attractive because it replaces the hard center lock with continuous negative feedback. In practice, the plain always-on servo did center the output, but it also behaved exactly like a musician would fear: it fought sustained bends and suppressed vibrato. The faster the servo time constant, the stronger the suppression. Slowing the servo preserved more vibrato, but then the centering became sluggish. This revealed a fundamental compromise in the always-on approach.</w:t>
-      </w:r>
-    </w:p>
-    <w:p>
-      <w:r>
-        <w:t>That stage of the investigation was still extremely valuable. It proved that DC correction works, but it also proved that a correction loop which is always awake will inevitably start treating intentional motion as error.</w:t>
-      </w:r>
-    </w:p>
-    <w:p>
-      <w:pPr>
-        <w:pStyle w:val="Heading2"/>
-      </w:pPr>
-      <w:r>
-        <w:t>5.4 Windowed DC servo</w:t>
-      </w:r>
-    </w:p>
-    <w:p>
-      <w:r>
-        <w:t>To escape that compromise, the servo was then given a hold window. The idea was simple: allow the servo to correct only when the output is sufficiently near center, and force the servo input to VREF when the output moves well outside that window. This was a major improvement. It protected large bends and prevented the loop from chasing them as if they were drift. It also made it possible to bound the servo action with either a hard clamp or a softer limiter around the integrator input. This line of investigation taught two valuable lessons. First, the hold idea was sound. Second, startup could become tricky if the preamp output started far from center, because the hold logic could accidentally freeze the loop before it ever had a chance to acquire the correct center. That problem was solvable, but it showed that the architecture was becoming more elaborate.</w:t>
-      </w:r>
-    </w:p>
-    <w:p>
-      <w:pPr>
-        <w:pStyle w:val="Heading2"/>
-      </w:pPr>
-      <w:r>
-        <w:t>5.5 The final solution: differentiator plus integrator with conditional reset</w:t>
-      </w:r>
-    </w:p>
-    <w:p>
-      <w:r>
-        <w:t>The next major shift in thinking was to stop asking a correction loop to distinguish motion from drift. Instead, the main signal path itself could be built so that it naturally responds to motion while ignoring static offset. That is where the differentiator plus integrator pair entered the picture.</w:t>
-      </w:r>
-    </w:p>
-    <w:p>
-      <w:r>
-        <w:t>A differentiator responds to change rather than to absolute level. In frequency-domain terms, its gain rises with frequency, forming a straight-line upward slope on a Bode magnitude plot. At exactly DC, its gain is zero. That is the crucial point. A steady offset, no matter how wrong it is, is not changing, so the differentiator does not pass it. In this design, that means ordinary center drift and very slow mechanical bias are naturally rejected by the first stage.</w:t>
-      </w:r>
-    </w:p>
-    <w:p>
-      <w:pPr/>
-      <w:r>
-        <w:t>An integrator has the opposite frequency response. Its gain is highest at very low frequency and then falls as frequency rises. When an integrator is placed after a differentiator, the two responses largely cancel over the useful signal band. In effect, the integrator reconstructs the motion that the differentiator extracted. One crucial exception remains: because the differentiator has exactly zero gain at DC, the missing DC component can never be reconstructed. The pair therefore preserves motion while naturally blocking offsets and very slow drift.</w:t>
-      </w:r>
-    </w:p>
-    <w:p>
-      <w:r>
-        <w:t>This was the first approach that felt fundamentally different from both the deadband family and the DC-servo family. Large bends and vibrato were preserved naturally, startup behavior was clean, and the main signal path no longer depended on a deadband or on an always-on correction loop.</w:t>
-      </w:r>
-    </w:p>
-    <w:p>
-      <w:pPr/>
-      <w:r>
-        <w:t>To make the idea practical, two refinements were needed. The differentiator was band-limited so that it would not amplify high-frequency noise, and the integrator was given a conditional reset or bleed path that becomes active only when the output is close enough to center. That reset path removes the lingering center error caused by spring hysteresis and prevents long-term drift, but because it is only active near center, it does not interfere with normal bends or vibrato.</w:t>
+        <w:t>The decisive moment is the downward release. Around 4.7376 s, OUT is 2.1896 V and the moving lower threshold is 2.1867 V, so the release is just inside the window. By 4.7500 s, OUT has recovered to 2.3302 V and remains inside the moving window. This is the behavior the fixed narrow window failed to provide.</w:t>
       </w:r>
     </w:p>
     <w:p>
@@ -427,8 +2486,8 @@
       <w:r>
         <w:drawing>
           <wp:inline xmlns:a="http://schemas.openxmlformats.org/drawingml/2006/main" xmlns:pic="http://schemas.openxmlformats.org/drawingml/2006/picture">
-            <wp:extent cx="5669280" cy="3062239"/>
-            <wp:docPr id="2" name="Picture 2"/>
+            <wp:extent cx="5989320" cy="3034589"/>
+            <wp:docPr id="1" name="Picture 1"/>
             <wp:cNvGraphicFramePr>
               <a:graphicFrameLocks noChangeAspect="1"/>
             </wp:cNvGraphicFramePr>
@@ -436,11 +2495,11 @@
               <a:graphicData uri="http://schemas.openxmlformats.org/drawingml/2006/picture">
                 <pic:pic>
                   <pic:nvPicPr>
-                    <pic:cNvPr id="0" name="differentiator_bode_magnitude.png"/>
+                    <pic:cNvPr id="0" name="ewhammy_plot10_overview.png"/>
                     <pic:cNvPicPr/>
                   </pic:nvPicPr>
                   <pic:blipFill>
-                    <a:blip r:embed="rId10"/>
+                    <a:blip r:embed="rId9"/>
                     <a:stretch>
                       <a:fillRect/>
                     </a:stretch>
@@ -448,7 +2507,7 @@
                   <pic:spPr>
                     <a:xfrm>
                       <a:off x="0" y="0"/>
-                      <a:ext cx="5669280" cy="3062239"/>
+                      <a:ext cx="5989320" cy="3034589"/>
                     </a:xfrm>
                     <a:prstGeom prst="rect"/>
                   </pic:spPr>
@@ -464,32 +2523,59 @@
         <w:jc w:val="center"/>
       </w:pPr>
       <w:r>
-        <w:rPr>
-          <w:i/>
-        </w:rPr>
-        <w:t>Figure 2. Magnitude response of the final practical differentiator. The 47 kΩ/100 nF input network sets the lower corner at about 33.9 Hz, while the 1 MΩ/1 nF feedback network sets the upper corner at about 159.2 Hz.</w:t>
+        <w:t>Figure 1. Final simulation overview from plot10.csv. OUT is blue, WH red, WL green, and HOLD yellow. The moving thresholds retain a narrow fixed separation while their center follows slow OUT movement.</w:t>
       </w:r>
-    </w:p>
-    <w:p>
-      <w:pPr/>
-      <w:r/>
-    </w:p>
-    <w:p>
-      <w:pPr/>
-      <w:r/>
     </w:p>
     <w:p>
       <w:pPr>
         <w:pStyle w:val="Heading1"/>
       </w:pPr>
       <w:r>
-        <w:t>6. Final Simulated Circuit Blocks</w:t>
+        <w:t>Startup Reset</w:t>
       </w:r>
     </w:p>
     <w:p>
-      <w:pPr/>
       <w:r>
-        <w:t>The final simulation used the following values:</w:t>
+        <w:t>The startup reset is intentionally active-low with respect to HOLD. The open-drain inverter and the 2.2uF/1M RC network force HOLD low at startup, not high. That allows the servo to track and settle during power application. In the latest simulation, OUT is already close to center by 1.0 s and remains centered through the 1.5 s to 2.0 s startup interval.</w:t>
+      </w:r>
+    </w:p>
+    <w:p>
+      <w:r>
+        <w:t>This also removes the need for the synthesized TOUCH signal. The circuit no longer depends on guessing when the player touches or releases the whammy bar; startup acquisition and motion-qualified HOLD behavior are handled locally by the analog circuitry.</w:t>
+      </w:r>
+    </w:p>
+    <w:p>
+      <w:pPr>
+        <w:pStyle w:val="Heading1"/>
+      </w:pPr>
+      <w:r>
+        <w:t>Vibrato Behavior</w:t>
+      </w:r>
+    </w:p>
+    <w:p>
+      <w:r>
+        <w:t>The vibrato region can produce short HOLD pulses of roughly 54 ms to 64 ms in the simulation. This is acceptable for the reset mechanism because the reset/integrator dynamics are far below the 5 Hz vibrato frequency. In other words, the logic may see brief excursions, but the correction path is too slow to flatten the vibrato appreciably.</w:t>
+      </w:r>
+    </w:p>
+    <w:p>
+      <w:pPr>
+        <w:pStyle w:val="Heading1"/>
+      </w:pPr>
+      <w:r>
+        <w:t>Current Conclusion</w:t>
+      </w:r>
+    </w:p>
+    <w:p>
+      <w:r>
+        <w:t>The current design is the strongest result so far. It preserves a narrow musical reset window, captures both upward and downward releases despite spring hysteresis, no longer needs TOUCH, and starts cleanly because HOLD is forced low during power-up. The main remaining work is physical validation: capacitor tolerance and DC bias, op amp/comparator offsets, leakage, and the real spring hysteresis distribution should be checked on hardware.</w:t>
+      </w:r>
+    </w:p>
+    <w:p>
+      <w:pPr>
+        <w:pStyle w:val="Heading1"/>
+      </w:pPr>
+      <w:r>
+        <w:t>Open Checks Before Hardware Freeze</w:t>
       </w:r>
     </w:p>
     <w:p>
@@ -497,7 +2583,7 @@
         <w:pStyle w:val="ListBullet"/>
       </w:pPr>
       <w:r>
-        <w:t>Band-limited differentiator: R3 = 47 kΩ, C1 = 100 nF, R1 = 1 MΩ, C3 = 1 nF</w:t>
+        <w:t>Confirm the moving-window low-pass time constant against real playing gestures, not only the synthetic model.</w:t>
       </w:r>
     </w:p>
     <w:p>
@@ -505,7 +2591,7 @@
         <w:pStyle w:val="ListBullet"/>
       </w:pPr>
       <w:r>
-        <w:t>Integrator: R2 = 100 kΩ, C2 = 100 nF</w:t>
+        <w:t>Verify MLCC effective capacitance for the 2.2uF and 10uF capacitors at actual bias and package size.</w:t>
       </w:r>
     </w:p>
     <w:p>
@@ -513,7 +2599,7 @@
         <w:pStyle w:val="ListBullet"/>
       </w:pPr>
       <w:r>
-        <w:t>Conditional reset or bleed: R4 = 2 MΩ, enabled when the output is sufficiently near center</w:t>
+        <w:t>Check comparator/open-drain propagation and pull-up values against startup and HOLD timing.</w:t>
       </w:r>
     </w:p>
     <w:p>
@@ -521,755 +2607,7 @@
         <w:pStyle w:val="ListBullet"/>
       </w:pPr>
       <w:r>
-        <w:t>Reference values: VREF = 2.5 V, supply = 5 V</w:t>
-      </w:r>
-    </w:p>
-    <w:p>
-      <w:pPr/>
-      <w:r>
-        <w:t>With the final differentiator values, the input RC corner is approximately 33.9 Hz and the feedback RC corner is approximately 159.2 Hz. Together they create a practical, band-limited differentiator: low-frequency drift is rejected, useful motion is emphasized, and high-frequency noise is prevented from growing without bound.</w:t>
-      </w:r>
-    </w:p>
-    <w:p>
-      <w:r>
-        <w:t>The reset or cleanup time constant is set by R4·C2. With R4 = 2 MΩ and C2 = 100 nF, the cleanup time constant is 0.2 s. In practice this means the residual error is reduced quickly once the bleed is enabled, but not so quickly that normal motion is flattened or made to feel abrupt.</w:t>
-      </w:r>
-    </w:p>
-    <w:p>
-      <w:pPr>
-        <w:jc w:val="center"/>
-      </w:pPr>
-      <w:r>
-        <w:drawing>
-          <wp:inline xmlns:a="http://schemas.openxmlformats.org/drawingml/2006/main" xmlns:pic="http://schemas.openxmlformats.org/drawingml/2006/picture">
-            <wp:extent cx="5943600" cy="4170651"/>
-            <wp:docPr id="1" name="Picture 1"/>
-            <wp:cNvGraphicFramePr>
-              <a:graphicFrameLocks noChangeAspect="1"/>
-            </wp:cNvGraphicFramePr>
-            <a:graphic>
-              <a:graphicData uri="http://schemas.openxmlformats.org/drawingml/2006/picture">
-                <pic:pic>
-                  <pic:nvPicPr>
-                    <pic:cNvPr id="0" name="D10AD616-0D68-42DE-B4C2-B152D4AB1851.png"/>
-                    <pic:cNvPicPr/>
-                  </pic:nvPicPr>
-                  <pic:blipFill>
-                    <a:blip r:embed="rId9"/>
-                    <a:stretch>
-                      <a:fillRect/>
-                    </a:stretch>
-                  </pic:blipFill>
-                  <pic:spPr>
-                    <a:xfrm>
-                      <a:off x="0" y="0"/>
-                      <a:ext cx="5943600" cy="4170651"/>
-                    </a:xfrm>
-                    <a:prstGeom prst="rect"/>
-                  </pic:spPr>
-                </pic:pic>
-              </a:graphicData>
-            </a:graphic>
-          </wp:inline>
-        </w:drawing>
-      </w:r>
-    </w:p>
-    <w:p>
-      <w:pPr>
-        <w:jc w:val="center"/>
-      </w:pPr>
-      <w:r>
-        <w:rPr>
-          <w:i/>
-        </w:rPr>
-        <w:t>Figure 1. Final simulation schematic. The band-limited differentiator feeds an integrator, while a conditional reset/bleed path is enabled only when the output returns sufficiently close to VREF.</w:t>
-      </w:r>
-    </w:p>
-    <w:p>
-      <w:pPr>
-        <w:pStyle w:val="Heading1"/>
-      </w:pPr>
-      <w:r>
-        <w:t>7. Why This Topology Works</w:t>
-      </w:r>
-    </w:p>
-    <w:p>
-      <w:r>
-        <w:t>The final topology succeeds because it avoids asking any one block to do two conflicting jobs. A deadband can stabilize center, but it tends to affect feel. A pure DC servo can cancel drift, but it tends to fight motion. A pure differentiator-plus-integrator preserves motion beautifully, but it also preserves the hysteresis step. The final topology solves this by dividing the problem correctly.</w:t>
-      </w:r>
-    </w:p>
-    <w:tbl>
-      <w:tblPr>
-        <w:tblStyle w:val="TableGrid"/>
-        <w:tblW w:type="auto" w:w="0"/>
-        <w:tblLook w:firstColumn="1" w:firstRow="1" w:lastColumn="0" w:lastRow="0" w:noHBand="0" w:noVBand="1" w:val="04A0"/>
-      </w:tblPr>
-      <w:tblGrid>
-        <w:gridCol w:w="3312"/>
-        <w:gridCol w:w="3312"/>
-        <w:gridCol w:w="3312"/>
-      </w:tblGrid>
-      <w:tr>
-        <w:tc>
-          <w:tcPr>
-            <w:tcW w:type="dxa" w:w="3312"/>
-            <w:shd w:fill="D9EAF7"/>
-          </w:tcPr>
-          <w:p>
-            <w:r>
-              <w:t>Block</w:t>
-            </w:r>
-          </w:p>
-        </w:tc>
-        <w:tc>
-          <w:tcPr>
-            <w:tcW w:type="dxa" w:w="3312"/>
-            <w:shd w:fill="D9EAF7"/>
-          </w:tcPr>
-          <w:p>
-            <w:r>
-              <w:t>Values</w:t>
-            </w:r>
-          </w:p>
-        </w:tc>
-        <w:tc>
-          <w:tcPr>
-            <w:tcW w:type="dxa" w:w="3312"/>
-            <w:shd w:fill="D9EAF7"/>
-          </w:tcPr>
-          <w:p>
-            <w:r>
-              <w:t>Purpose</w:t>
-            </w:r>
-          </w:p>
-        </w:tc>
-      </w:tr>
-      <w:tr>
-        <w:tc>
-          <w:tcPr>
-            <w:tcW w:type="dxa" w:w="3312"/>
-          </w:tcPr>
-          <w:p>
-            <w:r>
-              <w:t>Differentiator input network</w:t>
-            </w:r>
-          </w:p>
-        </w:tc>
-        <w:tc>
-          <w:tcPr>
-            <w:tcW w:type="dxa" w:w="3312"/>
-          </w:tcPr>
-          <w:p>
-            <w:r>
-              <w:t>R3 = 47 kΩ, C1 = 100 nF</w:t>
-            </w:r>
-          </w:p>
-        </w:tc>
-        <w:tc>
-          <w:tcPr>
-            <w:tcW w:type="dxa" w:w="3312"/>
-          </w:tcPr>
-          <w:p>
-            <w:r>
-              <w:t>Couples the raw sensor into the differentiator while rejecting static offset.</w:t>
-            </w:r>
-          </w:p>
-        </w:tc>
-      </w:tr>
-      <w:tr>
-        <w:tc>
-          <w:tcPr>
-            <w:tcW w:type="dxa" w:w="3312"/>
-          </w:tcPr>
-          <w:p>
-            <w:r>
-              <w:t>Differentiator feedback</w:t>
-            </w:r>
-          </w:p>
-        </w:tc>
-        <w:tc>
-          <w:tcPr>
-            <w:tcW w:type="dxa" w:w="3312"/>
-          </w:tcPr>
-          <w:p>
-            <w:r>
-              <w:t>R1 = 1 MΩ, C3 = 1 nF</w:t>
-            </w:r>
-          </w:p>
-        </w:tc>
-        <w:tc>
-          <w:tcPr>
-            <w:tcW w:type="dxa" w:w="3312"/>
-          </w:tcPr>
-          <w:p>
-            <w:r>
-              <w:t>Provides motion sensitivity while limiting high-frequency noise gain.</w:t>
-            </w:r>
-          </w:p>
-        </w:tc>
-      </w:tr>
-      <w:tr>
-        <w:tc>
-          <w:tcPr>
-            <w:tcW w:type="dxa" w:w="3312"/>
-          </w:tcPr>
-          <w:p>
-            <w:r>
-              <w:t>Integrator input</w:t>
-            </w:r>
-          </w:p>
-        </w:tc>
-        <w:tc>
-          <w:tcPr>
-            <w:tcW w:type="dxa" w:w="3312"/>
-          </w:tcPr>
-          <w:p>
-            <w:r>
-              <w:t>R2 = 100 kΩ</w:t>
-            </w:r>
-          </w:p>
-        </w:tc>
-        <w:tc>
-          <w:tcPr>
-            <w:tcW w:type="dxa" w:w="3312"/>
-          </w:tcPr>
-          <w:p>
-            <w:r>
-              <w:t>Sets the scaling into the reconstruction stage.</w:t>
-            </w:r>
-          </w:p>
-        </w:tc>
-      </w:tr>
-      <w:tr>
-        <w:tc>
-          <w:tcPr>
-            <w:tcW w:type="dxa" w:w="3312"/>
-          </w:tcPr>
-          <w:p>
-            <w:r>
-              <w:t>Integrator capacitor</w:t>
-            </w:r>
-          </w:p>
-        </w:tc>
-        <w:tc>
-          <w:tcPr>
-            <w:tcW w:type="dxa" w:w="3312"/>
-          </w:tcPr>
-          <w:p>
-            <w:r>
-              <w:t>C2 = 100 nF</w:t>
-            </w:r>
-          </w:p>
-        </w:tc>
-        <w:tc>
-          <w:tcPr>
-            <w:tcW w:type="dxa" w:w="3312"/>
-          </w:tcPr>
-          <w:p>
-            <w:r>
-              <w:t>Stores the reconstructed position state.</w:t>
-            </w:r>
-          </w:p>
-        </w:tc>
-      </w:tr>
-      <w:tr>
-        <w:tc>
-          <w:tcPr>
-            <w:tcW w:type="dxa" w:w="3312"/>
-          </w:tcPr>
-          <w:p>
-            <w:r>
-              <w:t>Conditional bleed path</w:t>
-            </w:r>
-          </w:p>
-        </w:tc>
-        <w:tc>
-          <w:tcPr>
-            <w:tcW w:type="dxa" w:w="3312"/>
-          </w:tcPr>
-          <w:p>
-            <w:r>
-              <w:t>R4 = 2 MΩ and S1</w:t>
-            </w:r>
-          </w:p>
-        </w:tc>
-        <w:tc>
-          <w:tcPr>
-            <w:tcW w:type="dxa" w:w="3312"/>
-          </w:tcPr>
-          <w:p>
-            <w:r>
-              <w:t>Bleeds the integrator only when the output is near center.</w:t>
-            </w:r>
-          </w:p>
-        </w:tc>
-      </w:tr>
-      <w:tr>
-        <w:tc>
-          <w:tcPr>
-            <w:tcW w:type="dxa" w:w="3312"/>
-          </w:tcPr>
-          <w:p>
-            <w:r>
-              <w:t>Reference and logic</w:t>
-            </w:r>
-          </w:p>
-        </w:tc>
-        <w:tc>
-          <w:tcPr>
-            <w:tcW w:type="dxa" w:w="3312"/>
-          </w:tcPr>
-          <w:p>
-            <w:r>
-              <w:t>VREF = 2.5 V, switch controlled by OUT relative to VREF</w:t>
-            </w:r>
-          </w:p>
-        </w:tc>
-        <w:tc>
-          <w:tcPr>
-            <w:tcW w:type="dxa" w:w="3312"/>
-          </w:tcPr>
-          <w:p>
-            <w:r>
-              <w:t>Defines the center and enables cleanup only in the near-center region.</w:t>
-            </w:r>
-          </w:p>
-        </w:tc>
-      </w:tr>
-    </w:tbl>
-    <w:p>
-      <w:r>
-        <w:t>The differentiator plus integrator path preserves the performance gesture.</w:t>
-      </w:r>
-    </w:p>
-    <w:p>
-      <w:pPr/>
-      <w:r>
-        <w:t>Because the differentiator has zero gain at DC, the main signal path never carries a steady center error in the first place. Because the integrator follows it, the wanted motion is reconstructed. Because the reset path is only active near center, the remaining error caused by spring hysteresis is cleaned up afterward, without flattening the gesture itself.</w:t>
-      </w:r>
-    </w:p>
-    <w:p>
-      <w:r>
-        <w:t>The bleed path is conditional rather than continuous, so it behaves like housekeeping rather than part of the performance gesture.</w:t>
-      </w:r>
-    </w:p>
-    <w:p>
-      <w:pPr/>
-      <w:r>
-        <w:t>The reset is resistive rather than a hard short, so cleanup is controlled rather than abrupt.</w:t>
-      </w:r>
-    </w:p>
-    <w:p>
-      <w:pPr/>
-      <w:r/>
-    </w:p>
-    <w:p>
-      <w:pPr>
-        <w:pStyle w:val="Heading1"/>
-      </w:pPr>
-      <w:r>
-        <w:t>8. Comparison with Earlier Approaches</w:t>
-      </w:r>
-    </w:p>
-    <w:p>
-      <w:pPr/>
-      <w:r>
-        <w:t>The table below summarizes the main strengths, weaknesses, and lessons from each approach.</w:t>
-      </w:r>
-    </w:p>
-    <w:p>
-      <w:pPr/>
-      <w:r/>
-    </w:p>
-    <w:p>
-      <w:pPr/>
-      <w:r/>
-    </w:p>
-    <w:tbl>
-      <w:tblPr>
-        <w:tblStyle w:val="TableGrid"/>
-        <w:tblW w:type="auto" w:w="0"/>
-        <w:tblLook w:firstColumn="1" w:firstRow="1" w:lastColumn="0" w:lastRow="0" w:noHBand="0" w:noVBand="1" w:val="04A0"/>
-      </w:tblPr>
-      <w:tblGrid>
-        <w:gridCol w:w="2484"/>
-        <w:gridCol w:w="2484"/>
-        <w:gridCol w:w="2484"/>
-        <w:gridCol w:w="2484"/>
-      </w:tblGrid>
-      <w:tr>
-        <w:tc>
-          <w:tcPr>
-            <w:tcW w:type="dxa" w:w="2484"/>
-            <w:shd w:fill="E8F0D9"/>
-          </w:tcPr>
-          <w:p>
-            <w:r>
-              <w:t>Approach</w:t>
-            </w:r>
-          </w:p>
-        </w:tc>
-        <w:tc>
-          <w:tcPr>
-            <w:tcW w:type="dxa" w:w="2484"/>
-            <w:shd w:fill="E8F0D9"/>
-          </w:tcPr>
-          <w:p>
-            <w:r>
-              <w:t>Strengths</w:t>
-            </w:r>
-          </w:p>
-        </w:tc>
-        <w:tc>
-          <w:tcPr>
-            <w:tcW w:type="dxa" w:w="2484"/>
-            <w:shd w:fill="E8F0D9"/>
-          </w:tcPr>
-          <w:p>
-            <w:r>
-              <w:t>Weaknesses</w:t>
-            </w:r>
-          </w:p>
-        </w:tc>
-        <w:tc>
-          <w:tcPr>
-            <w:tcW w:type="dxa" w:w="2484"/>
-            <w:shd w:fill="E8F0D9"/>
-          </w:tcPr>
-          <w:p>
-            <w:r>
-              <w:t>Main Lesson</w:t>
-            </w:r>
-          </w:p>
-        </w:tc>
-      </w:tr>
-      <w:tr>
-        <w:tc>
-          <w:tcPr>
-            <w:tcW w:type="dxa" w:w="2484"/>
-          </w:tcPr>
-          <w:p>
-            <w:r>
-              <w:t>Deadband center-locking</w:t>
-            </w:r>
-          </w:p>
-        </w:tc>
-        <w:tc>
-          <w:tcPr>
-            <w:tcW w:type="dxa" w:w="2484"/>
-          </w:tcPr>
-          <w:p>
-            <w:r>
-              <w:t>Strong center stability, conceptually simple.</w:t>
-            </w:r>
-          </w:p>
-        </w:tc>
-        <w:tc>
-          <w:tcPr>
-            <w:tcW w:type="dxa" w:w="2484"/>
-          </w:tcPr>
-          <w:p>
-            <w:r>
-              <w:t>Can feel sticky. Explicitly changes behavior near center.</w:t>
-            </w:r>
-          </w:p>
-        </w:tc>
-        <w:tc>
-          <w:tcPr>
-            <w:tcW w:type="dxa" w:w="2484"/>
-          </w:tcPr>
-          <w:p>
-            <w:r>
-              <w:t>Center locking works, but feel matters.</w:t>
-            </w:r>
-          </w:p>
-        </w:tc>
-      </w:tr>
-      <w:tr>
-        <w:tc>
-          <w:tcPr>
-            <w:tcW w:type="dxa" w:w="2484"/>
-          </w:tcPr>
-          <w:p>
-            <w:r>
-              <w:t>Deadband plus HP bypass</w:t>
-            </w:r>
-          </w:p>
-        </w:tc>
-        <w:tc>
-          <w:tcPr>
-            <w:tcW w:type="dxa" w:w="2484"/>
-          </w:tcPr>
-          <w:p>
-            <w:r>
-              <w:t>Practical production fix. Vibrato can be restored.</w:t>
-            </w:r>
-          </w:p>
-        </w:tc>
-        <w:tc>
-          <w:tcPr>
-            <w:tcW w:type="dxa" w:w="2484"/>
-          </w:tcPr>
-          <w:p>
-            <w:r>
-              <w:t>Still layered. HP path compensates for a problem introduced by the deadband.</w:t>
-            </w:r>
-          </w:p>
-        </w:tc>
-        <w:tc>
-          <w:tcPr>
-            <w:tcW w:type="dxa" w:w="2484"/>
-          </w:tcPr>
-          <w:p>
-            <w:r>
-              <w:t>Useful workaround, but not the cleanest architecture.</w:t>
-            </w:r>
-          </w:p>
-        </w:tc>
-      </w:tr>
-      <w:tr>
-        <w:tc>
-          <w:tcPr>
-            <w:tcW w:type="dxa" w:w="2484"/>
-          </w:tcPr>
-          <w:p>
-            <w:r>
-              <w:t>Always-on DC servo</w:t>
-            </w:r>
-          </w:p>
-        </w:tc>
-        <w:tc>
-          <w:tcPr>
-            <w:tcW w:type="dxa" w:w="2484"/>
-          </w:tcPr>
-          <w:p>
-            <w:r>
-              <w:t>Centers automatically. Easy to understand in control terms.</w:t>
-            </w:r>
-          </w:p>
-        </w:tc>
-        <w:tc>
-          <w:tcPr>
-            <w:tcW w:type="dxa" w:w="2484"/>
-          </w:tcPr>
-          <w:p>
-            <w:r>
-              <w:t>Suppresses vibrato and can fight intentional bends.</w:t>
-            </w:r>
-          </w:p>
-        </w:tc>
-        <w:tc>
-          <w:tcPr>
-            <w:tcW w:type="dxa" w:w="2484"/>
-          </w:tcPr>
-          <w:p>
-            <w:r>
-              <w:t>An always-awake correction loop mistakes motion for error.</w:t>
-            </w:r>
-          </w:p>
-        </w:tc>
-      </w:tr>
-      <w:tr>
-        <w:tc>
-          <w:tcPr>
-            <w:tcW w:type="dxa" w:w="2484"/>
-          </w:tcPr>
-          <w:p>
-            <w:r>
-              <w:t>Windowed DC servo</w:t>
-            </w:r>
-          </w:p>
-        </w:tc>
-        <w:tc>
-          <w:tcPr>
-            <w:tcW w:type="dxa" w:w="2484"/>
-          </w:tcPr>
-          <w:p>
-            <w:r>
-              <w:t>Protects large bends and corrects near center.</w:t>
-            </w:r>
-          </w:p>
-        </w:tc>
-        <w:tc>
-          <w:tcPr>
-            <w:tcW w:type="dxa" w:w="2484"/>
-          </w:tcPr>
-          <w:p>
-            <w:r>
-              <w:t>Needs more logic and can create startup-state concerns.</w:t>
-            </w:r>
-          </w:p>
-        </w:tc>
-        <w:tc>
-          <w:tcPr>
-            <w:tcW w:type="dxa" w:w="2484"/>
-          </w:tcPr>
-          <w:p>
-            <w:r>
-              <w:t>The hold idea is good, but the architecture is still somewhat heavy.</w:t>
-            </w:r>
-          </w:p>
-        </w:tc>
-      </w:tr>
-      <w:tr>
-        <w:tc>
-          <w:tcPr>
-            <w:tcW w:type="dxa" w:w="2484"/>
-          </w:tcPr>
-          <w:p>
-            <w:r>
-              <w:t>Diff plus integrator only</w:t>
-            </w:r>
-          </w:p>
-        </w:tc>
-        <w:tc>
-          <w:tcPr>
-            <w:tcW w:type="dxa" w:w="2484"/>
-          </w:tcPr>
-          <w:p>
-            <w:r>
-              <w:t>Excellent motion preservation. No startup trouble.</w:t>
-            </w:r>
-          </w:p>
-        </w:tc>
-        <w:tc>
-          <w:tcPr>
-            <w:tcW w:type="dxa" w:w="2484"/>
-          </w:tcPr>
-          <w:p>
-            <w:r>
-              <w:t>Preserves spring hysteresis instead of canceling it.</w:t>
-            </w:r>
-          </w:p>
-        </w:tc>
-        <w:tc>
-          <w:tcPr>
-            <w:tcW w:type="dxa" w:w="2484"/>
-          </w:tcPr>
-          <w:p>
-            <w:r>
-              <w:t>Separating motion from slow bias is the right instinct, but cleanup is still needed.</w:t>
-            </w:r>
-          </w:p>
-        </w:tc>
-      </w:tr>
-      <w:tr>
-        <w:tc>
-          <w:tcPr>
-            <w:tcW w:type="dxa" w:w="2484"/>
-          </w:tcPr>
-          <w:p>
-            <w:r>
-              <w:t>Final hybrid: diff + int + conditional bleed</w:t>
-            </w:r>
-          </w:p>
-        </w:tc>
-        <w:tc>
-          <w:tcPr>
-            <w:tcW w:type="dxa" w:w="2484"/>
-          </w:tcPr>
-          <w:p>
-            <w:r>
-              <w:t>Preserves gesture, cleans residual hysteresis, avoids startup and drift problems.</w:t>
-            </w:r>
-          </w:p>
-        </w:tc>
-        <w:tc>
-          <w:tcPr>
-            <w:tcW w:type="dxa" w:w="2484"/>
-          </w:tcPr>
-          <w:p>
-            <w:r>
-              <w:t>Requires one extra conditional path and some tuning.</w:t>
-            </w:r>
-          </w:p>
-        </w:tc>
-        <w:tc>
-          <w:tcPr>
-            <w:tcW w:type="dxa" w:w="2484"/>
-          </w:tcPr>
-          <w:p>
-            <w:r>
-              <w:t>The best solution separates musical motion from housekeeping.</w:t>
-            </w:r>
-          </w:p>
-        </w:tc>
-      </w:tr>
-    </w:tbl>
-    <w:p>
-      <w:pPr/>
-      <w:r/>
-    </w:p>
-    <w:p>
-      <w:pPr/>
-      <w:r/>
-    </w:p>
-    <w:p>
-      <w:pPr/>
-      <w:r/>
-    </w:p>
-    <w:p>
-      <w:pPr>
-        <w:pStyle w:val="Heading1"/>
-      </w:pPr>
-      <w:r>
-        <w:t>9. Final Outcome</w:t>
-      </w:r>
-    </w:p>
-    <w:p>
-      <w:pPr/>
-      <w:r>
-        <w:t>The final simulations support the following conclusions:</w:t>
-      </w:r>
-    </w:p>
-    <w:p>
-      <w:pPr>
-        <w:jc w:val="center"/>
-      </w:pPr>
-      <w:r>
-        <w:drawing>
-          <wp:inline xmlns:a="http://schemas.openxmlformats.org/drawingml/2006/main" xmlns:pic="http://schemas.openxmlformats.org/drawingml/2006/picture">
-            <wp:extent cx="5852160" cy="3363372"/>
-            <wp:docPr id="3" name="Picture 3"/>
-            <wp:cNvGraphicFramePr>
-              <a:graphicFrameLocks noChangeAspect="1"/>
-            </wp:cNvGraphicFramePr>
-            <a:graphic>
-              <a:graphicData uri="http://schemas.openxmlformats.org/drawingml/2006/picture">
-                <pic:pic>
-                  <pic:nvPicPr>
-                    <pic:cNvPr id="0" name="C94CB94F-7DF7-42A2-93F1-A2F10336E47C.png"/>
-                    <pic:cNvPicPr/>
-                  </pic:nvPicPr>
-                  <pic:blipFill>
-                    <a:blip r:embed="rId11"/>
-                    <a:stretch>
-                      <a:fillRect/>
-                    </a:stretch>
-                  </pic:blipFill>
-                  <pic:spPr>
-                    <a:xfrm>
-                      <a:off x="0" y="0"/>
-                      <a:ext cx="5852160" cy="3363372"/>
-                    </a:xfrm>
-                    <a:prstGeom prst="rect"/>
-                  </pic:spPr>
-                </pic:pic>
-              </a:graphicData>
-            </a:graphic>
-          </wp:inline>
-        </w:drawing>
-      </w:r>
-    </w:p>
-    <w:p>
-      <w:pPr>
-        <w:jc w:val="center"/>
-      </w:pPr>
-      <w:r>
-        <w:rPr>
-          <w:i/>
-        </w:rPr>
-        <w:t>Figure 3. Representative transient response of the final topology. The raw sensor input (red) is reconstructed as a centered output (blue), and the conditional reset/bleed removes the residual post-bend error without flattening the vibrato.</w:t>
+        <w:t>Measure real up-release and down-release distributions after mechanical assembly tolerances are included.</w:t>
       </w:r>
     </w:p>
     <w:p>
@@ -1277,76 +2615,36 @@
         <w:pStyle w:val="ListBullet"/>
       </w:pPr>
       <w:r>
-        <w:t>Startup behavior is clean. No special delayed-enable trick is needed.</w:t>
+        <w:t>Confirm that the narrow +/-94 mV window is still acceptable across VREF tolerance and gain tolerance.</w:t>
       </w:r>
     </w:p>
-    <w:p>
-      <w:pPr>
-        <w:pStyle w:val="ListBullet"/>
-      </w:pPr>
-      <w:r>
-        <w:t>Long-term drift is controlled without making the integrator permanently leaky.</w:t>
-      </w:r>
-    </w:p>
-    <w:p>
-      <w:pPr>
-        <w:pStyle w:val="ListBullet"/>
-      </w:pPr>
-      <w:r>
-        <w:t>Residual center error after a large bend is cleaned up in a controlled way.</w:t>
-      </w:r>
-    </w:p>
-    <w:p>
-      <w:pPr>
-        <w:pStyle w:val="ListBullet"/>
-      </w:pPr>
-      <w:r>
-        <w:t>With the chosen values, cleanup occurs on the order of about half a second.</w:t>
-      </w:r>
-    </w:p>
-    <w:p>
-      <w:r>
-        <w:t>Vibrato is effectively preserved when the overall gain is set correctly. In the final tuning, the output vibrato reached about 198 mV peak-to-peak, essentially the full expected amplitude.</w:t>
-      </w:r>
-    </w:p>
-    <w:p>
-      <w:r>
-        <w:t>The final topology is simpler in feel than the deadband family and less intrusive than the always-on servo family.</w:t>
-      </w:r>
-    </w:p>
-    <w:p>
-      <w:pPr>
-        <w:pStyle w:val="Heading1"/>
-      </w:pPr>
-      <w:r>
-        <w:t>10. Closing Reflection</w:t>
-      </w:r>
-    </w:p>
-    <w:p>
-      <w:r>
-        <w:t>This design journey is a good example of how engineering progress often works. Early designs were not wrong. They were incomplete. Each one solved a real part of the problem and exposed the next missing piece. The deadband designs taught what center stability requires. The high-pass bypass showed how vibrato can be saved. The DC servo taught what happens when error correction is always awake. The differentiator-plus-integrator path revealed how motion can be preserved naturally. The final conditional bleed completed the picture by handling the one thing the motion path should not be asked to handle forever: residual center error after a large bend.</w:t>
-      </w:r>
-    </w:p>
-    <w:p>
-      <w:r>
-        <w:t>The resulting topology is satisfying because it does not feel like a bag of patches. It feels like a system whose parts each do one job well. That is usually a strong sign that the design has finally found the right shape.</w:t>
-      </w:r>
-    </w:p>
-    <w:p/>
-    <w:p/>
-    <w:p/>
-    <w:p/>
-    <w:p/>
-    <w:p/>
-    <w:p/>
     <w:sectPr>
+      <w:footerReference w:type="default" r:id="rId10"/>
       <w:pgSz w:w="12240" w:h="15840"/>
-      <w:pgMar w:top="1152" w:right="1224" w:bottom="1152" w:left="1224" w:header="720" w:footer="720" w:gutter="0"/>
+      <w:pgMar w:top="1080" w:right="1224" w:bottom="1080" w:left="1224" w:header="720" w:footer="720" w:gutter="0"/>
       <w:cols w:space="720"/>
       <w:docGrid w:linePitch="360"/>
     </w:sectPr>
   </w:body>
 </w:document>
+</file>
+
+<file path=word/footer1.xml><?xml version="1.0" encoding="utf-8"?>
+<w:ftr xmlns:m="http://schemas.openxmlformats.org/officeDocument/2006/math" xmlns:mc="http://schemas.openxmlformats.org/markup-compatibility/2006" xmlns:mo="http://schemas.microsoft.com/office/mac/office/2008/main" xmlns:mv="urn:schemas-microsoft-com:mac:vml" xmlns:o="urn:schemas-microsoft-com:office:office" xmlns:r="http://schemas.openxmlformats.org/officeDocument/2006/relationships" xmlns:v="urn:schemas-microsoft-com:vml" xmlns:w10="urn:schemas-microsoft-com:office:word" xmlns:w14="http://schemas.microsoft.com/office/word/2010/wordml" xmlns:w="http://schemas.openxmlformats.org/wordprocessingml/2006/main" xmlns:wne="http://schemas.microsoft.com/office/word/2006/wordml" xmlns:wp14="http://schemas.microsoft.com/office/word/2010/wordprocessingDrawing" xmlns:wp="http://schemas.openxmlformats.org/drawingml/2006/wordprocessingDrawing" xmlns:wpc="http://schemas.microsoft.com/office/word/2010/wordprocessingCanvas" xmlns:wpg="http://schemas.microsoft.com/office/word/2010/wordprocessingGroup" xmlns:wpi="http://schemas.microsoft.com/office/word/2010/wordprocessingInk" xmlns:wps="http://schemas.microsoft.com/office/word/2010/wordprocessingShape" mc:Ignorable="w14 wp14">
+  <w:p>
+    <w:pPr>
+      <w:pStyle w:val="Footer"/>
+      <w:jc w:val="center"/>
+    </w:pPr>
+    <w:r>
+      <w:rPr>
+        <w:color w:val="787878"/>
+        <w:sz w:val="16"/>
+      </w:rPr>
+      <w:t>eWhammy current final simulation summary - May 17, 2026</w:t>
+    </w:r>
+  </w:p>
+</w:ftr>
 </file>
 
 <file path=word/numbering.xml><?xml version="1.0" encoding="utf-8"?>
@@ -1713,10 +3011,10 @@
     <w:qFormat/>
     <w:rsid w:val="00FC693F"/>
     <w:pPr>
-      <w:spacing w:after="120"/>
+      <w:spacing w:after="100" w:line="269" w:lineRule="auto"/>
     </w:pPr>
     <w:rPr>
-      <w:rFonts w:ascii="Aptos" w:hAnsi="Aptos"/>
+      <w:rFonts w:ascii="Calibri" w:hAnsi="Calibri" w:eastAsia="Calibri"/>
       <w:sz w:val="21"/>
     </w:rPr>
   </w:style>
@@ -1775,15 +3073,15 @@
     <w:pPr>
       <w:keepNext/>
       <w:keepLines/>
-      <w:spacing w:before="480" w:after="0"/>
+      <w:spacing w:before="280" w:after="120"/>
       <w:outlineLvl w:val="0"/>
     </w:pPr>
     <w:rPr>
-      <w:rFonts w:asciiTheme="majorHAnsi" w:eastAsiaTheme="majorEastAsia" w:hAnsiTheme="majorHAnsi" w:cstheme="majorBidi" w:ascii="Aptos" w:hAnsi="Aptos"/>
+      <w:rFonts w:asciiTheme="majorHAnsi" w:eastAsiaTheme="majorEastAsia" w:hAnsiTheme="majorHAnsi" w:cstheme="majorBidi" w:ascii="Calibri" w:hAnsi="Calibri" w:eastAsia="Calibri"/>
       <w:b/>
       <w:bCs/>
-      <w:color w:val="365F91" w:themeColor="accent1" w:themeShade="BF"/>
-      <w:sz w:val="28"/>
+      <w:color w:val="2E74B5"/>
+      <w:sz w:val="30"/>
       <w:szCs w:val="28"/>
     </w:rPr>
   </w:style>
@@ -1799,14 +3097,14 @@
     <w:pPr>
       <w:keepNext/>
       <w:keepLines/>
-      <w:spacing w:before="200" w:after="0"/>
+      <w:spacing w:before="160" w:after="80"/>
       <w:outlineLvl w:val="1"/>
     </w:pPr>
     <w:rPr>
-      <w:rFonts w:asciiTheme="majorHAnsi" w:eastAsiaTheme="majorEastAsia" w:hAnsiTheme="majorHAnsi" w:cstheme="majorBidi" w:ascii="Aptos" w:hAnsi="Aptos"/>
+      <w:rFonts w:asciiTheme="majorHAnsi" w:eastAsiaTheme="majorEastAsia" w:hAnsiTheme="majorHAnsi" w:cstheme="majorBidi" w:ascii="Calibri" w:hAnsi="Calibri" w:eastAsia="Calibri"/>
       <w:b/>
       <w:bCs/>
-      <w:color w:val="4F81BD" w:themeColor="accent1"/>
+      <w:color w:val="1F4D78"/>
       <w:sz w:val="24"/>
       <w:szCs w:val="26"/>
     </w:rPr>
@@ -1827,11 +3125,10 @@
       <w:outlineLvl w:val="2"/>
     </w:pPr>
     <w:rPr>
-      <w:rFonts w:asciiTheme="majorHAnsi" w:eastAsiaTheme="majorEastAsia" w:hAnsiTheme="majorHAnsi" w:cstheme="majorBidi" w:ascii="Aptos" w:hAnsi="Aptos"/>
+      <w:rFonts w:asciiTheme="majorHAnsi" w:eastAsiaTheme="majorEastAsia" w:hAnsiTheme="majorHAnsi" w:cstheme="majorBidi"/>
       <w:b/>
       <w:bCs/>
       <w:color w:val="4F81BD" w:themeColor="accent1"/>
-      <w:sz w:val="22"/>
     </w:rPr>
   </w:style>
   <w:style w:type="paragraph" w:styleId="Heading4">
@@ -2065,15 +3362,15 @@
       <w:pBdr>
         <w:bottom w:val="single" w:sz="8" w:space="4" w:color="4F81BD" w:themeColor="accent1"/>
       </w:pBdr>
-      <w:spacing w:after="300" w:line="240" w:lineRule="auto"/>
+      <w:spacing w:after="120" w:line="240" w:lineRule="auto" w:before="0"/>
       <w:contextualSpacing/>
     </w:pPr>
     <w:rPr>
-      <w:rFonts w:asciiTheme="majorHAnsi" w:eastAsiaTheme="majorEastAsia" w:hAnsiTheme="majorHAnsi" w:cstheme="majorBidi" w:ascii="Aptos" w:hAnsi="Aptos"/>
-      <w:color w:val="17365D" w:themeColor="text2" w:themeShade="BF"/>
+      <w:rFonts w:asciiTheme="majorHAnsi" w:eastAsiaTheme="majorEastAsia" w:hAnsiTheme="majorHAnsi" w:cstheme="majorBidi" w:ascii="Calibri" w:hAnsi="Calibri" w:eastAsia="Calibri"/>
+      <w:color w:val="0B2545"/>
       <w:spacing w:val="5"/>
       <w:kern w:val="28"/>
-      <w:sz w:val="40"/>
+      <w:sz w:val="44"/>
       <w:szCs w:val="52"/>
     </w:rPr>
   </w:style>
@@ -2104,14 +3401,15 @@
       <w:numPr>
         <w:ilvl w:val="1"/>
       </w:numPr>
+      <w:spacing w:before="0" w:after="240"/>
     </w:pPr>
     <w:rPr>
-      <w:rFonts w:asciiTheme="majorHAnsi" w:eastAsiaTheme="majorEastAsia" w:hAnsiTheme="majorHAnsi" w:cstheme="majorBidi"/>
+      <w:rFonts w:asciiTheme="majorHAnsi" w:eastAsiaTheme="majorEastAsia" w:hAnsiTheme="majorHAnsi" w:cstheme="majorBidi" w:ascii="Calibri" w:hAnsi="Calibri" w:eastAsia="Calibri"/>
       <w:i/>
       <w:iCs/>
-      <w:color w:val="4F81BD" w:themeColor="accent1"/>
+      <w:color w:val="555555"/>
       <w:spacing w:val="15"/>
-      <w:sz w:val="24"/>
+      <w:sz w:val="22"/>
       <w:szCs w:val="24"/>
     </w:rPr>
   </w:style>

</xml_diff>

<commit_message>
Update e-whammy final simulation notes
</commit_message>
<xml_diff>
--- a/e_whammy/spice/ewhammy_final_simulation_summary.docx
+++ b/e_whammy/spice/ewhammy_final_simulation_summary.docx
@@ -37,12 +37,12 @@
     </w:p>
     <w:p>
       <w:r>
-        <w:t>The current best design is no longer the older differentiator-plus-integrator cleanup topology. That document remains useful history, but the present simulation has converged on a windowed servo architecture with three key changes: a narrow musical window, a moving threshold center derived from a low-pass filtered version of OUT, and a startup reset that forces HOLD low while the circuit acquires center.</w:t>
+        <w:t>The current design is a windowed servo architecture with a narrow moving center window, a startup reset that forces HOLD low during power-up, and a deliberately limited pitch range of +/-12 semitones. The smaller musical range makes one semitone large enough to escape the reset window, while the moving window still captures mechanical return offsets after large bends.</w:t>
       </w:r>
     </w:p>
     <w:p>
       <w:r>
-        <w:t>The important result is that the window can stay narrow, about +/-94 mV at OUT, while still catching both upward and downward releases. That avoids the earlier temptation to widen the fixed window to roughly +/-192 mV, which worked electrically but was too broad musically.</w:t>
+        <w:t>The latest simulation, plot14.csv, shows the intended behavior: the +/-1 semitone holds are outside the window with HOLD asserted, releases return inside the window, and vibrato remains largely expressive because the reset dynamics are slow relative to the vibrato frequency.</w:t>
       </w:r>
     </w:p>
     <w:p>
@@ -55,7 +55,7 @@
     </w:p>
     <w:p>
       <w:r>
-        <w:t>The renamed historical document records the previous line of investigation: deadband behavior, high-pass bypasses, always-on correction, and finally a differentiator/integrator signal path with conditional bleed. The present design keeps the servo/HOLD idea and solves the release asymmetry with a moving window center instead of a wider fixed window.</w:t>
+        <w:t>The renamed historical document records the previous line of investigation: deadband behavior, high-pass bypasses, always-on correction, and a differentiator/integrator signal path with conditional bleed. The present design keeps the servo/HOLD idea and solves the release asymmetry with a moving window center instead of a wider fixed window.</w:t>
       </w:r>
     </w:p>
     <w:tbl>
@@ -142,7 +142,7 @@
               <w:rPr>
                 <w:b w:val="0"/>
               </w:rPr>
-              <w:t>Historical summary of the differentiator/integrator exploration and why it was attractive.</w:t>
+              <w:t>Historical summary of the differentiator/integrator exploration.</w:t>
             </w:r>
           </w:p>
         </w:tc>
@@ -196,17 +196,17 @@
         <w:pStyle w:val="Heading1"/>
       </w:pPr>
       <w:r>
-        <w:t>Problem That Drove The Latest Revision</w:t>
+        <w:t>Problem And Scaling</w:t>
       </w:r>
     </w:p>
     <w:p>
       <w:r>
-        <w:t>The raw Hall sensor model is symmetric in gesture size, but it includes spring-steel hysteresis at release. The natural center is 2.1750 V in the raw sensor domain. After an upward release the model returns to 2.1825 V; after a downward release it returns to 2.1675 V. That is only 15 mV of separation at the sensor, but the signal path gain makes it about 150 mV at OUT.</w:t>
+        <w:t>The raw Hall sensor model includes spring-steel hysteresis at release. The natural center is 2.1750 V in the raw sensor domain. After an upward release the model returns to 2.1825 V; after a downward release it returns to 2.1675 V. That 15 mV sensor-domain separation becomes about 150 mV at OUT because of the high-gain output path.</w:t>
       </w:r>
     </w:p>
     <w:p>
       <w:r>
-        <w:t>A fixed +/-100 mV window therefore misses the downward release in the realistic sequence, especially because the upward release has not completely settled before the downward bend begins. Widening the fixed window catches it, but that makes the reset region too musically large.</w:t>
+        <w:t>The pitch range is now intentionally limited to +/-12 semitones. With a 5 V output span, one semitone is 208.33 mV at OUT, or 20.8333 mV in the raw SENSOR domain. This keeps a one-semitone musical hold clearly outside the roughly +/-94 mV reset window.</w:t>
       </w:r>
     </w:p>
     <w:tbl>
@@ -224,7 +224,7 @@
       <w:tr>
         <w:tc>
           <w:tcPr>
-            <w:tcW w:type="dxa" w:w="3312"/>
+            <w:tcW w:type="dxa" w:w="2880"/>
             <w:vAlign w:val="center"/>
             <w:shd w:fill="E8EEF5"/>
           </w:tcPr>
@@ -237,13 +237,13 @@
               <w:rPr>
                 <w:b/>
               </w:rPr>
-              <w:t>Raw sensor condition</w:t>
+              <w:t>Quantity</w:t>
             </w:r>
           </w:p>
         </w:tc>
         <w:tc>
           <w:tcPr>
-            <w:tcW w:type="dxa" w:w="2016"/>
+            <w:tcW w:type="dxa" w:w="2232"/>
             <w:vAlign w:val="center"/>
             <w:shd w:fill="E8EEF5"/>
           </w:tcPr>
@@ -256,13 +256,13 @@
               <w:rPr>
                 <w:b/>
               </w:rPr>
-              <w:t>Sensor voltage</w:t>
+              <w:t>Value</w:t>
             </w:r>
           </w:p>
         </w:tc>
         <w:tc>
           <w:tcPr>
-            <w:tcW w:type="dxa" w:w="4320"/>
+            <w:tcW w:type="dxa" w:w="4536"/>
             <w:vAlign w:val="center"/>
             <w:shd w:fill="E8EEF5"/>
           </w:tcPr>
@@ -275,7 +275,7 @@
               <w:rPr>
                 <w:b/>
               </w:rPr>
-              <w:t>Effect at OUT</w:t>
+              <w:t>Meaning</w:t>
             </w:r>
           </w:p>
         </w:tc>
@@ -283,7 +283,7 @@
       <w:tr>
         <w:tc>
           <w:tcPr>
-            <w:tcW w:type="dxa" w:w="3312"/>
+            <w:tcW w:type="dxa" w:w="2880"/>
             <w:vAlign w:val="center"/>
           </w:tcPr>
           <w:p>
@@ -295,13 +295,13 @@
               <w:rPr>
                 <w:b w:val="0"/>
               </w:rPr>
-              <w:t>Natural center</w:t>
+              <w:t>Output pitch range</w:t>
             </w:r>
           </w:p>
         </w:tc>
         <w:tc>
           <w:tcPr>
-            <w:tcW w:type="dxa" w:w="2016"/>
+            <w:tcW w:type="dxa" w:w="2232"/>
             <w:vAlign w:val="center"/>
           </w:tcPr>
           <w:p>
@@ -313,13 +313,13 @@
               <w:rPr>
                 <w:b w:val="0"/>
               </w:rPr>
-              <w:t>2.1750 V</w:t>
+              <w:t>+/-12 semitones</w:t>
             </w:r>
           </w:p>
         </w:tc>
         <w:tc>
           <w:tcPr>
-            <w:tcW w:type="dxa" w:w="4320"/>
+            <w:tcW w:type="dxa" w:w="4536"/>
             <w:vAlign w:val="center"/>
           </w:tcPr>
           <w:p>
@@ -331,7 +331,7 @@
               <w:rPr>
                 <w:b w:val="0"/>
               </w:rPr>
-              <w:t>Nominal 2.5 V center after servo correction</w:t>
+              <w:t>24 semitones across 5 V</w:t>
             </w:r>
           </w:p>
         </w:tc>
@@ -339,7 +339,7 @@
       <w:tr>
         <w:tc>
           <w:tcPr>
-            <w:tcW w:type="dxa" w:w="3312"/>
+            <w:tcW w:type="dxa" w:w="2880"/>
             <w:vAlign w:val="center"/>
           </w:tcPr>
           <w:p>
@@ -351,13 +351,13 @@
               <w:rPr>
                 <w:b w:val="0"/>
               </w:rPr>
-              <w:t>After upward release</w:t>
+              <w:t>One semitone at OUT</w:t>
             </w:r>
           </w:p>
         </w:tc>
         <w:tc>
           <w:tcPr>
-            <w:tcW w:type="dxa" w:w="2016"/>
+            <w:tcW w:type="dxa" w:w="2232"/>
             <w:vAlign w:val="center"/>
           </w:tcPr>
           <w:p>
@@ -369,13 +369,13 @@
               <w:rPr>
                 <w:b w:val="0"/>
               </w:rPr>
-              <w:t>2.1825 V</w:t>
+              <w:t>208.33 mV</w:t>
             </w:r>
           </w:p>
         </w:tc>
         <w:tc>
           <w:tcPr>
-            <w:tcW w:type="dxa" w:w="4320"/>
+            <w:tcW w:type="dxa" w:w="4536"/>
             <w:vAlign w:val="center"/>
           </w:tcPr>
           <w:p>
@@ -387,7 +387,7 @@
               <w:rPr>
                 <w:b w:val="0"/>
               </w:rPr>
-              <w:t>+7.5 mV sensor bias, about +75 mV at OUT</w:t>
+              <w:t>Large enough to escape the reset window</w:t>
             </w:r>
           </w:p>
         </w:tc>
@@ -395,7 +395,7 @@
       <w:tr>
         <w:tc>
           <w:tcPr>
-            <w:tcW w:type="dxa" w:w="3312"/>
+            <w:tcW w:type="dxa" w:w="2880"/>
             <w:vAlign w:val="center"/>
           </w:tcPr>
           <w:p>
@@ -407,13 +407,13 @@
               <w:rPr>
                 <w:b w:val="0"/>
               </w:rPr>
-              <w:t>After downward release</w:t>
+              <w:t>One semitone at SENSOR</w:t>
             </w:r>
           </w:p>
         </w:tc>
         <w:tc>
           <w:tcPr>
-            <w:tcW w:type="dxa" w:w="2016"/>
+            <w:tcW w:type="dxa" w:w="2232"/>
             <w:vAlign w:val="center"/>
           </w:tcPr>
           <w:p>
@@ -425,13 +425,13 @@
               <w:rPr>
                 <w:b w:val="0"/>
               </w:rPr>
-              <w:t>2.1675 V</w:t>
+              <w:t>20.8333 mV</w:t>
             </w:r>
           </w:p>
         </w:tc>
         <w:tc>
           <w:tcPr>
-            <w:tcW w:type="dxa" w:w="4320"/>
+            <w:tcW w:type="dxa" w:w="4536"/>
             <w:vAlign w:val="center"/>
           </w:tcPr>
           <w:p>
@@ -443,7 +443,7 @@
               <w:rPr>
                 <w:b w:val="0"/>
               </w:rPr>
-              <w:t>-7.5 mV sensor bias, about -75 mV at OUT</w:t>
+              <w:t>Used by the inserted semitone tests</w:t>
             </w:r>
           </w:p>
         </w:tc>
@@ -451,7 +451,7 @@
       <w:tr>
         <w:tc>
           <w:tcPr>
-            <w:tcW w:type="dxa" w:w="3312"/>
+            <w:tcW w:type="dxa" w:w="2880"/>
             <w:vAlign w:val="center"/>
           </w:tcPr>
           <w:p>
@@ -463,13 +463,13 @@
               <w:rPr>
                 <w:b w:val="0"/>
               </w:rPr>
-              <w:t>Up/down release separation</w:t>
+              <w:t>Moving-window half-width</w:t>
             </w:r>
           </w:p>
         </w:tc>
         <w:tc>
           <w:tcPr>
-            <w:tcW w:type="dxa" w:w="2016"/>
+            <w:tcW w:type="dxa" w:w="2232"/>
             <w:vAlign w:val="center"/>
           </w:tcPr>
           <w:p>
@@ -481,13 +481,69 @@
               <w:rPr>
                 <w:b w:val="0"/>
               </w:rPr>
-              <w:t>15 mV</w:t>
+              <w:t>94.226 mV mean</w:t>
             </w:r>
           </w:p>
         </w:tc>
         <w:tc>
           <w:tcPr>
-            <w:tcW w:type="dxa" w:w="4320"/>
+            <w:tcW w:type="dxa" w:w="4536"/>
+            <w:vAlign w:val="center"/>
+          </w:tcPr>
+          <w:p>
+            <w:pPr>
+              <w:spacing w:after="0"/>
+            </w:pPr>
+            <w:r/>
+            <w:r>
+              <w:rPr>
+                <w:b w:val="0"/>
+              </w:rPr>
+              <w:t>About 45 cents under the +/-12 semitone mapping</w:t>
+            </w:r>
+          </w:p>
+        </w:tc>
+      </w:tr>
+      <w:tr>
+        <w:tc>
+          <w:tcPr>
+            <w:tcW w:type="dxa" w:w="2880"/>
+            <w:vAlign w:val="center"/>
+          </w:tcPr>
+          <w:p>
+            <w:pPr>
+              <w:spacing w:after="0"/>
+            </w:pPr>
+            <w:r/>
+            <w:r>
+              <w:rPr>
+                <w:b w:val="0"/>
+              </w:rPr>
+              <w:t>Spring release separation</w:t>
+            </w:r>
+          </w:p>
+        </w:tc>
+        <w:tc>
+          <w:tcPr>
+            <w:tcW w:type="dxa" w:w="2232"/>
+            <w:vAlign w:val="center"/>
+          </w:tcPr>
+          <w:p>
+            <w:pPr>
+              <w:spacing w:after="0"/>
+            </w:pPr>
+            <w:r/>
+            <w:r>
+              <w:rPr>
+                <w:b w:val="0"/>
+              </w:rPr>
+              <w:t>15 mV at SENSOR</w:t>
+            </w:r>
+          </w:p>
+        </w:tc>
+        <w:tc>
+          <w:tcPr>
+            <w:tcW w:type="dxa" w:w="4536"/>
             <w:vAlign w:val="center"/>
           </w:tcPr>
           <w:p>
@@ -515,17 +571,35 @@
         <w:pStyle w:val="Heading1"/>
       </w:pPr>
       <w:r>
+        <w:t>Startup Movement Stress Test</w:t>
+      </w:r>
+    </w:p>
+    <w:p>
+      <w:r>
+        <w:t>The initial triangular-looking motion near the beginning of the plot is intentional. It is not a power-on artifact. The SENSOR model deliberately exercises motion while the startup reset is active: 0.00-0.20 s ramps from 0 V to the 2.175 V baseline; 0.20-0.35 s holds baseline; 0.35-0.45 s ramps up to 2.275 V; 0.45-0.55 s ramps down to 2.025 V; and 0.55-0.65 s returns to 2.175 V.</w:t>
+      </w:r>
+    </w:p>
+    <w:p>
+      <w:r>
+        <w:t>This startup movement test verifies that the forced-reset/acquisition interval does not leave the servo in a bad state when the player moves the bar immediately after power-up. The circuit should settle back near center before the later large-bend and semitone-hold tests begin.</w:t>
+      </w:r>
+    </w:p>
+    <w:p>
+      <w:pPr>
+        <w:pStyle w:val="Heading1"/>
+      </w:pPr>
+      <w:r>
         <w:t>Current Architecture</w:t>
       </w:r>
     </w:p>
     <w:p>
       <w:r>
-        <w:t>The current circuit keeps a normal servo correction path, but uses HOLD to decide when the servo is allowed to track. HOLD is asserted outside the accepted center region and released inside it. The startup circuit deliberately forces HOLD low at power-up so the servo can acquire the correct center instead of being frozen in the wrong state.</w:t>
+        <w:t>The circuit uses HOLD to decide when the servo correction path may track. HOLD is asserted outside the accepted center region and released inside it. A startup reset circuit forces HOLD low during power-up so the servo can acquire center before normal motion begins.</w:t>
       </w:r>
     </w:p>
     <w:p>
       <w:r>
-        <w:t>The center-window discriminator now uses a moving center. WH and WL are still separated by a narrow fixed width, but their midpoint follows a low-pass filtered version of OUT. Slow positive and negative return offsets are therefore tracked by the discriminator, while the actual reset window remains narrow enough to avoid fighting intentional one-semitone holds.</w:t>
+        <w:t>The discriminator window has a moving center. WH and WL retain a narrow fixed separation, while their midpoint follows a low-pass filtered version of OUT. Slow return offsets are therefore accepted without permanently widening the near-center reset window.</w:t>
       </w:r>
     </w:p>
     <w:tbl>
@@ -562,7 +636,7 @@
         </w:tc>
         <w:tc>
           <w:tcPr>
-            <w:tcW w:type="dxa" w:w="2808"/>
+            <w:tcW w:type="dxa" w:w="3096"/>
             <w:vAlign w:val="center"/>
             <w:shd w:fill="E8EEF5"/>
           </w:tcPr>
@@ -581,7 +655,7 @@
         </w:tc>
         <w:tc>
           <w:tcPr>
-            <w:tcW w:type="dxa" w:w="4608"/>
+            <w:tcW w:type="dxa" w:w="4320"/>
             <w:vAlign w:val="center"/>
             <w:shd w:fill="E8EEF5"/>
           </w:tcPr>
@@ -620,7 +694,7 @@
         </w:tc>
         <w:tc>
           <w:tcPr>
-            <w:tcW w:type="dxa" w:w="2808"/>
+            <w:tcW w:type="dxa" w:w="3096"/>
             <w:vAlign w:val="center"/>
           </w:tcPr>
           <w:p>
@@ -638,7 +712,7 @@
         </w:tc>
         <w:tc>
           <w:tcPr>
-            <w:tcW w:type="dxa" w:w="4608"/>
+            <w:tcW w:type="dxa" w:w="4320"/>
             <w:vAlign w:val="center"/>
           </w:tcPr>
           <w:p>
@@ -676,7 +750,7 @@
         </w:tc>
         <w:tc>
           <w:tcPr>
-            <w:tcW w:type="dxa" w:w="2808"/>
+            <w:tcW w:type="dxa" w:w="3096"/>
             <w:vAlign w:val="center"/>
           </w:tcPr>
           <w:p>
@@ -694,7 +768,7 @@
         </w:tc>
         <w:tc>
           <w:tcPr>
-            <w:tcW w:type="dxa" w:w="4608"/>
+            <w:tcW w:type="dxa" w:w="4320"/>
             <w:vAlign w:val="center"/>
           </w:tcPr>
           <w:p>
@@ -726,13 +800,13 @@
               <w:rPr>
                 <w:b w:val="0"/>
               </w:rPr>
-              <w:t>Integrator</w:t>
+              <w:t>Integrator and leak</w:t>
             </w:r>
           </w:p>
         </w:tc>
         <w:tc>
           <w:tcPr>
-            <w:tcW w:type="dxa" w:w="2808"/>
+            <w:tcW w:type="dxa" w:w="3096"/>
             <w:vAlign w:val="center"/>
           </w:tcPr>
           <w:p>
@@ -744,13 +818,13 @@
               <w:rPr>
                 <w:b w:val="0"/>
               </w:rPr>
-              <w:t>R9 = 100k, C1 = 10uF</w:t>
+              <w:t>R9 = 100k, C1 = 10uF; leak T-network R10 = 100k, R13 = 100k, R18 = 499R</w:t>
             </w:r>
           </w:p>
         </w:tc>
         <w:tc>
           <w:tcPr>
-            <w:tcW w:type="dxa" w:w="4608"/>
+            <w:tcW w:type="dxa" w:w="4320"/>
             <w:vAlign w:val="center"/>
           </w:tcPr>
           <w:p>
@@ -762,7 +836,7 @@
               <w:rPr>
                 <w:b w:val="0"/>
               </w:rPr>
-              <w:t>Stores the servo correction OFFS. The leak path was removed for the current simulation.</w:t>
+              <w:t>Stores OFFS while providing about 20.24 Mohm effective leakage, roughly doubling the earlier leak time.</w:t>
             </w:r>
           </w:p>
         </w:tc>
@@ -788,7 +862,7 @@
         </w:tc>
         <w:tc>
           <w:tcPr>
-            <w:tcW w:type="dxa" w:w="2808"/>
+            <w:tcW w:type="dxa" w:w="3096"/>
             <w:vAlign w:val="center"/>
           </w:tcPr>
           <w:p>
@@ -806,7 +880,7 @@
         </w:tc>
         <w:tc>
           <w:tcPr>
-            <w:tcW w:type="dxa" w:w="4608"/>
+            <w:tcW w:type="dxa" w:w="4320"/>
             <w:vAlign w:val="center"/>
           </w:tcPr>
           <w:p>
@@ -844,7 +918,7 @@
         </w:tc>
         <w:tc>
           <w:tcPr>
-            <w:tcW w:type="dxa" w:w="2808"/>
+            <w:tcW w:type="dxa" w:w="3096"/>
             <w:vAlign w:val="center"/>
           </w:tcPr>
           <w:p>
@@ -862,7 +936,7 @@
         </w:tc>
         <w:tc>
           <w:tcPr>
-            <w:tcW w:type="dxa" w:w="4608"/>
+            <w:tcW w:type="dxa" w:w="4320"/>
             <w:vAlign w:val="center"/>
           </w:tcPr>
           <w:p>
@@ -874,7 +948,7 @@
               <w:rPr>
                 <w:b w:val="0"/>
               </w:rPr>
-              <w:t>Low-pass filters OUT and shifts WH/WL together without substantially changing window width.</w:t>
+              <w:t>Low-pass filters OUT and shifts WH/WL together.</w:t>
             </w:r>
           </w:p>
         </w:tc>
@@ -900,7 +974,7 @@
         </w:tc>
         <w:tc>
           <w:tcPr>
-            <w:tcW w:type="dxa" w:w="2808"/>
+            <w:tcW w:type="dxa" w:w="3096"/>
             <w:vAlign w:val="center"/>
           </w:tcPr>
           <w:p>
@@ -918,7 +992,7 @@
         </w:tc>
         <w:tc>
           <w:tcPr>
-            <w:tcW w:type="dxa" w:w="4608"/>
+            <w:tcW w:type="dxa" w:w="4320"/>
             <w:vAlign w:val="center"/>
           </w:tcPr>
           <w:p>
@@ -930,7 +1004,7 @@
               <w:rPr>
                 <w:b w:val="0"/>
               </w:rPr>
-              <w:t>Forces HOLD low at startup for roughly 1.5 s, allowing initial acquisition.</w:t>
+              <w:t>Forces HOLD low at startup for roughly 1.5 s.</w:t>
             </w:r>
           </w:p>
         </w:tc>
@@ -950,13 +1024,13 @@
               <w:rPr>
                 <w:b w:val="0"/>
               </w:rPr>
-              <w:t>HOLD logic</w:t>
+              <w:t>Supply simulation</w:t>
             </w:r>
           </w:p>
         </w:tc>
         <w:tc>
           <w:tcPr>
-            <w:tcW w:type="dxa" w:w="2808"/>
+            <w:tcW w:type="dxa" w:w="3096"/>
             <w:vAlign w:val="center"/>
           </w:tcPr>
           <w:p>
@@ -968,13 +1042,13 @@
               <w:rPr>
                 <w:b w:val="0"/>
               </w:rPr>
-              <w:t>Open-drain inverter stages and ADG779 switch</w:t>
+              <w:t>+5V and VREF pulses use tw=20, per=40</w:t>
             </w:r>
           </w:p>
         </w:tc>
         <w:tc>
           <w:tcPr>
-            <w:tcW w:type="dxa" w:w="4608"/>
+            <w:tcW w:type="dxa" w:w="4320"/>
             <w:vAlign w:val="center"/>
           </w:tcPr>
           <w:p>
@@ -986,344 +1060,7 @@
               <w:rPr>
                 <w:b w:val="0"/>
               </w:rPr>
-              <w:t>Holds or releases the servo path based on the window state. TOUCH is no longer needed.</w:t>
-            </w:r>
-          </w:p>
-        </w:tc>
-      </w:tr>
-    </w:tbl>
-    <w:p>
-      <w:pPr>
-        <w:spacing w:after="40"/>
-      </w:pPr>
-    </w:p>
-    <w:p>
-      <w:pPr>
-        <w:pStyle w:val="Heading1"/>
-      </w:pPr>
-      <w:r>
-        <w:t>Why The Moving Window Is Different From A Wider Window</w:t>
-      </w:r>
-    </w:p>
-    <w:p>
-      <w:r>
-        <w:t>A fixed wide window solved the symptom by accepting a larger center error. With a 20k center resistor the fixed window was about +/-192 mV, or about +/-1.85 semitones. That caught the release, but risked fighting a player who intentionally holds near one semitone above or below center.</w:t>
-      </w:r>
-    </w:p>
-    <w:p>
-      <w:r>
-        <w:t>The moving-window version keeps the half-width near +/-94.2 mV, about +/-0.90 semitones. The midpoint moves slowly with OUT, so release offsets are captured without making the reset aperture permanently broad.</w:t>
-      </w:r>
-    </w:p>
-    <w:tbl>
-      <w:tblPr>
-        <w:tblStyle w:val="TableGrid"/>
-        <w:tblW w:type="auto" w:w="0"/>
-        <w:jc w:val="center"/>
-        <w:tblLook w:firstColumn="1" w:firstRow="1" w:lastColumn="0" w:lastRow="0" w:noHBand="0" w:noVBand="1" w:val="04A0"/>
-      </w:tblPr>
-      <w:tblGrid>
-        <w:gridCol w:w="2448"/>
-        <w:gridCol w:w="2448"/>
-        <w:gridCol w:w="2448"/>
-        <w:gridCol w:w="2448"/>
-      </w:tblGrid>
-      <w:tr>
-        <w:tc>
-          <w:tcPr>
-            <w:tcW w:type="dxa" w:w="2376"/>
-            <w:vAlign w:val="center"/>
-            <w:shd w:fill="E8EEF5"/>
-          </w:tcPr>
-          <w:p>
-            <w:pPr>
-              <w:spacing w:after="0"/>
-            </w:pPr>
-            <w:r/>
-            <w:r>
-              <w:rPr>
-                <w:b/>
-              </w:rPr>
-              <w:t>Window scheme</w:t>
-            </w:r>
-          </w:p>
-        </w:tc>
-        <w:tc>
-          <w:tcPr>
-            <w:tcW w:type="dxa" w:w="1872"/>
-            <w:vAlign w:val="center"/>
-            <w:shd w:fill="E8EEF5"/>
-          </w:tcPr>
-          <w:p>
-            <w:pPr>
-              <w:spacing w:after="0"/>
-            </w:pPr>
-            <w:r/>
-            <w:r>
-              <w:rPr>
-                <w:b/>
-              </w:rPr>
-              <w:t>Half-width at OUT</w:t>
-            </w:r>
-          </w:p>
-        </w:tc>
-        <w:tc>
-          <w:tcPr>
-            <w:tcW w:type="dxa" w:w="1800"/>
-            <w:vAlign w:val="center"/>
-            <w:shd w:fill="E8EEF5"/>
-          </w:tcPr>
-          <w:p>
-            <w:pPr>
-              <w:spacing w:after="0"/>
-            </w:pPr>
-            <w:r/>
-            <w:r>
-              <w:rPr>
-                <w:b/>
-              </w:rPr>
-              <w:t>Approx. semitones</w:t>
-            </w:r>
-          </w:p>
-        </w:tc>
-        <w:tc>
-          <w:tcPr>
-            <w:tcW w:type="dxa" w:w="3600"/>
-            <w:vAlign w:val="center"/>
-            <w:shd w:fill="E8EEF5"/>
-          </w:tcPr>
-          <w:p>
-            <w:pPr>
-              <w:spacing w:after="0"/>
-            </w:pPr>
-            <w:r/>
-            <w:r>
-              <w:rPr>
-                <w:b/>
-              </w:rPr>
-              <w:t>Result</w:t>
-            </w:r>
-          </w:p>
-        </w:tc>
-      </w:tr>
-      <w:tr>
-        <w:tc>
-          <w:tcPr>
-            <w:tcW w:type="dxa" w:w="2376"/>
-            <w:vAlign w:val="center"/>
-          </w:tcPr>
-          <w:p>
-            <w:pPr>
-              <w:spacing w:after="0"/>
-            </w:pPr>
-            <w:r/>
-            <w:r>
-              <w:rPr>
-                <w:b w:val="0"/>
-              </w:rPr>
-              <w:t>Fixed narrow window</w:t>
-            </w:r>
-          </w:p>
-        </w:tc>
-        <w:tc>
-          <w:tcPr>
-            <w:tcW w:type="dxa" w:w="1872"/>
-            <w:vAlign w:val="center"/>
-          </w:tcPr>
-          <w:p>
-            <w:pPr>
-              <w:spacing w:after="0"/>
-            </w:pPr>
-            <w:r/>
-            <w:r>
-              <w:rPr>
-                <w:b w:val="0"/>
-              </w:rPr>
-              <w:t>+/-100 mV class</w:t>
-            </w:r>
-          </w:p>
-        </w:tc>
-        <w:tc>
-          <w:tcPr>
-            <w:tcW w:type="dxa" w:w="1800"/>
-            <w:vAlign w:val="center"/>
-          </w:tcPr>
-          <w:p>
-            <w:pPr>
-              <w:spacing w:after="0"/>
-            </w:pPr>
-            <w:r/>
-            <w:r>
-              <w:rPr>
-                <w:b w:val="0"/>
-              </w:rPr>
-              <w:t>About +/-0.96</w:t>
-            </w:r>
-          </w:p>
-        </w:tc>
-        <w:tc>
-          <w:tcPr>
-            <w:tcW w:type="dxa" w:w="3600"/>
-            <w:vAlign w:val="center"/>
-          </w:tcPr>
-          <w:p>
-            <w:pPr>
-              <w:spacing w:after="0"/>
-            </w:pPr>
-            <w:r/>
-            <w:r>
-              <w:rPr>
-                <w:b w:val="0"/>
-              </w:rPr>
-              <w:t>Musically right, but missed the downward release.</w:t>
-            </w:r>
-          </w:p>
-        </w:tc>
-      </w:tr>
-      <w:tr>
-        <w:tc>
-          <w:tcPr>
-            <w:tcW w:type="dxa" w:w="2376"/>
-            <w:vAlign w:val="center"/>
-          </w:tcPr>
-          <w:p>
-            <w:pPr>
-              <w:spacing w:after="0"/>
-            </w:pPr>
-            <w:r/>
-            <w:r>
-              <w:rPr>
-                <w:b w:val="0"/>
-              </w:rPr>
-              <w:t>Fixed wide window</w:t>
-            </w:r>
-          </w:p>
-        </w:tc>
-        <w:tc>
-          <w:tcPr>
-            <w:tcW w:type="dxa" w:w="1872"/>
-            <w:vAlign w:val="center"/>
-          </w:tcPr>
-          <w:p>
-            <w:pPr>
-              <w:spacing w:after="0"/>
-            </w:pPr>
-            <w:r/>
-            <w:r>
-              <w:rPr>
-                <w:b w:val="0"/>
-              </w:rPr>
-              <w:t>+/-192.3 mV</w:t>
-            </w:r>
-          </w:p>
-        </w:tc>
-        <w:tc>
-          <w:tcPr>
-            <w:tcW w:type="dxa" w:w="1800"/>
-            <w:vAlign w:val="center"/>
-          </w:tcPr>
-          <w:p>
-            <w:pPr>
-              <w:spacing w:after="0"/>
-            </w:pPr>
-            <w:r/>
-            <w:r>
-              <w:rPr>
-                <w:b w:val="0"/>
-              </w:rPr>
-              <w:t>About +/-1.85</w:t>
-            </w:r>
-          </w:p>
-        </w:tc>
-        <w:tc>
-          <w:tcPr>
-            <w:tcW w:type="dxa" w:w="3600"/>
-            <w:vAlign w:val="center"/>
-          </w:tcPr>
-          <w:p>
-            <w:pPr>
-              <w:spacing w:after="0"/>
-            </w:pPr>
-            <w:r/>
-            <w:r>
-              <w:rPr>
-                <w:b w:val="0"/>
-              </w:rPr>
-              <w:t>Caught the release, but too wide for the desired feel.</w:t>
-            </w:r>
-          </w:p>
-        </w:tc>
-      </w:tr>
-      <w:tr>
-        <w:tc>
-          <w:tcPr>
-            <w:tcW w:type="dxa" w:w="2376"/>
-            <w:vAlign w:val="center"/>
-          </w:tcPr>
-          <w:p>
-            <w:pPr>
-              <w:spacing w:after="0"/>
-            </w:pPr>
-            <w:r/>
-            <w:r>
-              <w:rPr>
-                <w:b w:val="0"/>
-              </w:rPr>
-              <w:t>Current moving window</w:t>
-            </w:r>
-          </w:p>
-        </w:tc>
-        <w:tc>
-          <w:tcPr>
-            <w:tcW w:type="dxa" w:w="1872"/>
-            <w:vAlign w:val="center"/>
-          </w:tcPr>
-          <w:p>
-            <w:pPr>
-              <w:spacing w:after="0"/>
-            </w:pPr>
-            <w:r/>
-            <w:r>
-              <w:rPr>
-                <w:b w:val="0"/>
-              </w:rPr>
-              <w:t>+/-94.2 mV</w:t>
-            </w:r>
-          </w:p>
-        </w:tc>
-        <w:tc>
-          <w:tcPr>
-            <w:tcW w:type="dxa" w:w="1800"/>
-            <w:vAlign w:val="center"/>
-          </w:tcPr>
-          <w:p>
-            <w:pPr>
-              <w:spacing w:after="0"/>
-            </w:pPr>
-            <w:r/>
-            <w:r>
-              <w:rPr>
-                <w:b w:val="0"/>
-              </w:rPr>
-              <w:t>About +/-0.90</w:t>
-            </w:r>
-          </w:p>
-        </w:tc>
-        <w:tc>
-          <w:tcPr>
-            <w:tcW w:type="dxa" w:w="3600"/>
-            <w:vAlign w:val="center"/>
-          </w:tcPr>
-          <w:p>
-            <w:pPr>
-              <w:spacing w:after="0"/>
-            </w:pPr>
-            <w:r/>
-            <w:r>
-              <w:rPr>
-                <w:b w:val="0"/>
-              </w:rPr>
-              <w:t>Catches release while keeping the reset aperture narrow.</w:t>
+              <w:t>Keeps rails active through the 11 s transient run.</w:t>
             </w:r>
           </w:p>
         </w:tc>
@@ -1344,7 +1081,7 @@
     </w:p>
     <w:p>
       <w:r>
-        <w:t>The latest CSV used here is plot10.csv. It includes WH, WL, HOLD, and OUT for the current design with startup reset and no TOUCH signal. The threshold half-width remains essentially constant: min 94.225 mV, max 94.230 mV, mean 94.226 mV. The threshold center moves from about 2.138 V to 2.857 V over the full test, which is the intended behavior.</w:t>
+        <w:t>plot14.csv includes WH, WL, HOLD, OUT, and SENSOR. The moving-window half-width is stable: min 94.225 mV, max 94.230 mV, mean 94.226 mV. The moving center ranges from 2.138 V to 2.859 V over the full test.</w:t>
       </w:r>
     </w:p>
     <w:tbl>
@@ -1355,17 +1092,18 @@
         <w:tblLook w:firstColumn="1" w:firstRow="1" w:lastColumn="0" w:lastRow="0" w:noHBand="0" w:noVBand="1" w:val="04A0"/>
       </w:tblPr>
       <w:tblGrid>
-        <w:gridCol w:w="1632"/>
-        <w:gridCol w:w="1632"/>
-        <w:gridCol w:w="1632"/>
-        <w:gridCol w:w="1632"/>
-        <w:gridCol w:w="1632"/>
-        <w:gridCol w:w="1632"/>
+        <w:gridCol w:w="1399"/>
+        <w:gridCol w:w="1399"/>
+        <w:gridCol w:w="1399"/>
+        <w:gridCol w:w="1399"/>
+        <w:gridCol w:w="1399"/>
+        <w:gridCol w:w="1399"/>
+        <w:gridCol w:w="1399"/>
       </w:tblGrid>
       <w:tr>
         <w:tc>
           <w:tcPr>
-            <w:tcW w:type="dxa" w:w="3384"/>
+            <w:tcW w:type="dxa" w:w="2520"/>
             <w:vAlign w:val="center"/>
             <w:shd w:fill="E8EEF5"/>
           </w:tcPr>
@@ -1384,7 +1122,7 @@
         </w:tc>
         <w:tc>
           <w:tcPr>
-            <w:tcW w:type="dxa" w:w="1152"/>
+            <w:tcW w:type="dxa" w:w="1037"/>
             <w:vAlign w:val="center"/>
             <w:shd w:fill="E8EEF5"/>
           </w:tcPr>
@@ -1403,7 +1141,26 @@
         </w:tc>
         <w:tc>
           <w:tcPr>
-            <w:tcW w:type="dxa" w:w="1080"/>
+            <w:tcW w:type="dxa" w:w="1152"/>
+            <w:vAlign w:val="center"/>
+            <w:shd w:fill="E8EEF5"/>
+          </w:tcPr>
+          <w:p>
+            <w:pPr>
+              <w:spacing w:after="0"/>
+            </w:pPr>
+            <w:r/>
+            <w:r>
+              <w:rPr>
+                <w:b/>
+              </w:rPr>
+              <w:t>SENSOR</w:t>
+            </w:r>
+          </w:p>
+        </w:tc>
+        <w:tc>
+          <w:tcPr>
+            <w:tcW w:type="dxa" w:w="1152"/>
             <w:vAlign w:val="center"/>
             <w:shd w:fill="E8EEF5"/>
           </w:tcPr>
@@ -1441,7 +1198,7 @@
         </w:tc>
         <w:tc>
           <w:tcPr>
-            <w:tcW w:type="dxa" w:w="936"/>
+            <w:tcW w:type="dxa" w:w="893"/>
             <w:vAlign w:val="center"/>
             <w:shd w:fill="E8EEF5"/>
           </w:tcPr>
@@ -1460,7 +1217,7 @@
         </w:tc>
         <w:tc>
           <w:tcPr>
-            <w:tcW w:type="dxa" w:w="1008"/>
+            <w:tcW w:type="dxa" w:w="893"/>
             <w:vAlign w:val="center"/>
             <w:shd w:fill="E8EEF5"/>
           </w:tcPr>
@@ -1481,7 +1238,7 @@
       <w:tr>
         <w:tc>
           <w:tcPr>
-            <w:tcW w:type="dxa" w:w="3384"/>
+            <w:tcW w:type="dxa" w:w="2520"/>
             <w:vAlign w:val="center"/>
           </w:tcPr>
           <w:p>
@@ -1499,6 +1256,24 @@
         </w:tc>
         <w:tc>
           <w:tcPr>
+            <w:tcW w:type="dxa" w:w="1037"/>
+            <w:vAlign w:val="center"/>
+          </w:tcPr>
+          <w:p>
+            <w:pPr>
+              <w:spacing w:after="0"/>
+            </w:pPr>
+            <w:r/>
+            <w:r>
+              <w:rPr>
+                <w:b w:val="0"/>
+              </w:rPr>
+              <w:t>0.4997 s</w:t>
+            </w:r>
+          </w:p>
+        </w:tc>
+        <w:tc>
+          <w:tcPr>
             <w:tcW w:type="dxa" w:w="1152"/>
             <w:vAlign w:val="center"/>
           </w:tcPr>
@@ -1511,13 +1286,13 @@
               <w:rPr>
                 <w:b w:val="0"/>
               </w:rPr>
-              <w:t>0.4992 s</w:t>
+              <w:t>2.15073 V</w:t>
             </w:r>
           </w:p>
         </w:tc>
         <w:tc>
           <w:tcPr>
-            <w:tcW w:type="dxa" w:w="1080"/>
+            <w:tcW w:type="dxa" w:w="1152"/>
             <w:vAlign w:val="center"/>
           </w:tcPr>
           <w:p>
@@ -1529,7 +1304,7 @@
               <w:rPr>
                 <w:b w:val="0"/>
               </w:rPr>
-              <w:t>1.9681 V</w:t>
+              <w:t>1.96018 V</w:t>
             </w:r>
           </w:p>
         </w:tc>
@@ -1547,13 +1322,13 @@
               <w:rPr>
                 <w:b w:val="0"/>
               </w:rPr>
-              <w:t>2.4173 to 2.6058 V</w:t>
+              <w:t>2.41731 to 2.60576 V</w:t>
             </w:r>
           </w:p>
         </w:tc>
         <w:tc>
           <w:tcPr>
-            <w:tcW w:type="dxa" w:w="936"/>
+            <w:tcW w:type="dxa" w:w="893"/>
             <w:vAlign w:val="center"/>
           </w:tcPr>
           <w:p>
@@ -1571,7 +1346,7 @@
         </w:tc>
         <w:tc>
           <w:tcPr>
-            <w:tcW w:type="dxa" w:w="1008"/>
+            <w:tcW w:type="dxa" w:w="893"/>
             <w:vAlign w:val="center"/>
           </w:tcPr>
           <w:p>
@@ -1591,7 +1366,7 @@
       <w:tr>
         <w:tc>
           <w:tcPr>
-            <w:tcW w:type="dxa" w:w="3384"/>
+            <w:tcW w:type="dxa" w:w="2520"/>
             <w:vAlign w:val="center"/>
           </w:tcPr>
           <w:p>
@@ -1609,6 +1384,24 @@
         </w:tc>
         <w:tc>
           <w:tcPr>
+            <w:tcW w:type="dxa" w:w="1037"/>
+            <w:vAlign w:val="center"/>
+          </w:tcPr>
+          <w:p>
+            <w:pPr>
+              <w:spacing w:after="0"/>
+            </w:pPr>
+            <w:r/>
+            <w:r>
+              <w:rPr>
+                <w:b w:val="0"/>
+              </w:rPr>
+              <w:t>1.5006 s</w:t>
+            </w:r>
+          </w:p>
+        </w:tc>
+        <w:tc>
+          <w:tcPr>
             <w:tcW w:type="dxa" w:w="1152"/>
             <w:vAlign w:val="center"/>
           </w:tcPr>
@@ -1621,13 +1414,13 @@
               <w:rPr>
                 <w:b w:val="0"/>
               </w:rPr>
-              <w:t>1.5007 s</w:t>
+              <w:t>2.17500 V</w:t>
             </w:r>
           </w:p>
         </w:tc>
         <w:tc>
           <w:tcPr>
-            <w:tcW w:type="dxa" w:w="1080"/>
+            <w:tcW w:type="dxa" w:w="1152"/>
             <w:vAlign w:val="center"/>
           </w:tcPr>
           <w:p>
@@ -1639,7 +1432,7 @@
               <w:rPr>
                 <w:b w:val="0"/>
               </w:rPr>
-              <w:t>2.4969 V</w:t>
+              <w:t>2.49849 V</w:t>
             </w:r>
           </w:p>
         </w:tc>
@@ -1657,13 +1450,13 @@
               <w:rPr>
                 <w:b w:val="0"/>
               </w:rPr>
-              <w:t>2.4057 to 2.5942 V</w:t>
+              <w:t>2.40596 to 2.59442 V</w:t>
             </w:r>
           </w:p>
         </w:tc>
         <w:tc>
           <w:tcPr>
-            <w:tcW w:type="dxa" w:w="936"/>
+            <w:tcW w:type="dxa" w:w="893"/>
             <w:vAlign w:val="center"/>
           </w:tcPr>
           <w:p>
@@ -1681,7 +1474,7 @@
         </w:tc>
         <w:tc>
           <w:tcPr>
-            <w:tcW w:type="dxa" w:w="1008"/>
+            <w:tcW w:type="dxa" w:w="893"/>
             <w:vAlign w:val="center"/>
           </w:tcPr>
           <w:p>
@@ -1701,7 +1494,7 @@
       <w:tr>
         <w:tc>
           <w:tcPr>
-            <w:tcW w:type="dxa" w:w="3384"/>
+            <w:tcW w:type="dxa" w:w="2520"/>
             <w:vAlign w:val="center"/>
           </w:tcPr>
           <w:p>
@@ -1719,6 +1512,24 @@
         </w:tc>
         <w:tc>
           <w:tcPr>
+            <w:tcW w:type="dxa" w:w="1037"/>
+            <w:vAlign w:val="center"/>
+          </w:tcPr>
+          <w:p>
+            <w:pPr>
+              <w:spacing w:after="0"/>
+            </w:pPr>
+            <w:r/>
+            <w:r>
+              <w:rPr>
+                <w:b w:val="0"/>
+              </w:rPr>
+              <w:t>2.2507 s</w:t>
+            </w:r>
+          </w:p>
+        </w:tc>
+        <w:tc>
+          <w:tcPr>
             <w:tcW w:type="dxa" w:w="1152"/>
             <w:vAlign w:val="center"/>
           </w:tcPr>
@@ -1731,13 +1542,13 @@
               <w:rPr>
                 <w:b w:val="0"/>
               </w:rPr>
-              <w:t>2.2508 s</w:t>
+              <w:t>2.42500 V</w:t>
             </w:r>
           </w:p>
         </w:tc>
         <w:tc>
           <w:tcPr>
-            <w:tcW w:type="dxa" w:w="1080"/>
+            <w:tcW w:type="dxa" w:w="1152"/>
             <w:vAlign w:val="center"/>
           </w:tcPr>
           <w:p>
@@ -1749,7 +1560,7 @@
               <w:rPr>
                 <w:b w:val="0"/>
               </w:rPr>
-              <w:t>4.9840 V</w:t>
+              <w:t>4.98939 V</w:t>
             </w:r>
           </w:p>
         </w:tc>
@@ -1767,13 +1578,13 @@
               <w:rPr>
                 <w:b w:val="0"/>
               </w:rPr>
-              <w:t>2.5804 to 2.7689 V</w:t>
+              <w:t>2.58087 to 2.76932 V</w:t>
             </w:r>
           </w:p>
         </w:tc>
         <w:tc>
           <w:tcPr>
-            <w:tcW w:type="dxa" w:w="936"/>
+            <w:tcW w:type="dxa" w:w="893"/>
             <w:vAlign w:val="center"/>
           </w:tcPr>
           <w:p>
@@ -1791,7 +1602,7 @@
         </w:tc>
         <w:tc>
           <w:tcPr>
-            <w:tcW w:type="dxa" w:w="1008"/>
+            <w:tcW w:type="dxa" w:w="893"/>
             <w:vAlign w:val="center"/>
           </w:tcPr>
           <w:p>
@@ -1811,7 +1622,7 @@
       <w:tr>
         <w:tc>
           <w:tcPr>
-            <w:tcW w:type="dxa" w:w="3384"/>
+            <w:tcW w:type="dxa" w:w="2520"/>
             <w:vAlign w:val="center"/>
           </w:tcPr>
           <w:p>
@@ -1823,7 +1634,25 @@
               <w:rPr>
                 <w:b w:val="0"/>
               </w:rPr>
-              <w:t>Upward release back near center</w:t>
+              <w:t>Upward release near center</w:t>
+            </w:r>
+          </w:p>
+        </w:tc>
+        <w:tc>
+          <w:tcPr>
+            <w:tcW w:type="dxa" w:w="1037"/>
+            <w:vAlign w:val="center"/>
+          </w:tcPr>
+          <w:p>
+            <w:pPr>
+              <w:spacing w:after="0"/>
+            </w:pPr>
+            <w:r/>
+            <w:r>
+              <w:rPr>
+                <w:b w:val="0"/>
+              </w:rPr>
+              <w:t>3.4997 s</w:t>
             </w:r>
           </w:p>
         </w:tc>
@@ -1841,13 +1670,13 @@
               <w:rPr>
                 <w:b w:val="0"/>
               </w:rPr>
-              <w:t>3.2507 s</w:t>
+              <w:t>2.18250 V</w:t>
             </w:r>
           </w:p>
         </w:tc>
         <w:tc>
           <w:tcPr>
-            <w:tcW w:type="dxa" w:w="1080"/>
+            <w:tcW w:type="dxa" w:w="1152"/>
             <w:vAlign w:val="center"/>
           </w:tcPr>
           <w:p>
@@ -1859,7 +1688,7 @@
               <w:rPr>
                 <w:b w:val="0"/>
               </w:rPr>
-              <w:t>2.4992 V</w:t>
+              <w:t>2.50171 V</w:t>
             </w:r>
           </w:p>
         </w:tc>
@@ -1877,13 +1706,141 @@
               <w:rPr>
                 <w:b w:val="0"/>
               </w:rPr>
-              <w:t>2.5916 to 2.7800 V</w:t>
+              <w:t>2.44883 to 2.63729 V</w:t>
             </w:r>
           </w:p>
         </w:tc>
         <w:tc>
           <w:tcPr>
-            <w:tcW w:type="dxa" w:w="936"/>
+            <w:tcW w:type="dxa" w:w="893"/>
+            <w:vAlign w:val="center"/>
+          </w:tcPr>
+          <w:p>
+            <w:pPr>
+              <w:spacing w:after="0"/>
+            </w:pPr>
+            <w:r/>
+            <w:r>
+              <w:rPr>
+                <w:b w:val="0"/>
+              </w:rPr>
+              <w:t>0.01 V</w:t>
+            </w:r>
+          </w:p>
+        </w:tc>
+        <w:tc>
+          <w:tcPr>
+            <w:tcW w:type="dxa" w:w="893"/>
+            <w:vAlign w:val="center"/>
+          </w:tcPr>
+          <w:p>
+            <w:pPr>
+              <w:spacing w:after="0"/>
+            </w:pPr>
+            <w:r/>
+            <w:r>
+              <w:rPr>
+                <w:b w:val="0"/>
+              </w:rPr>
+              <w:t>inside</w:t>
+            </w:r>
+          </w:p>
+        </w:tc>
+      </w:tr>
+      <w:tr>
+        <w:tc>
+          <w:tcPr>
+            <w:tcW w:type="dxa" w:w="2520"/>
+            <w:vAlign w:val="center"/>
+          </w:tcPr>
+          <w:p>
+            <w:pPr>
+              <w:spacing w:after="0"/>
+            </w:pPr>
+            <w:r/>
+            <w:r>
+              <w:rPr>
+                <w:b w:val="0"/>
+              </w:rPr>
+              <w:t>Downward bend held</w:t>
+            </w:r>
+          </w:p>
+        </w:tc>
+        <w:tc>
+          <w:tcPr>
+            <w:tcW w:type="dxa" w:w="1037"/>
+            <w:vAlign w:val="center"/>
+          </w:tcPr>
+          <w:p>
+            <w:pPr>
+              <w:spacing w:after="0"/>
+            </w:pPr>
+            <w:r/>
+            <w:r>
+              <w:rPr>
+                <w:b w:val="0"/>
+              </w:rPr>
+              <w:t>4.5005 s</w:t>
+            </w:r>
+          </w:p>
+        </w:tc>
+        <w:tc>
+          <w:tcPr>
+            <w:tcW w:type="dxa" w:w="1152"/>
+            <w:vAlign w:val="center"/>
+          </w:tcPr>
+          <w:p>
+            <w:pPr>
+              <w:spacing w:after="0"/>
+            </w:pPr>
+            <w:r/>
+            <w:r>
+              <w:rPr>
+                <w:b w:val="0"/>
+              </w:rPr>
+              <w:t>1.92551 V</w:t>
+            </w:r>
+          </w:p>
+        </w:tc>
+        <w:tc>
+          <w:tcPr>
+            <w:tcW w:type="dxa" w:w="1152"/>
+            <w:vAlign w:val="center"/>
+          </w:tcPr>
+          <w:p>
+            <w:pPr>
+              <w:spacing w:after="0"/>
+            </w:pPr>
+            <w:r/>
+            <w:r>
+              <w:rPr>
+                <w:b w:val="0"/>
+              </w:rPr>
+              <w:t>-0.00452 V</w:t>
+            </w:r>
+          </w:p>
+        </w:tc>
+        <w:tc>
+          <w:tcPr>
+            <w:tcW w:type="dxa" w:w="2232"/>
+            <w:vAlign w:val="center"/>
+          </w:tcPr>
+          <w:p>
+            <w:pPr>
+              <w:spacing w:after="0"/>
+            </w:pPr>
+            <w:r/>
+            <w:r>
+              <w:rPr>
+                <w:b w:val="0"/>
+              </w:rPr>
+              <w:t>2.04349 to 2.23194 V</w:t>
+            </w:r>
+          </w:p>
+        </w:tc>
+        <w:tc>
+          <w:tcPr>
+            <w:tcW w:type="dxa" w:w="893"/>
             <w:vAlign w:val="center"/>
           </w:tcPr>
           <w:p>
@@ -1901,7 +1858,7 @@
         </w:tc>
         <w:tc>
           <w:tcPr>
-            <w:tcW w:type="dxa" w:w="1008"/>
+            <w:tcW w:type="dxa" w:w="893"/>
             <w:vAlign w:val="center"/>
           </w:tcPr>
           <w:p>
@@ -1921,7 +1878,7 @@
       <w:tr>
         <w:tc>
           <w:tcPr>
-            <w:tcW w:type="dxa" w:w="3384"/>
+            <w:tcW w:type="dxa" w:w="2520"/>
             <w:vAlign w:val="center"/>
           </w:tcPr>
           <w:p>
@@ -1933,7 +1890,25 @@
               <w:rPr>
                 <w:b w:val="0"/>
               </w:rPr>
-              <w:t>Downward bend held</w:t>
+              <w:t>Downward release captured</w:t>
+            </w:r>
+          </w:p>
+        </w:tc>
+        <w:tc>
+          <w:tcPr>
+            <w:tcW w:type="dxa" w:w="1037"/>
+            <w:vAlign w:val="center"/>
+          </w:tcPr>
+          <w:p>
+            <w:pPr>
+              <w:spacing w:after="0"/>
+            </w:pPr>
+            <w:r/>
+            <w:r>
+              <w:rPr>
+                <w:b w:val="0"/>
+              </w:rPr>
+              <w:t>4.7509 s</w:t>
             </w:r>
           </w:p>
         </w:tc>
@@ -1951,13 +1926,13 @@
               <w:rPr>
                 <w:b w:val="0"/>
               </w:rPr>
-              <w:t>4.4996 s</w:t>
+              <w:t>2.16750 V</w:t>
             </w:r>
           </w:p>
         </w:tc>
         <w:tc>
           <w:tcPr>
-            <w:tcW w:type="dxa" w:w="1080"/>
+            <w:tcW w:type="dxa" w:w="1152"/>
             <w:vAlign w:val="center"/>
           </w:tcPr>
           <w:p>
@@ -1969,7 +1944,7 @@
               <w:rPr>
                 <w:b w:val="0"/>
               </w:rPr>
-              <w:t>-0.0046 V</w:t>
+              <w:t>2.36174 V</w:t>
             </w:r>
           </w:p>
         </w:tc>
@@ -1987,13 +1962,269 @@
               <w:rPr>
                 <w:b w:val="0"/>
               </w:rPr>
-              <w:t>2.0435 to 2.2319 V</w:t>
+              <w:t>2.20355 to 2.39200 V</w:t>
             </w:r>
           </w:p>
         </w:tc>
         <w:tc>
           <w:tcPr>
-            <w:tcW w:type="dxa" w:w="936"/>
+            <w:tcW w:type="dxa" w:w="893"/>
+            <w:vAlign w:val="center"/>
+          </w:tcPr>
+          <w:p>
+            <w:pPr>
+              <w:spacing w:after="0"/>
+            </w:pPr>
+            <w:r/>
+            <w:r>
+              <w:rPr>
+                <w:b w:val="0"/>
+              </w:rPr>
+              <w:t>0.00 V</w:t>
+            </w:r>
+          </w:p>
+        </w:tc>
+        <w:tc>
+          <w:tcPr>
+            <w:tcW w:type="dxa" w:w="893"/>
+            <w:vAlign w:val="center"/>
+          </w:tcPr>
+          <w:p>
+            <w:pPr>
+              <w:spacing w:after="0"/>
+            </w:pPr>
+            <w:r/>
+            <w:r>
+              <w:rPr>
+                <w:b w:val="0"/>
+              </w:rPr>
+              <w:t>inside</w:t>
+            </w:r>
+          </w:p>
+        </w:tc>
+      </w:tr>
+      <w:tr>
+        <w:tc>
+          <w:tcPr>
+            <w:tcW w:type="dxa" w:w="2520"/>
+            <w:vAlign w:val="center"/>
+          </w:tcPr>
+          <w:p>
+            <w:pPr>
+              <w:spacing w:after="0"/>
+            </w:pPr>
+            <w:r/>
+            <w:r>
+              <w:rPr>
+                <w:b w:val="0"/>
+              </w:rPr>
+              <w:t>Pre-semitone center</w:t>
+            </w:r>
+          </w:p>
+        </w:tc>
+        <w:tc>
+          <w:tcPr>
+            <w:tcW w:type="dxa" w:w="1037"/>
+            <w:vAlign w:val="center"/>
+          </w:tcPr>
+          <w:p>
+            <w:pPr>
+              <w:spacing w:after="0"/>
+            </w:pPr>
+            <w:r/>
+            <w:r>
+              <w:rPr>
+                <w:b w:val="0"/>
+              </w:rPr>
+              <w:t>5.4009 s</w:t>
+            </w:r>
+          </w:p>
+        </w:tc>
+        <w:tc>
+          <w:tcPr>
+            <w:tcW w:type="dxa" w:w="1152"/>
+            <w:vAlign w:val="center"/>
+          </w:tcPr>
+          <w:p>
+            <w:pPr>
+              <w:spacing w:after="0"/>
+            </w:pPr>
+            <w:r/>
+            <w:r>
+              <w:rPr>
+                <w:b w:val="0"/>
+              </w:rPr>
+              <w:t>2.16769 V</w:t>
+            </w:r>
+          </w:p>
+        </w:tc>
+        <w:tc>
+          <w:tcPr>
+            <w:tcW w:type="dxa" w:w="1152"/>
+            <w:vAlign w:val="center"/>
+          </w:tcPr>
+          <w:p>
+            <w:pPr>
+              <w:spacing w:after="0"/>
+            </w:pPr>
+            <w:r/>
+            <w:r>
+              <w:rPr>
+                <w:b w:val="0"/>
+              </w:rPr>
+              <w:t>2.49999 V</w:t>
+            </w:r>
+          </w:p>
+        </w:tc>
+        <w:tc>
+          <w:tcPr>
+            <w:tcW w:type="dxa" w:w="2232"/>
+            <w:vAlign w:val="center"/>
+          </w:tcPr>
+          <w:p>
+            <w:pPr>
+              <w:spacing w:after="0"/>
+            </w:pPr>
+            <w:r/>
+            <w:r>
+              <w:rPr>
+                <w:b w:val="0"/>
+              </w:rPr>
+              <w:t>2.40089 to 2.58934 V</w:t>
+            </w:r>
+          </w:p>
+        </w:tc>
+        <w:tc>
+          <w:tcPr>
+            <w:tcW w:type="dxa" w:w="893"/>
+            <w:vAlign w:val="center"/>
+          </w:tcPr>
+          <w:p>
+            <w:pPr>
+              <w:spacing w:after="0"/>
+            </w:pPr>
+            <w:r/>
+            <w:r>
+              <w:rPr>
+                <w:b w:val="0"/>
+              </w:rPr>
+              <w:t>0.01 V</w:t>
+            </w:r>
+          </w:p>
+        </w:tc>
+        <w:tc>
+          <w:tcPr>
+            <w:tcW w:type="dxa" w:w="893"/>
+            <w:vAlign w:val="center"/>
+          </w:tcPr>
+          <w:p>
+            <w:pPr>
+              <w:spacing w:after="0"/>
+            </w:pPr>
+            <w:r/>
+            <w:r>
+              <w:rPr>
+                <w:b w:val="0"/>
+              </w:rPr>
+              <w:t>inside</w:t>
+            </w:r>
+          </w:p>
+        </w:tc>
+      </w:tr>
+      <w:tr>
+        <w:tc>
+          <w:tcPr>
+            <w:tcW w:type="dxa" w:w="2520"/>
+            <w:vAlign w:val="center"/>
+          </w:tcPr>
+          <w:p>
+            <w:pPr>
+              <w:spacing w:after="0"/>
+            </w:pPr>
+            <w:r/>
+            <w:r>
+              <w:rPr>
+                <w:b w:val="0"/>
+              </w:rPr>
+              <w:t>+1 semitone hold</w:t>
+            </w:r>
+          </w:p>
+        </w:tc>
+        <w:tc>
+          <w:tcPr>
+            <w:tcW w:type="dxa" w:w="1037"/>
+            <w:vAlign w:val="center"/>
+          </w:tcPr>
+          <w:p>
+            <w:pPr>
+              <w:spacing w:after="0"/>
+            </w:pPr>
+            <w:r/>
+            <w:r>
+              <w:rPr>
+                <w:b w:val="0"/>
+              </w:rPr>
+              <w:t>5.8995 s</w:t>
+            </w:r>
+          </w:p>
+        </w:tc>
+        <w:tc>
+          <w:tcPr>
+            <w:tcW w:type="dxa" w:w="1152"/>
+            <w:vAlign w:val="center"/>
+          </w:tcPr>
+          <w:p>
+            <w:pPr>
+              <w:spacing w:after="0"/>
+            </w:pPr>
+            <w:r/>
+            <w:r>
+              <w:rPr>
+                <w:b w:val="0"/>
+              </w:rPr>
+              <w:t>2.18833 V</w:t>
+            </w:r>
+          </w:p>
+        </w:tc>
+        <w:tc>
+          <w:tcPr>
+            <w:tcW w:type="dxa" w:w="1152"/>
+            <w:vAlign w:val="center"/>
+          </w:tcPr>
+          <w:p>
+            <w:pPr>
+              <w:spacing w:after="0"/>
+            </w:pPr>
+            <w:r/>
+            <w:r>
+              <w:rPr>
+                <w:b w:val="0"/>
+              </w:rPr>
+              <w:t>2.67237 V</w:t>
+            </w:r>
+          </w:p>
+        </w:tc>
+        <w:tc>
+          <w:tcPr>
+            <w:tcW w:type="dxa" w:w="2232"/>
+            <w:vAlign w:val="center"/>
+          </w:tcPr>
+          <w:p>
+            <w:pPr>
+              <w:spacing w:after="0"/>
+            </w:pPr>
+            <w:r/>
+            <w:r>
+              <w:rPr>
+                <w:b w:val="0"/>
+              </w:rPr>
+              <w:t>2.42916 to 2.61761 V</w:t>
+            </w:r>
+          </w:p>
+        </w:tc>
+        <w:tc>
+          <w:tcPr>
+            <w:tcW w:type="dxa" w:w="893"/>
             <w:vAlign w:val="center"/>
           </w:tcPr>
           <w:p>
@@ -2011,7 +2242,7 @@
         </w:tc>
         <w:tc>
           <w:tcPr>
-            <w:tcW w:type="dxa" w:w="1008"/>
+            <w:tcW w:type="dxa" w:w="893"/>
             <w:vAlign w:val="center"/>
           </w:tcPr>
           <w:p>
@@ -2031,7 +2262,7 @@
       <w:tr>
         <w:tc>
           <w:tcPr>
-            <w:tcW w:type="dxa" w:w="3384"/>
+            <w:tcW w:type="dxa" w:w="2520"/>
             <w:vAlign w:val="center"/>
           </w:tcPr>
           <w:p>
@@ -2043,7 +2274,25 @@
               <w:rPr>
                 <w:b w:val="0"/>
               </w:rPr>
-              <w:t>Downward release entering moving window</w:t>
+              <w:t>+1 release recovered</w:t>
+            </w:r>
+          </w:p>
+        </w:tc>
+        <w:tc>
+          <w:tcPr>
+            <w:tcW w:type="dxa" w:w="1037"/>
+            <w:vAlign w:val="center"/>
+          </w:tcPr>
+          <w:p>
+            <w:pPr>
+              <w:spacing w:after="0"/>
+            </w:pPr>
+            <w:r/>
+            <w:r>
+              <w:rPr>
+                <w:b w:val="0"/>
+              </w:rPr>
+              <w:t>6.6799 s</w:t>
             </w:r>
           </w:p>
         </w:tc>
@@ -2061,13 +2310,13 @@
               <w:rPr>
                 <w:b w:val="0"/>
               </w:rPr>
-              <w:t>4.7376 s</w:t>
+              <w:t>2.16750 V</w:t>
             </w:r>
           </w:p>
         </w:tc>
         <w:tc>
           <w:tcPr>
-            <w:tcW w:type="dxa" w:w="1080"/>
+            <w:tcW w:type="dxa" w:w="1152"/>
             <w:vAlign w:val="center"/>
           </w:tcPr>
           <w:p>
@@ -2079,7 +2328,7 @@
               <w:rPr>
                 <w:b w:val="0"/>
               </w:rPr>
-              <w:t>2.1896 V</w:t>
+              <w:t>2.49503 V</w:t>
             </w:r>
           </w:p>
         </w:tc>
@@ -2097,13 +2346,13 @@
               <w:rPr>
                 <w:b w:val="0"/>
               </w:rPr>
-              <w:t>2.1867 to 2.3752 V</w:t>
+              <w:t>2.40703 to 2.59548 V</w:t>
             </w:r>
           </w:p>
         </w:tc>
         <w:tc>
           <w:tcPr>
-            <w:tcW w:type="dxa" w:w="936"/>
+            <w:tcW w:type="dxa" w:w="893"/>
             <w:vAlign w:val="center"/>
           </w:tcPr>
           <w:p>
@@ -2115,13 +2364,13 @@
               <w:rPr>
                 <w:b w:val="0"/>
               </w:rPr>
-              <w:t>5.00 V</w:t>
+              <w:t>0.00 V</w:t>
             </w:r>
           </w:p>
         </w:tc>
         <w:tc>
           <w:tcPr>
-            <w:tcW w:type="dxa" w:w="1008"/>
+            <w:tcW w:type="dxa" w:w="893"/>
             <w:vAlign w:val="center"/>
           </w:tcPr>
           <w:p>
@@ -2141,7 +2390,7 @@
       <w:tr>
         <w:tc>
           <w:tcPr>
-            <w:tcW w:type="dxa" w:w="3384"/>
+            <w:tcW w:type="dxa" w:w="2520"/>
             <w:vAlign w:val="center"/>
           </w:tcPr>
           <w:p>
@@ -2153,7 +2402,25 @@
               <w:rPr>
                 <w:b w:val="0"/>
               </w:rPr>
-              <w:t>Downward release captured</w:t>
+              <w:t>Center gap</w:t>
+            </w:r>
+          </w:p>
+        </w:tc>
+        <w:tc>
+          <w:tcPr>
+            <w:tcW w:type="dxa" w:w="1037"/>
+            <w:vAlign w:val="center"/>
+          </w:tcPr>
+          <w:p>
+            <w:pPr>
+              <w:spacing w:after="0"/>
+            </w:pPr>
+            <w:r/>
+            <w:r>
+              <w:rPr>
+                <w:b w:val="0"/>
+              </w:rPr>
+              <w:t>7.3999 s</w:t>
             </w:r>
           </w:p>
         </w:tc>
@@ -2171,13 +2438,13 @@
               <w:rPr>
                 <w:b w:val="0"/>
               </w:rPr>
-              <w:t>4.7500 s</w:t>
+              <w:t>2.16750 V</w:t>
             </w:r>
           </w:p>
         </w:tc>
         <w:tc>
           <w:tcPr>
-            <w:tcW w:type="dxa" w:w="1080"/>
+            <w:tcW w:type="dxa" w:w="1152"/>
             <w:vAlign w:val="center"/>
           </w:tcPr>
           <w:p>
@@ -2189,7 +2456,7 @@
               <w:rPr>
                 <w:b w:val="0"/>
               </w:rPr>
-              <w:t>2.3302 V</w:t>
+              <w:t>2.49836 V</w:t>
             </w:r>
           </w:p>
         </w:tc>
@@ -2207,13 +2474,13 @@
               <w:rPr>
                 <w:b w:val="0"/>
               </w:rPr>
-              <w:t>2.1999 to 2.3883 V</w:t>
+              <w:t>2.40555 to 2.59400 V</w:t>
             </w:r>
           </w:p>
         </w:tc>
         <w:tc>
           <w:tcPr>
-            <w:tcW w:type="dxa" w:w="936"/>
+            <w:tcW w:type="dxa" w:w="893"/>
             <w:vAlign w:val="center"/>
           </w:tcPr>
           <w:p>
@@ -2231,7 +2498,7 @@
         </w:tc>
         <w:tc>
           <w:tcPr>
-            <w:tcW w:type="dxa" w:w="1008"/>
+            <w:tcW w:type="dxa" w:w="893"/>
             <w:vAlign w:val="center"/>
           </w:tcPr>
           <w:p>
@@ -2251,7 +2518,7 @@
       <w:tr>
         <w:tc>
           <w:tcPr>
-            <w:tcW w:type="dxa" w:w="3384"/>
+            <w:tcW w:type="dxa" w:w="2520"/>
             <w:vAlign w:val="center"/>
           </w:tcPr>
           <w:p>
@@ -2263,7 +2530,25 @@
               <w:rPr>
                 <w:b w:val="0"/>
               </w:rPr>
-              <w:t>Post-release center before vibrato</w:t>
+              <w:t>-1 semitone hold</w:t>
+            </w:r>
+          </w:p>
+        </w:tc>
+        <w:tc>
+          <w:tcPr>
+            <w:tcW w:type="dxa" w:w="1037"/>
+            <w:vAlign w:val="center"/>
+          </w:tcPr>
+          <w:p>
+            <w:pPr>
+              <w:spacing w:after="0"/>
+            </w:pPr>
+            <w:r/>
+            <w:r>
+              <w:rPr>
+                <w:b w:val="0"/>
+              </w:rPr>
+              <w:t>7.9000 s</w:t>
             </w:r>
           </w:p>
         </w:tc>
@@ -2281,13 +2566,13 @@
               <w:rPr>
                 <w:b w:val="0"/>
               </w:rPr>
-              <w:t>5.3999 s</w:t>
+              <w:t>2.14667 V</w:t>
             </w:r>
           </w:p>
         </w:tc>
         <w:tc>
           <w:tcPr>
-            <w:tcW w:type="dxa" w:w="1080"/>
+            <w:tcW w:type="dxa" w:w="1152"/>
             <w:vAlign w:val="center"/>
           </w:tcPr>
           <w:p>
@@ -2299,7 +2584,7 @@
               <w:rPr>
                 <w:b w:val="0"/>
               </w:rPr>
-              <w:t>2.4965 V</w:t>
+              <w:t>2.31067 V</w:t>
             </w:r>
           </w:p>
         </w:tc>
@@ -2317,13 +2602,141 @@
               <w:rPr>
                 <w:b w:val="0"/>
               </w:rPr>
-              <w:t>2.4005 to 2.5889 V</w:t>
+              <w:t>2.38041 to 2.56886 V</w:t>
             </w:r>
           </w:p>
         </w:tc>
         <w:tc>
           <w:tcPr>
-            <w:tcW w:type="dxa" w:w="936"/>
+            <w:tcW w:type="dxa" w:w="893"/>
+            <w:vAlign w:val="center"/>
+          </w:tcPr>
+          <w:p>
+            <w:pPr>
+              <w:spacing w:after="0"/>
+            </w:pPr>
+            <w:r/>
+            <w:r>
+              <w:rPr>
+                <w:b w:val="0"/>
+              </w:rPr>
+              <w:t>5.00 V</w:t>
+            </w:r>
+          </w:p>
+        </w:tc>
+        <w:tc>
+          <w:tcPr>
+            <w:tcW w:type="dxa" w:w="893"/>
+            <w:vAlign w:val="center"/>
+          </w:tcPr>
+          <w:p>
+            <w:pPr>
+              <w:spacing w:after="0"/>
+            </w:pPr>
+            <w:r/>
+            <w:r>
+              <w:rPr>
+                <w:b w:val="0"/>
+              </w:rPr>
+              <w:t>outside</w:t>
+            </w:r>
+          </w:p>
+        </w:tc>
+      </w:tr>
+      <w:tr>
+        <w:tc>
+          <w:tcPr>
+            <w:tcW w:type="dxa" w:w="2520"/>
+            <w:vAlign w:val="center"/>
+          </w:tcPr>
+          <w:p>
+            <w:pPr>
+              <w:spacing w:after="0"/>
+            </w:pPr>
+            <w:r/>
+            <w:r>
+              <w:rPr>
+                <w:b w:val="0"/>
+              </w:rPr>
+              <w:t>-1 release recovered</w:t>
+            </w:r>
+          </w:p>
+        </w:tc>
+        <w:tc>
+          <w:tcPr>
+            <w:tcW w:type="dxa" w:w="1037"/>
+            <w:vAlign w:val="center"/>
+          </w:tcPr>
+          <w:p>
+            <w:pPr>
+              <w:spacing w:after="0"/>
+            </w:pPr>
+            <w:r/>
+            <w:r>
+              <w:rPr>
+                <w:b w:val="0"/>
+              </w:rPr>
+              <w:t>8.5599 s</w:t>
+            </w:r>
+          </w:p>
+        </w:tc>
+        <w:tc>
+          <w:tcPr>
+            <w:tcW w:type="dxa" w:w="1152"/>
+            <w:vAlign w:val="center"/>
+          </w:tcPr>
+          <w:p>
+            <w:pPr>
+              <w:spacing w:after="0"/>
+            </w:pPr>
+            <w:r/>
+            <w:r>
+              <w:rPr>
+                <w:b w:val="0"/>
+              </w:rPr>
+              <w:t>2.16750 V</w:t>
+            </w:r>
+          </w:p>
+        </w:tc>
+        <w:tc>
+          <w:tcPr>
+            <w:tcW w:type="dxa" w:w="1152"/>
+            <w:vAlign w:val="center"/>
+          </w:tcPr>
+          <w:p>
+            <w:pPr>
+              <w:spacing w:after="0"/>
+            </w:pPr>
+            <w:r/>
+            <w:r>
+              <w:rPr>
+                <w:b w:val="0"/>
+              </w:rPr>
+              <w:t>2.50489 V</w:t>
+            </w:r>
+          </w:p>
+        </w:tc>
+        <w:tc>
+          <w:tcPr>
+            <w:tcW w:type="dxa" w:w="2232"/>
+            <w:vAlign w:val="center"/>
+          </w:tcPr>
+          <w:p>
+            <w:pPr>
+              <w:spacing w:after="0"/>
+            </w:pPr>
+            <w:r/>
+            <w:r>
+              <w:rPr>
+                <w:b w:val="0"/>
+              </w:rPr>
+              <w:t>2.39925 to 2.58771 V</w:t>
+            </w:r>
+          </w:p>
+        </w:tc>
+        <w:tc>
+          <w:tcPr>
+            <w:tcW w:type="dxa" w:w="893"/>
             <w:vAlign w:val="center"/>
           </w:tcPr>
           <w:p>
@@ -2341,7 +2754,7 @@
         </w:tc>
         <w:tc>
           <w:tcPr>
-            <w:tcW w:type="dxa" w:w="1008"/>
+            <w:tcW w:type="dxa" w:w="893"/>
             <w:vAlign w:val="center"/>
           </w:tcPr>
           <w:p>
@@ -2361,7 +2774,7 @@
       <w:tr>
         <w:tc>
           <w:tcPr>
-            <w:tcW w:type="dxa" w:w="3384"/>
+            <w:tcW w:type="dxa" w:w="2520"/>
             <w:vAlign w:val="center"/>
           </w:tcPr>
           <w:p>
@@ -2373,7 +2786,25 @@
               <w:rPr>
                 <w:b w:val="0"/>
               </w:rPr>
-              <w:t>Vibrato interval sample</w:t>
+              <w:t>Vibrato sample</w:t>
+            </w:r>
+          </w:p>
+        </w:tc>
+        <w:tc>
+          <w:tcPr>
+            <w:tcW w:type="dxa" w:w="1037"/>
+            <w:vAlign w:val="center"/>
+          </w:tcPr>
+          <w:p>
+            <w:pPr>
+              <w:spacing w:after="0"/>
+            </w:pPr>
+            <w:r/>
+            <w:r>
+              <w:rPr>
+                <w:b w:val="0"/>
+              </w:rPr>
+              <w:t>9.7990 s</w:t>
             </w:r>
           </w:p>
         </w:tc>
@@ -2391,13 +2822,13 @@
               <w:rPr>
                 <w:b w:val="0"/>
               </w:rPr>
-              <w:t>6.0009 s</w:t>
+              <w:t>2.16720 V</w:t>
             </w:r>
           </w:p>
         </w:tc>
         <w:tc>
           <w:tcPr>
-            <w:tcW w:type="dxa" w:w="1080"/>
+            <w:tcW w:type="dxa" w:w="1152"/>
             <w:vAlign w:val="center"/>
           </w:tcPr>
           <w:p>
@@ -2409,7 +2840,7 @@
               <w:rPr>
                 <w:b w:val="0"/>
               </w:rPr>
-              <w:t>2.4719 V</w:t>
+              <w:t>2.47522 V</w:t>
             </w:r>
           </w:p>
         </w:tc>
@@ -2427,13 +2858,141 @@
               <w:rPr>
                 <w:b w:val="0"/>
               </w:rPr>
-              <w:t>2.3975 to 2.5860 V</w:t>
+              <w:t>2.39901 to 2.58747 V</w:t>
             </w:r>
           </w:p>
         </w:tc>
         <w:tc>
           <w:tcPr>
-            <w:tcW w:type="dxa" w:w="936"/>
+            <w:tcW w:type="dxa" w:w="893"/>
+            <w:vAlign w:val="center"/>
+          </w:tcPr>
+          <w:p>
+            <w:pPr>
+              <w:spacing w:after="0"/>
+            </w:pPr>
+            <w:r/>
+            <w:r>
+              <w:rPr>
+                <w:b w:val="0"/>
+              </w:rPr>
+              <w:t>0.01 V</w:t>
+            </w:r>
+          </w:p>
+        </w:tc>
+        <w:tc>
+          <w:tcPr>
+            <w:tcW w:type="dxa" w:w="893"/>
+            <w:vAlign w:val="center"/>
+          </w:tcPr>
+          <w:p>
+            <w:pPr>
+              <w:spacing w:after="0"/>
+            </w:pPr>
+            <w:r/>
+            <w:r>
+              <w:rPr>
+                <w:b w:val="0"/>
+              </w:rPr>
+              <w:t>inside</w:t>
+            </w:r>
+          </w:p>
+        </w:tc>
+      </w:tr>
+      <w:tr>
+        <w:tc>
+          <w:tcPr>
+            <w:tcW w:type="dxa" w:w="2520"/>
+            <w:vAlign w:val="center"/>
+          </w:tcPr>
+          <w:p>
+            <w:pPr>
+              <w:spacing w:after="0"/>
+            </w:pPr>
+            <w:r/>
+            <w:r>
+              <w:rPr>
+                <w:b w:val="0"/>
+              </w:rPr>
+              <w:t>End of run</w:t>
+            </w:r>
+          </w:p>
+        </w:tc>
+        <w:tc>
+          <w:tcPr>
+            <w:tcW w:type="dxa" w:w="1037"/>
+            <w:vAlign w:val="center"/>
+          </w:tcPr>
+          <w:p>
+            <w:pPr>
+              <w:spacing w:after="0"/>
+            </w:pPr>
+            <w:r/>
+            <w:r>
+              <w:rPr>
+                <w:b w:val="0"/>
+              </w:rPr>
+              <w:t>11.0000 s</w:t>
+            </w:r>
+          </w:p>
+        </w:tc>
+        <w:tc>
+          <w:tcPr>
+            <w:tcW w:type="dxa" w:w="1152"/>
+            <w:vAlign w:val="center"/>
+          </w:tcPr>
+          <w:p>
+            <w:pPr>
+              <w:spacing w:after="0"/>
+            </w:pPr>
+            <w:r/>
+            <w:r>
+              <w:rPr>
+                <w:b w:val="0"/>
+              </w:rPr>
+              <w:t>2.16750 V</w:t>
+            </w:r>
+          </w:p>
+        </w:tc>
+        <w:tc>
+          <w:tcPr>
+            <w:tcW w:type="dxa" w:w="1152"/>
+            <w:vAlign w:val="center"/>
+          </w:tcPr>
+          <w:p>
+            <w:pPr>
+              <w:spacing w:after="0"/>
+            </w:pPr>
+            <w:r/>
+            <w:r>
+              <w:rPr>
+                <w:b w:val="0"/>
+              </w:rPr>
+              <w:t>2.49830 V</w:t>
+            </w:r>
+          </w:p>
+        </w:tc>
+        <w:tc>
+          <w:tcPr>
+            <w:tcW w:type="dxa" w:w="2232"/>
+            <w:vAlign w:val="center"/>
+          </w:tcPr>
+          <w:p>
+            <w:pPr>
+              <w:spacing w:after="0"/>
+            </w:pPr>
+            <w:r/>
+            <w:r>
+              <w:rPr>
+                <w:b w:val="0"/>
+              </w:rPr>
+              <w:t>2.40519 to 2.59365 V</w:t>
+            </w:r>
+          </w:p>
+        </w:tc>
+        <w:tc>
+          <w:tcPr>
+            <w:tcW w:type="dxa" w:w="893"/>
             <w:vAlign w:val="center"/>
           </w:tcPr>
           <w:p>
@@ -2451,7 +3010,7 @@
         </w:tc>
         <w:tc>
           <w:tcPr>
-            <w:tcW w:type="dxa" w:w="1008"/>
+            <w:tcW w:type="dxa" w:w="893"/>
             <w:vAlign w:val="center"/>
           </w:tcPr>
           <w:p>
@@ -2476,8 +3035,370 @@
     </w:p>
     <w:p>
       <w:r>
-        <w:t>The decisive moment is the downward release. Around 4.7376 s, OUT is 2.1896 V and the moving lower threshold is 2.1867 V, so the release is just inside the window. By 4.7500 s, OUT has recovered to 2.3302 V and remains inside the moving window. This is the behavior the fixed narrow window failed to provide.</w:t>
+        <w:t>The +1 semitone hold is outside the window for 400 of 400 samples, with OUT ranging from 2.66588 V to 2.67885 V. The -1 semitone hold is outside for 401 of 401 samples, with OUT ranging from 2.30407 V to 2.31729 V.</w:t>
       </w:r>
+    </w:p>
+    <w:p>
+      <w:r>
+        <w:t>Leak drift during the 800 ms semitone holds is now about -12.0 mV on the upward hold and -13.2 mV on the downward hold, roughly 6 cents at the +/-12 semitone scaling.</w:t>
+      </w:r>
+    </w:p>
+    <w:tbl>
+      <w:tblPr>
+        <w:tblStyle w:val="TableGrid"/>
+        <w:tblW w:type="auto" w:w="0"/>
+        <w:jc w:val="center"/>
+        <w:tblLook w:firstColumn="1" w:firstRow="1" w:lastColumn="0" w:lastRow="0" w:noHBand="0" w:noVBand="1" w:val="04A0"/>
+      </w:tblPr>
+      <w:tblGrid>
+        <w:gridCol w:w="1632"/>
+        <w:gridCol w:w="1632"/>
+        <w:gridCol w:w="1632"/>
+        <w:gridCol w:w="1632"/>
+        <w:gridCol w:w="1632"/>
+        <w:gridCol w:w="1632"/>
+      </w:tblGrid>
+      <w:tr>
+        <w:tc>
+          <w:tcPr>
+            <w:tcW w:type="dxa" w:w="2232"/>
+            <w:vAlign w:val="center"/>
+            <w:shd w:fill="E8EEF5"/>
+          </w:tcPr>
+          <w:p>
+            <w:pPr>
+              <w:spacing w:after="0"/>
+            </w:pPr>
+            <w:r/>
+            <w:r>
+              <w:rPr>
+                <w:b/>
+              </w:rPr>
+              <w:t>Release artifact</w:t>
+            </w:r>
+          </w:p>
+        </w:tc>
+        <w:tc>
+          <w:tcPr>
+            <w:tcW w:type="dxa" w:w="1368"/>
+            <w:vAlign w:val="center"/>
+            <w:shd w:fill="E8EEF5"/>
+          </w:tcPr>
+          <w:p>
+            <w:pPr>
+              <w:spacing w:after="0"/>
+            </w:pPr>
+            <w:r/>
+            <w:r>
+              <w:rPr>
+                <w:b/>
+              </w:rPr>
+              <w:t>Peak error</w:t>
+            </w:r>
+          </w:p>
+        </w:tc>
+        <w:tc>
+          <w:tcPr>
+            <w:tcW w:type="dxa" w:w="1296"/>
+            <w:vAlign w:val="center"/>
+            <w:shd w:fill="E8EEF5"/>
+          </w:tcPr>
+          <w:p>
+            <w:pPr>
+              <w:spacing w:after="0"/>
+            </w:pPr>
+            <w:r/>
+            <w:r>
+              <w:rPr>
+                <w:b/>
+              </w:rPr>
+              <w:t>To +/-10 mV</w:t>
+            </w:r>
+          </w:p>
+        </w:tc>
+        <w:tc>
+          <w:tcPr>
+            <w:tcW w:type="dxa" w:w="1296"/>
+            <w:vAlign w:val="center"/>
+            <w:shd w:fill="E8EEF5"/>
+          </w:tcPr>
+          <w:p>
+            <w:pPr>
+              <w:spacing w:after="0"/>
+            </w:pPr>
+            <w:r/>
+            <w:r>
+              <w:rPr>
+                <w:b/>
+              </w:rPr>
+              <w:t>To +/-5 mV</w:t>
+            </w:r>
+          </w:p>
+        </w:tc>
+        <w:tc>
+          <w:tcPr>
+            <w:tcW w:type="dxa" w:w="1296"/>
+            <w:vAlign w:val="center"/>
+            <w:shd w:fill="E8EEF5"/>
+          </w:tcPr>
+          <w:p>
+            <w:pPr>
+              <w:spacing w:after="0"/>
+            </w:pPr>
+            <w:r/>
+            <w:r>
+              <w:rPr>
+                <w:b/>
+              </w:rPr>
+              <w:t>To +/-2 mV</w:t>
+            </w:r>
+          </w:p>
+        </w:tc>
+        <w:tc>
+          <w:tcPr>
+            <w:tcW w:type="dxa" w:w="1296"/>
+            <w:vAlign w:val="center"/>
+            <w:shd w:fill="E8EEF5"/>
+          </w:tcPr>
+          <w:p>
+            <w:pPr>
+              <w:spacing w:after="0"/>
+            </w:pPr>
+            <w:r/>
+            <w:r>
+              <w:rPr>
+                <w:b/>
+              </w:rPr>
+              <w:t>To +/-1 mV</w:t>
+            </w:r>
+          </w:p>
+        </w:tc>
+      </w:tr>
+      <w:tr>
+        <w:tc>
+          <w:tcPr>
+            <w:tcW w:type="dxa" w:w="2232"/>
+            <w:vAlign w:val="center"/>
+          </w:tcPr>
+          <w:p>
+            <w:pPr>
+              <w:spacing w:after="0"/>
+            </w:pPr>
+            <w:r/>
+            <w:r>
+              <w:rPr>
+                <w:b w:val="0"/>
+              </w:rPr>
+              <w:t>+1 release undershoot</w:t>
+            </w:r>
+          </w:p>
+        </w:tc>
+        <w:tc>
+          <w:tcPr>
+            <w:tcW w:type="dxa" w:w="1368"/>
+            <w:vAlign w:val="center"/>
+          </w:tcPr>
+          <w:p>
+            <w:pPr>
+              <w:spacing w:after="0"/>
+            </w:pPr>
+            <w:r/>
+            <w:r>
+              <w:rPr>
+                <w:b w:val="0"/>
+              </w:rPr>
+              <w:t>-55.4 mV</w:t>
+            </w:r>
+          </w:p>
+        </w:tc>
+        <w:tc>
+          <w:tcPr>
+            <w:tcW w:type="dxa" w:w="1296"/>
+            <w:vAlign w:val="center"/>
+          </w:tcPr>
+          <w:p>
+            <w:pPr>
+              <w:spacing w:after="0"/>
+            </w:pPr>
+            <w:r/>
+            <w:r>
+              <w:rPr>
+                <w:b w:val="0"/>
+              </w:rPr>
+              <w:t>188 ms</w:t>
+            </w:r>
+          </w:p>
+        </w:tc>
+        <w:tc>
+          <w:tcPr>
+            <w:tcW w:type="dxa" w:w="1296"/>
+            <w:vAlign w:val="center"/>
+          </w:tcPr>
+          <w:p>
+            <w:pPr>
+              <w:spacing w:after="0"/>
+            </w:pPr>
+            <w:r/>
+            <w:r>
+              <w:rPr>
+                <w:b w:val="0"/>
+              </w:rPr>
+              <w:t>280 ms</w:t>
+            </w:r>
+          </w:p>
+        </w:tc>
+        <w:tc>
+          <w:tcPr>
+            <w:tcW w:type="dxa" w:w="1296"/>
+            <w:vAlign w:val="center"/>
+          </w:tcPr>
+          <w:p>
+            <w:pPr>
+              <w:spacing w:after="0"/>
+            </w:pPr>
+            <w:r/>
+            <w:r>
+              <w:rPr>
+                <w:b w:val="0"/>
+              </w:rPr>
+              <w:t>502 ms</w:t>
+            </w:r>
+          </w:p>
+        </w:tc>
+        <w:tc>
+          <w:tcPr>
+            <w:tcW w:type="dxa" w:w="1296"/>
+            <w:vAlign w:val="center"/>
+          </w:tcPr>
+          <w:p>
+            <w:pPr>
+              <w:spacing w:after="0"/>
+            </w:pPr>
+            <w:r/>
+            <w:r>
+              <w:rPr>
+                <w:b w:val="0"/>
+              </w:rPr>
+              <w:t>not reached</w:t>
+            </w:r>
+          </w:p>
+        </w:tc>
+      </w:tr>
+      <w:tr>
+        <w:tc>
+          <w:tcPr>
+            <w:tcW w:type="dxa" w:w="2232"/>
+            <w:vAlign w:val="center"/>
+          </w:tcPr>
+          <w:p>
+            <w:pPr>
+              <w:spacing w:after="0"/>
+            </w:pPr>
+            <w:r/>
+            <w:r>
+              <w:rPr>
+                <w:b w:val="0"/>
+              </w:rPr>
+              <w:t>-1 release overshoot</w:t>
+            </w:r>
+          </w:p>
+        </w:tc>
+        <w:tc>
+          <w:tcPr>
+            <w:tcW w:type="dxa" w:w="1368"/>
+            <w:vAlign w:val="center"/>
+          </w:tcPr>
+          <w:p>
+            <w:pPr>
+              <w:spacing w:after="0"/>
+            </w:pPr>
+            <w:r/>
+            <w:r>
+              <w:rPr>
+                <w:b w:val="0"/>
+              </w:rPr>
+              <w:t>+30.1 mV</w:t>
+            </w:r>
+          </w:p>
+        </w:tc>
+        <w:tc>
+          <w:tcPr>
+            <w:tcW w:type="dxa" w:w="1296"/>
+            <w:vAlign w:val="center"/>
+          </w:tcPr>
+          <w:p>
+            <w:pPr>
+              <w:spacing w:after="0"/>
+            </w:pPr>
+            <w:r/>
+            <w:r>
+              <w:rPr>
+                <w:b w:val="0"/>
+              </w:rPr>
+              <w:t>104 ms</w:t>
+            </w:r>
+          </w:p>
+        </w:tc>
+        <w:tc>
+          <w:tcPr>
+            <w:tcW w:type="dxa" w:w="1296"/>
+            <w:vAlign w:val="center"/>
+          </w:tcPr>
+          <w:p>
+            <w:pPr>
+              <w:spacing w:after="0"/>
+            </w:pPr>
+            <w:r/>
+            <w:r>
+              <w:rPr>
+                <w:b w:val="0"/>
+              </w:rPr>
+              <w:t>160 ms</w:t>
+            </w:r>
+          </w:p>
+        </w:tc>
+        <w:tc>
+          <w:tcPr>
+            <w:tcW w:type="dxa" w:w="1296"/>
+            <w:vAlign w:val="center"/>
+          </w:tcPr>
+          <w:p>
+            <w:pPr>
+              <w:spacing w:after="0"/>
+            </w:pPr>
+            <w:r/>
+            <w:r>
+              <w:rPr>
+                <w:b w:val="0"/>
+              </w:rPr>
+              <w:t>220 ms</w:t>
+            </w:r>
+          </w:p>
+        </w:tc>
+        <w:tc>
+          <w:tcPr>
+            <w:tcW w:type="dxa" w:w="1296"/>
+            <w:vAlign w:val="center"/>
+          </w:tcPr>
+          <w:p>
+            <w:pPr>
+              <w:spacing w:after="0"/>
+            </w:pPr>
+            <w:r/>
+            <w:r>
+              <w:rPr>
+                <w:b w:val="0"/>
+              </w:rPr>
+              <w:t>252 ms</w:t>
+            </w:r>
+          </w:p>
+        </w:tc>
+      </w:tr>
+    </w:tbl>
+    <w:p>
+      <w:pPr>
+        <w:spacing w:after="40"/>
+      </w:pPr>
     </w:p>
     <w:p>
       <w:pPr>
@@ -2495,7 +3416,7 @@
               <a:graphicData uri="http://schemas.openxmlformats.org/drawingml/2006/picture">
                 <pic:pic>
                   <pic:nvPicPr>
-                    <pic:cNvPr id="0" name="ewhammy_plot10_overview.png"/>
+                    <pic:cNvPr id="0" name="ewhammy_plot14_overview.png"/>
                     <pic:cNvPicPr/>
                   </pic:nvPicPr>
                   <pic:blipFill>
@@ -2523,7 +3444,7 @@
         <w:jc w:val="center"/>
       </w:pPr>
       <w:r>
-        <w:t>Figure 1. Final simulation overview from plot10.csv. OUT is blue, WH red, WL green, and HOLD yellow. The moving thresholds retain a narrow fixed separation while their center follows slow OUT movement.</w:t>
+        <w:t>Figure 1. Final simulation overview from plot14.csv. OUT is blue, WH red, WL green, and HOLD yellow. The one-semitone holds escape the moving reset window; releases return inside the window.</w:t>
       </w:r>
     </w:p>
     <w:p>
@@ -2531,30 +3452,17 @@
         <w:pStyle w:val="Heading1"/>
       </w:pPr>
       <w:r>
-        <w:t>Startup Reset</w:t>
+        <w:t>Vibrato And Hold Behavior</w:t>
       </w:r>
     </w:p>
     <w:p>
       <w:r>
-        <w:t>The startup reset is intentionally active-low with respect to HOLD. The open-drain inverter and the 2.2uF/1M RC network force HOLD low at startup, not high. That allows the servo to track and settle during power application. In the latest simulation, OUT is already close to center by 1.0 s and remains centered through the 1.5 s to 2.0 s startup interval.</w:t>
+        <w:t>During the 5 Hz vibrato interval, OUT ranges from 2.36286 V to 2.57451 V. Some samples leave the window (142 of 515), but this is acceptable because the reset/integrator dynamics are slow relative to vibrato and do not clamp the expressive motion.</w:t>
       </w:r>
     </w:p>
     <w:p>
       <w:r>
-        <w:t>This also removes the need for the synthesized TOUCH signal. The circuit no longer depends on guessing when the player touches or releases the whammy bar; startup acquisition and motion-qualified HOLD behavior are handled locally by the analog circuitry.</w:t>
-      </w:r>
-    </w:p>
-    <w:p>
-      <w:pPr>
-        <w:pStyle w:val="Heading1"/>
-      </w:pPr>
-      <w:r>
-        <w:t>Vibrato Behavior</w:t>
-      </w:r>
-    </w:p>
-    <w:p>
-      <w:r>
-        <w:t>The vibrato region can produce short HOLD pulses of roughly 54 ms to 64 ms in the simulation. This is acceptable for the reset mechanism because the reset/integrator dynamics are far below the 5 Hz vibrato frequency. In other words, the logic may see brief excursions, but the correction path is too slow to flatten the vibrato appreciably.</w:t>
+        <w:t>The release overshoot is short and sign-symmetric. The upward hold release undershoots by about 55 mV and is within 5 mV after about 280 ms; the downward hold release overshoots by about 30 mV and is within 5 mV after about 160 ms. In normal playing, held notes are likely to include vibrato, so these settling artifacts should be masked further.</w:t>
       </w:r>
     </w:p>
     <w:p>
@@ -2567,7 +3475,7 @@
     </w:p>
     <w:p>
       <w:r>
-        <w:t>The current design is the strongest result so far. It preserves a narrow musical reset window, captures both upward and downward releases despite spring hysteresis, no longer needs TOUCH, and starts cleanly because HOLD is forced low during power-up. The main remaining work is physical validation: capacitor tolerance and DC bias, op amp/comparator offsets, leakage, and the real spring hysteresis distribution should be checked on hardware.</w:t>
+        <w:t>The current design is a workable compromise: the +/-12 semitone range makes intentional one-semitone holds escape the reset mechanism, the moving window captures return-to-center behavior after large bends, the startup reset avoids initial saturation/state errors, and the longer leak time reduces held-note drift without adding release-detect logic.</w:t>
       </w:r>
     </w:p>
     <w:p>
@@ -2583,7 +3491,7 @@
         <w:pStyle w:val="ListBullet"/>
       </w:pPr>
       <w:r>
-        <w:t>Confirm the moving-window low-pass time constant against real playing gestures, not only the synthetic model.</w:t>
+        <w:t>Validate the moving-window low-pass timing with real playing gestures.</w:t>
       </w:r>
     </w:p>
     <w:p>
@@ -2591,7 +3499,7 @@
         <w:pStyle w:val="ListBullet"/>
       </w:pPr>
       <w:r>
-        <w:t>Verify MLCC effective capacitance for the 2.2uF and 10uF capacitors at actual bias and package size.</w:t>
+        <w:t>Confirm MLCC effective capacitance for the 2.2uF and 10uF parts at actual bias.</w:t>
       </w:r>
     </w:p>
     <w:p>
@@ -2599,7 +3507,7 @@
         <w:pStyle w:val="ListBullet"/>
       </w:pPr>
       <w:r>
-        <w:t>Check comparator/open-drain propagation and pull-up values against startup and HOLD timing.</w:t>
+        <w:t>Check comparator/open-drain pull-up values and propagation around HOLD transitions.</w:t>
       </w:r>
     </w:p>
     <w:p>
@@ -2607,7 +3515,7 @@
         <w:pStyle w:val="ListBullet"/>
       </w:pPr>
       <w:r>
-        <w:t>Measure real up-release and down-release distributions after mechanical assembly tolerances are included.</w:t>
+        <w:t>Measure real spring hysteresis distribution across assembled hardware.</w:t>
       </w:r>
     </w:p>
     <w:p>
@@ -2615,7 +3523,7 @@
         <w:pStyle w:val="ListBullet"/>
       </w:pPr>
       <w:r>
-        <w:t>Confirm that the narrow +/-94 mV window is still acceptable across VREF tolerance and gain tolerance.</w:t>
+        <w:t>Listen specifically for held-note drift and release settling with vibrato applied.</w:t>
       </w:r>
     </w:p>
     <w:sectPr>

</xml_diff>